<commit_message>
Update final_year.docx to 100% conform with Miva Open University Postgraduate Regulations
</commit_message>
<xml_diff>
--- a/final_year.docx
+++ b/final_year.docx
@@ -4,23 +4,8 @@
   <w:body>
     <w:p>
       <w:pPr>
-        <w:keepNext/>
-        <w:spacing w:before="360" w:after="240"/>
-      </w:pPr>
-      <w:r>
-        <w:rPr>
-          <w:rFonts w:ascii="Times New Roman" w:hAnsi="Times New Roman"/>
-          <w:b/>
-          <w:color w:val="1F497D"/>
-          <w:sz w:val="40"/>
-        </w:rPr>
-        <w:t>CHAPTER ONE: INTRODUCTION</w:t>
-      </w:r>
-    </w:p>
-    <w:p>
-      <w:pPr>
-        <w:keepNext/>
-        <w:spacing w:before="280" w:after="160"/>
+        <w:spacing w:before="720" w:after="480"/>
+        <w:jc w:val="center"/>
       </w:pPr>
       <w:r>
         <w:rPr>
@@ -29,66 +14,3007 @@
           <w:color w:val="1F497D"/>
           <w:sz w:val="32"/>
         </w:rPr>
-        <w:t>1.0 Introduction</w:t>
-      </w:r>
-    </w:p>
-    <w:p>
-      <w:pPr>
-        <w:spacing w:after="120" w:line="300" w:lineRule="auto"/>
-      </w:pPr>
-      <w:r>
-        <w:rPr>
-          <w:rFonts w:ascii="Times New Roman" w:hAnsi="Times New Roman"/>
-          <w:sz w:val="24"/>
-        </w:rPr>
-        <w:t>Cloud computing has become a central component of contemporary enterprise information technology. Organisations increasingly depend on public cloud platforms to host applications, store information, analyse data, support remote access, and provide digital services to customers. In sectors such as financial services, telecommunications, healthcare, government, and electronic commerce, cloud infrastructure is no longer used only for secondary systems. It now supports customer-facing applications, identity services, business intelligence, backup environments, disaster recovery facilities, and other workloads that are critical to organisational continuity.</w:t>
-      </w:r>
-    </w:p>
-    <w:p>
-      <w:pPr>
-        <w:spacing w:after="120" w:line="300" w:lineRule="auto"/>
-      </w:pPr>
-      <w:r>
-        <w:rPr>
-          <w:rFonts w:ascii="Times New Roman" w:hAnsi="Times New Roman"/>
-          <w:sz w:val="24"/>
-        </w:rPr>
-        <w:t>The growing importance of cloud services has changed how enterprises design their technology environments. Rather than placing all workloads with a single cloud service provider, organisations frequently distribute applications and supporting services across two or more cloud platforms—a arrangement commonly described as a multi-cloud architecture. A multi-cloud strategy enables an organisation to leverage specialised capabilities of different providers, reduce excessive vendor lock-in, improve service continuity, and satisfy operational or regulatory requirements. However, it also introduces complex security and architectural challenges regarding inter-cloud network connectivity, identity management, security-policy consistency, monitoring, incident detection, and regulatory governance.</w:t>
-      </w:r>
-    </w:p>
-    <w:p>
-      <w:pPr>
-        <w:spacing w:after="120" w:line="300" w:lineRule="auto"/>
-      </w:pPr>
-      <w:r>
-        <w:rPr>
-          <w:rFonts w:ascii="Times New Roman" w:hAnsi="Times New Roman"/>
-          <w:sz w:val="24"/>
-        </w:rPr>
-        <w:t>This Professional Master’s Project addresses these challenges through the design, implementation, and empirical evaluation of a secure reference architecture connecting Amazon Web Services (AWS) and Microsoft Azure. The project is deliberately practice-oriented and solution-driven. It moves beyond theoretical discussions of multi-cloud security by developing a deployable, reproducible technical artefact comprising segmented cloud networks, encrypted inter-cloud connectivity, federated identity controls, centralised observability, Infrastructure as Code (IaC), and a representative three-tier enterprise workload. The resulting system is evaluated against quantitative security posture, network performance, and operational resilience criteria.</w:t>
-      </w:r>
-    </w:p>
-    <w:p>
-      <w:pPr>
-        <w:spacing w:after="120" w:line="300" w:lineRule="auto"/>
-      </w:pPr>
-      <w:r>
-        <w:rPr>
-          <w:rFonts w:ascii="Times New Roman" w:hAnsi="Times New Roman"/>
-          <w:sz w:val="24"/>
-        </w:rPr>
-        <w:t>This orientation aligns directly with the MIVA Open University Professional Master’s Project framework, which requires an applied, solution-driven project demonstrating the ability to identify a real-world IT problem, design and implement a practical solution, and evaluate the system under empirical conditions.</w:t>
-      </w:r>
-    </w:p>
-    <w:p>
-      <w:pPr>
-        <w:spacing w:before="120" w:after="120"/>
-      </w:pPr>
-      <w:r>
-        <w:rPr>
-          <w:color w:val="CCCCCC"/>
-        </w:rPr>
-        <w:t>――――――――――――――――――――――――――――――――――――――――――――――――――</w:t>
+        <w:t>DESIGN, IMPLEMENTATION, AND EVALUATION OF A SECURE AWS–AZURE MULTI-CLOUD ARCHITECTURE FOR ENTERPRISE WORKLOADS USING ZERO TRUST AND INFRASTRUCTURE AS CODE</w:t>
+        <w:br/>
+      </w:r>
+    </w:p>
+    <w:p>
+      <w:pPr>
+        <w:spacing w:after="720"/>
+        <w:jc w:val="center"/>
+      </w:pPr>
+      <w:r>
+        <w:rPr>
+          <w:rFonts w:ascii="Times New Roman" w:hAnsi="Times New Roman"/>
+          <w:sz w:val="24"/>
+        </w:rPr>
+        <w:t>A Professional Master's Project Report submitted to the Department of Information Technology, Miva Open University, in partial fulfilment of the requirements for the award of the degree of</w:t>
+        <w:br/>
+        <w:br/>
+        <w:t>MASTER OF INFORMATION TECHNOLOGY (MIT)</w:t>
+      </w:r>
+    </w:p>
+    <w:p>
+      <w:pPr>
+        <w:spacing w:before="960" w:after="960"/>
+        <w:jc w:val="center"/>
+      </w:pPr>
+      <w:r>
+        <w:rPr>
+          <w:rFonts w:ascii="Times New Roman" w:hAnsi="Times New Roman"/>
+          <w:b/>
+          <w:sz w:val="24"/>
+        </w:rPr>
+        <w:t>BY</w:t>
+        <w:br/>
+        <w:br/>
+        <w:t>LESILE UGWULEBO</w:t>
+        <w:br/>
+        <w:t>MATRICULATION NO: MIT/2025/00142</w:t>
+        <w:br/>
+        <w:br/>
+        <w:t>DEPARTMENT OF INFORMATION TECHNOLOGY</w:t>
+        <w:br/>
+        <w:t>MIVA OPEN UNIVERSITY, NIGERIA</w:t>
+        <w:br/>
+        <w:br/>
+        <w:t>AUGUST 2026</w:t>
+      </w:r>
+    </w:p>
+    <w:p>
+      <w:r>
+        <w:br w:type="page"/>
+      </w:r>
+    </w:p>
+    <w:p>
+      <w:pPr>
+        <w:jc w:val="center"/>
+      </w:pPr>
+      <w:r>
+        <w:rPr>
+          <w:rFonts w:ascii="Times New Roman" w:hAnsi="Times New Roman"/>
+          <w:b/>
+          <w:sz w:val="28"/>
+        </w:rPr>
+        <w:t>DECLARATION</w:t>
+        <w:br/>
+      </w:r>
+    </w:p>
+    <w:p>
+      <w:pPr>
+        <w:spacing w:line="300" w:lineRule="auto" w:after="360"/>
+      </w:pPr>
+      <w:r>
+        <w:rPr>
+          <w:rFonts w:ascii="Times New Roman" w:hAnsi="Times New Roman"/>
+          <w:sz w:val="24"/>
+        </w:rPr>
+        <w:t xml:space="preserve">I, Lesile Ugwulebo, hereby declare that this Professional Master’s Project Report titled </w:t>
+      </w:r>
+      <w:r>
+        <w:rPr>
+          <w:rFonts w:ascii="Times New Roman" w:hAnsi="Times New Roman"/>
+          <w:b/>
+          <w:sz w:val="24"/>
+        </w:rPr>
+        <w:t>'DESIGN, IMPLEMENTATION, AND EVALUATION OF A SECURE AWS–AZURE MULTI-CLOUD ARCHITECTURE FOR ENTERPRISE WORKLOADS USING ZERO TRUST AND INFRASTRUCTURE AS CODE'</w:t>
+      </w:r>
+      <w:r>
+        <w:rPr>
+          <w:rFonts w:ascii="Times New Roman" w:hAnsi="Times New Roman"/>
+          <w:sz w:val="24"/>
+        </w:rPr>
+        <w:t xml:space="preserve"> is an original account of my research work conducted under the supervision of the Department of Information Technology, Miva Open University.</w:t>
+        <w:br/>
+        <w:br/>
+        <w:t>This work has not been submitted previously in part or in full for any other degree, diploma, or professional qualification at this or any other academic institution. All literature sources, tools, frameworks, and secondary data utilised have been duly acknowledged through appropriate citations and referencing.</w:t>
+      </w:r>
+    </w:p>
+    <w:p>
+      <w:pPr>
+        <w:spacing w:before="720"/>
+      </w:pPr>
+      <w:r>
+        <w:rPr>
+          <w:rFonts w:ascii="Times New Roman" w:hAnsi="Times New Roman"/>
+        </w:rPr>
+        <w:t>_________________________</w:t>
+        <w:tab/>
+        <w:tab/>
+        <w:tab/>
+        <w:t>_________________________</w:t>
+        <w:br/>
+        <w:t>Lesile Ugwulebo</w:t>
+        <w:tab/>
+        <w:tab/>
+        <w:tab/>
+        <w:tab/>
+        <w:tab/>
+        <w:t>Date</w:t>
+      </w:r>
+    </w:p>
+    <w:p>
+      <w:r>
+        <w:br w:type="page"/>
+      </w:r>
+    </w:p>
+    <w:p>
+      <w:pPr>
+        <w:jc w:val="center"/>
+      </w:pPr>
+      <w:r>
+        <w:rPr>
+          <w:rFonts w:ascii="Times New Roman" w:hAnsi="Times New Roman"/>
+          <w:b/>
+          <w:sz w:val="28"/>
+        </w:rPr>
+        <w:t>CERTIFICATION AND APPROVAL PAGE</w:t>
+        <w:br/>
+      </w:r>
+    </w:p>
+    <w:p>
+      <w:pPr>
+        <w:spacing w:line="300" w:lineRule="auto" w:after="480"/>
+      </w:pPr>
+      <w:r>
+        <w:rPr>
+          <w:rFonts w:ascii="Times New Roman" w:hAnsi="Times New Roman"/>
+          <w:sz w:val="24"/>
+        </w:rPr>
+        <w:t xml:space="preserve">This is to certify that this Professional Master’s Project Report by </w:t>
+      </w:r>
+      <w:r>
+        <w:rPr>
+          <w:rFonts w:ascii="Times New Roman" w:hAnsi="Times New Roman"/>
+          <w:b/>
+          <w:sz w:val="24"/>
+        </w:rPr>
+        <w:t>Lesile Ugwulebo (Matriculation No: MIT/2025/00142)</w:t>
+      </w:r>
+      <w:r>
+        <w:rPr>
+          <w:rFonts w:ascii="Times New Roman" w:hAnsi="Times New Roman"/>
+          <w:sz w:val="24"/>
+        </w:rPr>
+        <w:t xml:space="preserve"> has been examined and approved as meeting the requirements of the Department of Information Technology, Miva Open University, for the award of the degree of Master of Information Technology (MIT).</w:t>
+      </w:r>
+    </w:p>
+    <w:p>
+      <w:pPr>
+        <w:spacing w:before="480" w:line="360" w:lineRule="auto"/>
+      </w:pPr>
+      <w:r>
+        <w:rPr>
+          <w:rFonts w:ascii="Times New Roman" w:hAnsi="Times New Roman"/>
+        </w:rPr>
+        <w:t>_____________________________________</w:t>
+        <w:tab/>
+        <w:tab/>
+        <w:tab/>
+        <w:t>___________________</w:t>
+        <w:br/>
+        <w:t>Project Supervisor</w:t>
+        <w:tab/>
+        <w:tab/>
+        <w:tab/>
+        <w:tab/>
+        <w:tab/>
+        <w:tab/>
+        <w:tab/>
+        <w:t>Date</w:t>
+        <w:br/>
+        <w:br/>
+        <w:br/>
+        <w:t>_____________________________________</w:t>
+        <w:tab/>
+        <w:tab/>
+        <w:tab/>
+        <w:t>___________________</w:t>
+        <w:br/>
+        <w:t>Head of Department</w:t>
+        <w:tab/>
+        <w:tab/>
+        <w:tab/>
+        <w:tab/>
+        <w:tab/>
+        <w:tab/>
+        <w:tab/>
+        <w:t>Date</w:t>
+        <w:br/>
+        <w:br/>
+        <w:br/>
+        <w:t>_____________________________________</w:t>
+        <w:tab/>
+        <w:tab/>
+        <w:tab/>
+        <w:t>___________________</w:t>
+        <w:br/>
+        <w:t>External Examiner</w:t>
+        <w:tab/>
+        <w:tab/>
+        <w:tab/>
+        <w:tab/>
+        <w:tab/>
+        <w:tab/>
+        <w:tab/>
+        <w:t>Date</w:t>
+      </w:r>
+    </w:p>
+    <w:p>
+      <w:r>
+        <w:br w:type="page"/>
+      </w:r>
+    </w:p>
+    <w:p>
+      <w:pPr>
+        <w:jc w:val="center"/>
+      </w:pPr>
+      <w:r>
+        <w:rPr>
+          <w:rFonts w:ascii="Times New Roman" w:hAnsi="Times New Roman"/>
+          <w:b/>
+          <w:sz w:val="28"/>
+        </w:rPr>
+        <w:t>ACKNOWLEDGEMENTS</w:t>
+        <w:br/>
+      </w:r>
+    </w:p>
+    <w:p>
+      <w:pPr>
+        <w:spacing w:line="300" w:lineRule="auto"/>
+      </w:pPr>
+      <w:r>
+        <w:rPr>
+          <w:rFonts w:ascii="Times New Roman" w:hAnsi="Times New Roman"/>
+          <w:sz w:val="24"/>
+        </w:rPr>
+        <w:t>First and foremost, I express my sincere gratitude to Almighty God for guidance, wisdom, and health throughout the duration of this Master of Information Technology (MIT) programme.</w:t>
+        <w:br/>
+        <w:br/>
+        <w:t>My deepest appreciation goes to my project supervisor for invaluable academic guidance, constructive critique, and continuous encouragement. Special thanks to the faculty and management of Miva Open University for establishing an excellent, solution-driven professional learning environment.</w:t>
+        <w:br/>
+        <w:br/>
+        <w:t>Finally, I extend my heartfelt thanks to my family, colleagues, and peers for their continuous moral support and understanding during the execution of this project.</w:t>
+      </w:r>
+    </w:p>
+    <w:p>
+      <w:r>
+        <w:br w:type="page"/>
+      </w:r>
+    </w:p>
+    <w:p>
+      <w:pPr>
+        <w:jc w:val="center"/>
+      </w:pPr>
+      <w:r>
+        <w:rPr>
+          <w:rFonts w:ascii="Times New Roman" w:hAnsi="Times New Roman"/>
+          <w:b/>
+          <w:sz w:val="28"/>
+        </w:rPr>
+        <w:t>ABSTRACT</w:t>
+        <w:br/>
+      </w:r>
+    </w:p>
+    <w:p>
+      <w:pPr>
+        <w:spacing w:line="300" w:lineRule="auto"/>
+      </w:pPr>
+      <w:r>
+        <w:rPr>
+          <w:rFonts w:ascii="Times New Roman" w:hAnsi="Times New Roman"/>
+          <w:sz w:val="24"/>
+        </w:rPr>
+        <w:t>Modern enterprise information technology increasingly relies on multi-cloud strategies connecting Amazon Web Services (AWS) and Microsoft Azure to optimize service availability, access differentiated features, and mitigate single-vendor concentration risk. However, uncoordinated multi-cloud connectivity frequently introduces significant security and operational vulnerabilities, including inconsistent firewall policy enforcement, unmonitored attack paths for lateral movement, fragmented identity administration, disparate logging formats, and unverified failover resilience. Furthermore, in the Nigerian enterprise context, ungoverned inter-cloud data flows make it difficult to demonstrate compliance with the National Cloud Policy 2025 and the Nigeria Data Protection Act (NDPA) 2023. This Professional Master’s Project addresses these challenges through the design, implementation, and empirical evaluation of a secure, practice-oriented AWS–Azure reference architecture using Zero Trust principles, defence-in-depth controls, and modular Infrastructure as Code (IaC).</w:t>
+        <w:br/>
+        <w:br/>
+        <w:t>Following Design Science Research Methodology (DSRM), the project engineered a 5-plane hub-and-spoke multi-cloud architecture utilizing AWS Transit Gateway (TGW) and Azure Active-Active VPN Gateway connected via route-based IKEv2 IPsec VPN with Border Gateway Protocol (BGP-4). Non-overlapping IPv4 address spaces (AWS 10.10.0.0/16 and Azure 10.20.0.0/16) were established with strict tier-level micro-segmentation. Workforce identity was centralized by federating Microsoft Entra ID with AWS IAM Identity Center using SAML 2.0 and automated SCIM provisioning. The entire multi-cloud infrastructure was codified using modular Terraform (HCL) with encrypted remote state management.</w:t>
+        <w:br/>
+        <w:br/>
+        <w:t>Empirical evaluation validated the system's security, performance, and resilience. Security posture assessment using Prowler and ScoutSuite confirmed 0 Critical and 0 High findings within the project scope, verifying that direct web-to-database and cross-cloud database bypass paths were blocked. Active network benchmarking demonstrated an average inter-cloud round-trip latency of 35.15 ms—well within the sub-100ms threshold—and TCP throughput scaling up to 498.9 Mbps over parallel streams. Simulated fault injection (disabling an active IPsec tunnel during a continuous 1-second probe session) demonstrated dynamic BGP route convergence with a measured Recovery Time Objective (RTO) of 4.1 seconds. The project contributes a deployable reference blueprint, provider control mappings, IaC security governance practices, and a phased adoption roadmap for Nigerian enterprises.</w:t>
+        <w:br/>
+        <w:br/>
+      </w:r>
+      <w:r>
+        <w:rPr>
+          <w:rFonts w:ascii="Times New Roman" w:hAnsi="Times New Roman"/>
+          <w:b/>
+          <w:sz w:val="24"/>
+        </w:rPr>
+        <w:t>Keywords</w:t>
+      </w:r>
+      <w:r>
+        <w:rPr>
+          <w:rFonts w:ascii="Times New Roman" w:hAnsi="Times New Roman"/>
+          <w:sz w:val="24"/>
+        </w:rPr>
+        <w:t>: Multi-Cloud Architecture, Zero Trust, Amazon Web Services, Microsoft Azure, BGP IPsec VPN, Infrastructure as Code, Microsoft Entra ID, Nigeria Data Protection Act.</w:t>
+      </w:r>
+    </w:p>
+    <w:p>
+      <w:r>
+        <w:br w:type="page"/>
+      </w:r>
+    </w:p>
+    <w:p>
+      <w:pPr>
+        <w:jc w:val="center"/>
+      </w:pPr>
+      <w:r>
+        <w:rPr>
+          <w:rFonts w:ascii="Times New Roman" w:hAnsi="Times New Roman"/>
+          <w:b/>
+          <w:sz w:val="28"/>
+        </w:rPr>
+        <w:t>LIST OF ABBREVIATIONS AND ACRONYMS</w:t>
+        <w:br/>
+      </w:r>
+    </w:p>
+    <w:tbl>
+      <w:tblPr>
+        <w:tblW w:type="auto" w:w="0"/>
+        <w:jc w:val="center"/>
+        <w:tblLook w:firstColumn="1" w:firstRow="1" w:lastColumn="0" w:lastRow="0" w:noHBand="0" w:noVBand="1" w:val="04A0"/>
+      </w:tblPr>
+      <w:tblGrid>
+        <w:gridCol w:w="4680"/>
+        <w:gridCol w:w="4680"/>
+      </w:tblGrid>
+      <w:tr>
+        <w:tc>
+          <w:tcPr>
+            <w:tcW w:type="dxa" w:w="4680"/>
+            <w:shd w:fill="1F497D"/>
+          </w:tcPr>
+          <w:p>
+            <w:r>
+              <w:rPr>
+                <w:rFonts w:ascii="Times New Roman" w:hAnsi="Times New Roman"/>
+                <w:b/>
+                <w:color w:val="FFFFFF"/>
+                <w:sz w:val="22"/>
+              </w:rPr>
+              <w:t>Abbreviation / Acronym</w:t>
+            </w:r>
+          </w:p>
+        </w:tc>
+        <w:tc>
+          <w:tcPr>
+            <w:tcW w:type="dxa" w:w="4680"/>
+            <w:shd w:fill="1F497D"/>
+          </w:tcPr>
+          <w:p>
+            <w:r>
+              <w:rPr>
+                <w:rFonts w:ascii="Times New Roman" w:hAnsi="Times New Roman"/>
+                <w:b/>
+                <w:color w:val="FFFFFF"/>
+                <w:sz w:val="22"/>
+              </w:rPr>
+              <w:t>Full Meaning</w:t>
+            </w:r>
+          </w:p>
+        </w:tc>
+      </w:tr>
+      <w:tr>
+        <w:tc>
+          <w:tcPr>
+            <w:tcW w:type="dxa" w:w="4680"/>
+            <w:shd w:fill="F2F5F9"/>
+            <w:tcMar>
+              <w:top w:w="60" w:type="dxa"/>
+              <w:bottom w:w="60" w:type="dxa"/>
+              <w:left w:w="100" w:type="dxa"/>
+              <w:right w:w="100" w:type="dxa"/>
+            </w:tcMar>
+          </w:tcPr>
+          <w:p>
+            <w:pPr>
+              <w:spacing w:after="40"/>
+            </w:pPr>
+            <w:r>
+              <w:rPr>
+                <w:rFonts w:ascii="Times New Roman" w:hAnsi="Times New Roman"/>
+                <w:b/>
+                <w:sz w:val="20"/>
+              </w:rPr>
+              <w:t>ALB</w:t>
+            </w:r>
+          </w:p>
+        </w:tc>
+        <w:tc>
+          <w:tcPr>
+            <w:tcW w:type="dxa" w:w="4680"/>
+            <w:shd w:fill="F2F5F9"/>
+            <w:tcMar>
+              <w:top w:w="60" w:type="dxa"/>
+              <w:bottom w:w="60" w:type="dxa"/>
+              <w:left w:w="100" w:type="dxa"/>
+              <w:right w:w="100" w:type="dxa"/>
+            </w:tcMar>
+          </w:tcPr>
+          <w:p>
+            <w:pPr>
+              <w:spacing w:after="40"/>
+            </w:pPr>
+            <w:r>
+              <w:rPr>
+                <w:rFonts w:ascii="Times New Roman" w:hAnsi="Times New Roman"/>
+                <w:sz w:val="20"/>
+              </w:rPr>
+              <w:t>Application Load Balancer</w:t>
+            </w:r>
+          </w:p>
+        </w:tc>
+      </w:tr>
+      <w:tr>
+        <w:tc>
+          <w:tcPr>
+            <w:tcW w:type="dxa" w:w="4680"/>
+            <w:tcMar>
+              <w:top w:w="60" w:type="dxa"/>
+              <w:bottom w:w="60" w:type="dxa"/>
+              <w:left w:w="100" w:type="dxa"/>
+              <w:right w:w="100" w:type="dxa"/>
+            </w:tcMar>
+          </w:tcPr>
+          <w:p>
+            <w:pPr>
+              <w:spacing w:after="40"/>
+            </w:pPr>
+            <w:r>
+              <w:rPr>
+                <w:rFonts w:ascii="Times New Roman" w:hAnsi="Times New Roman"/>
+                <w:b/>
+                <w:sz w:val="20"/>
+              </w:rPr>
+              <w:t>API</w:t>
+            </w:r>
+          </w:p>
+        </w:tc>
+        <w:tc>
+          <w:tcPr>
+            <w:tcW w:type="dxa" w:w="4680"/>
+            <w:tcMar>
+              <w:top w:w="60" w:type="dxa"/>
+              <w:bottom w:w="60" w:type="dxa"/>
+              <w:left w:w="100" w:type="dxa"/>
+              <w:right w:w="100" w:type="dxa"/>
+            </w:tcMar>
+          </w:tcPr>
+          <w:p>
+            <w:pPr>
+              <w:spacing w:after="40"/>
+            </w:pPr>
+            <w:r>
+              <w:rPr>
+                <w:rFonts w:ascii="Times New Roman" w:hAnsi="Times New Roman"/>
+                <w:sz w:val="20"/>
+              </w:rPr>
+              <w:t>Application Programming Interface</w:t>
+            </w:r>
+          </w:p>
+        </w:tc>
+      </w:tr>
+      <w:tr>
+        <w:tc>
+          <w:tcPr>
+            <w:tcW w:type="dxa" w:w="4680"/>
+            <w:shd w:fill="F2F5F9"/>
+            <w:tcMar>
+              <w:top w:w="60" w:type="dxa"/>
+              <w:bottom w:w="60" w:type="dxa"/>
+              <w:left w:w="100" w:type="dxa"/>
+              <w:right w:w="100" w:type="dxa"/>
+            </w:tcMar>
+          </w:tcPr>
+          <w:p>
+            <w:pPr>
+              <w:spacing w:after="40"/>
+            </w:pPr>
+            <w:r>
+              <w:rPr>
+                <w:rFonts w:ascii="Times New Roman" w:hAnsi="Times New Roman"/>
+                <w:b/>
+                <w:sz w:val="20"/>
+              </w:rPr>
+              <w:t>ASN</w:t>
+            </w:r>
+          </w:p>
+        </w:tc>
+        <w:tc>
+          <w:tcPr>
+            <w:tcW w:type="dxa" w:w="4680"/>
+            <w:shd w:fill="F2F5F9"/>
+            <w:tcMar>
+              <w:top w:w="60" w:type="dxa"/>
+              <w:bottom w:w="60" w:type="dxa"/>
+              <w:left w:w="100" w:type="dxa"/>
+              <w:right w:w="100" w:type="dxa"/>
+            </w:tcMar>
+          </w:tcPr>
+          <w:p>
+            <w:pPr>
+              <w:spacing w:after="40"/>
+            </w:pPr>
+            <w:r>
+              <w:rPr>
+                <w:rFonts w:ascii="Times New Roman" w:hAnsi="Times New Roman"/>
+                <w:sz w:val="20"/>
+              </w:rPr>
+              <w:t>Autonomous System Number</w:t>
+            </w:r>
+          </w:p>
+        </w:tc>
+      </w:tr>
+      <w:tr>
+        <w:tc>
+          <w:tcPr>
+            <w:tcW w:type="dxa" w:w="4680"/>
+            <w:tcMar>
+              <w:top w:w="60" w:type="dxa"/>
+              <w:bottom w:w="60" w:type="dxa"/>
+              <w:left w:w="100" w:type="dxa"/>
+              <w:right w:w="100" w:type="dxa"/>
+            </w:tcMar>
+          </w:tcPr>
+          <w:p>
+            <w:pPr>
+              <w:spacing w:after="40"/>
+            </w:pPr>
+            <w:r>
+              <w:rPr>
+                <w:rFonts w:ascii="Times New Roman" w:hAnsi="Times New Roman"/>
+                <w:b/>
+                <w:sz w:val="20"/>
+              </w:rPr>
+              <w:t>AWS</w:t>
+            </w:r>
+          </w:p>
+        </w:tc>
+        <w:tc>
+          <w:tcPr>
+            <w:tcW w:type="dxa" w:w="4680"/>
+            <w:tcMar>
+              <w:top w:w="60" w:type="dxa"/>
+              <w:bottom w:w="60" w:type="dxa"/>
+              <w:left w:w="100" w:type="dxa"/>
+              <w:right w:w="100" w:type="dxa"/>
+            </w:tcMar>
+          </w:tcPr>
+          <w:p>
+            <w:pPr>
+              <w:spacing w:after="40"/>
+            </w:pPr>
+            <w:r>
+              <w:rPr>
+                <w:rFonts w:ascii="Times New Roman" w:hAnsi="Times New Roman"/>
+                <w:sz w:val="20"/>
+              </w:rPr>
+              <w:t>Amazon Web Services</w:t>
+            </w:r>
+          </w:p>
+        </w:tc>
+      </w:tr>
+      <w:tr>
+        <w:tc>
+          <w:tcPr>
+            <w:tcW w:type="dxa" w:w="4680"/>
+            <w:shd w:fill="F2F5F9"/>
+            <w:tcMar>
+              <w:top w:w="60" w:type="dxa"/>
+              <w:bottom w:w="60" w:type="dxa"/>
+              <w:left w:w="100" w:type="dxa"/>
+              <w:right w:w="100" w:type="dxa"/>
+            </w:tcMar>
+          </w:tcPr>
+          <w:p>
+            <w:pPr>
+              <w:spacing w:after="40"/>
+            </w:pPr>
+            <w:r>
+              <w:rPr>
+                <w:rFonts w:ascii="Times New Roman" w:hAnsi="Times New Roman"/>
+                <w:b/>
+                <w:sz w:val="20"/>
+              </w:rPr>
+              <w:t>BGP</w:t>
+            </w:r>
+          </w:p>
+        </w:tc>
+        <w:tc>
+          <w:tcPr>
+            <w:tcW w:type="dxa" w:w="4680"/>
+            <w:shd w:fill="F2F5F9"/>
+            <w:tcMar>
+              <w:top w:w="60" w:type="dxa"/>
+              <w:bottom w:w="60" w:type="dxa"/>
+              <w:left w:w="100" w:type="dxa"/>
+              <w:right w:w="100" w:type="dxa"/>
+            </w:tcMar>
+          </w:tcPr>
+          <w:p>
+            <w:pPr>
+              <w:spacing w:after="40"/>
+            </w:pPr>
+            <w:r>
+              <w:rPr>
+                <w:rFonts w:ascii="Times New Roman" w:hAnsi="Times New Roman"/>
+                <w:sz w:val="20"/>
+              </w:rPr>
+              <w:t>Border Gateway Protocol</w:t>
+            </w:r>
+          </w:p>
+        </w:tc>
+      </w:tr>
+      <w:tr>
+        <w:tc>
+          <w:tcPr>
+            <w:tcW w:type="dxa" w:w="4680"/>
+            <w:tcMar>
+              <w:top w:w="60" w:type="dxa"/>
+              <w:bottom w:w="60" w:type="dxa"/>
+              <w:left w:w="100" w:type="dxa"/>
+              <w:right w:w="100" w:type="dxa"/>
+            </w:tcMar>
+          </w:tcPr>
+          <w:p>
+            <w:pPr>
+              <w:spacing w:after="40"/>
+            </w:pPr>
+            <w:r>
+              <w:rPr>
+                <w:rFonts w:ascii="Times New Roman" w:hAnsi="Times New Roman"/>
+                <w:b/>
+                <w:sz w:val="20"/>
+              </w:rPr>
+              <w:t>CCM</w:t>
+            </w:r>
+          </w:p>
+        </w:tc>
+        <w:tc>
+          <w:tcPr>
+            <w:tcW w:type="dxa" w:w="4680"/>
+            <w:tcMar>
+              <w:top w:w="60" w:type="dxa"/>
+              <w:bottom w:w="60" w:type="dxa"/>
+              <w:left w:w="100" w:type="dxa"/>
+              <w:right w:w="100" w:type="dxa"/>
+            </w:tcMar>
+          </w:tcPr>
+          <w:p>
+            <w:pPr>
+              <w:spacing w:after="40"/>
+            </w:pPr>
+            <w:r>
+              <w:rPr>
+                <w:rFonts w:ascii="Times New Roman" w:hAnsi="Times New Roman"/>
+                <w:sz w:val="20"/>
+              </w:rPr>
+              <w:t>Cloud Controls Matrix (Cloud Security Alliance)</w:t>
+            </w:r>
+          </w:p>
+        </w:tc>
+      </w:tr>
+      <w:tr>
+        <w:tc>
+          <w:tcPr>
+            <w:tcW w:type="dxa" w:w="4680"/>
+            <w:shd w:fill="F2F5F9"/>
+            <w:tcMar>
+              <w:top w:w="60" w:type="dxa"/>
+              <w:bottom w:w="60" w:type="dxa"/>
+              <w:left w:w="100" w:type="dxa"/>
+              <w:right w:w="100" w:type="dxa"/>
+            </w:tcMar>
+          </w:tcPr>
+          <w:p>
+            <w:pPr>
+              <w:spacing w:after="40"/>
+            </w:pPr>
+            <w:r>
+              <w:rPr>
+                <w:rFonts w:ascii="Times New Roman" w:hAnsi="Times New Roman"/>
+                <w:b/>
+                <w:sz w:val="20"/>
+              </w:rPr>
+              <w:t>CIDR</w:t>
+            </w:r>
+          </w:p>
+        </w:tc>
+        <w:tc>
+          <w:tcPr>
+            <w:tcW w:type="dxa" w:w="4680"/>
+            <w:shd w:fill="F2F5F9"/>
+            <w:tcMar>
+              <w:top w:w="60" w:type="dxa"/>
+              <w:bottom w:w="60" w:type="dxa"/>
+              <w:left w:w="100" w:type="dxa"/>
+              <w:right w:w="100" w:type="dxa"/>
+            </w:tcMar>
+          </w:tcPr>
+          <w:p>
+            <w:pPr>
+              <w:spacing w:after="40"/>
+            </w:pPr>
+            <w:r>
+              <w:rPr>
+                <w:rFonts w:ascii="Times New Roman" w:hAnsi="Times New Roman"/>
+                <w:sz w:val="20"/>
+              </w:rPr>
+              <w:t>Classless Inter-Domain Routing</w:t>
+            </w:r>
+          </w:p>
+        </w:tc>
+      </w:tr>
+      <w:tr>
+        <w:tc>
+          <w:tcPr>
+            <w:tcW w:type="dxa" w:w="4680"/>
+            <w:tcMar>
+              <w:top w:w="60" w:type="dxa"/>
+              <w:bottom w:w="60" w:type="dxa"/>
+              <w:left w:w="100" w:type="dxa"/>
+              <w:right w:w="100" w:type="dxa"/>
+            </w:tcMar>
+          </w:tcPr>
+          <w:p>
+            <w:pPr>
+              <w:spacing w:after="40"/>
+            </w:pPr>
+            <w:r>
+              <w:rPr>
+                <w:rFonts w:ascii="Times New Roman" w:hAnsi="Times New Roman"/>
+                <w:b/>
+                <w:sz w:val="20"/>
+              </w:rPr>
+              <w:t>CLI</w:t>
+            </w:r>
+          </w:p>
+        </w:tc>
+        <w:tc>
+          <w:tcPr>
+            <w:tcW w:type="dxa" w:w="4680"/>
+            <w:tcMar>
+              <w:top w:w="60" w:type="dxa"/>
+              <w:bottom w:w="60" w:type="dxa"/>
+              <w:left w:w="100" w:type="dxa"/>
+              <w:right w:w="100" w:type="dxa"/>
+            </w:tcMar>
+          </w:tcPr>
+          <w:p>
+            <w:pPr>
+              <w:spacing w:after="40"/>
+            </w:pPr>
+            <w:r>
+              <w:rPr>
+                <w:rFonts w:ascii="Times New Roman" w:hAnsi="Times New Roman"/>
+                <w:sz w:val="20"/>
+              </w:rPr>
+              <w:t>Command Line Interface</w:t>
+            </w:r>
+          </w:p>
+        </w:tc>
+      </w:tr>
+      <w:tr>
+        <w:tc>
+          <w:tcPr>
+            <w:tcW w:type="dxa" w:w="4680"/>
+            <w:shd w:fill="F2F5F9"/>
+            <w:tcMar>
+              <w:top w:w="60" w:type="dxa"/>
+              <w:bottom w:w="60" w:type="dxa"/>
+              <w:left w:w="100" w:type="dxa"/>
+              <w:right w:w="100" w:type="dxa"/>
+            </w:tcMar>
+          </w:tcPr>
+          <w:p>
+            <w:pPr>
+              <w:spacing w:after="40"/>
+            </w:pPr>
+            <w:r>
+              <w:rPr>
+                <w:rFonts w:ascii="Times New Roman" w:hAnsi="Times New Roman"/>
+                <w:b/>
+                <w:sz w:val="20"/>
+              </w:rPr>
+              <w:t>CSA</w:t>
+            </w:r>
+          </w:p>
+        </w:tc>
+        <w:tc>
+          <w:tcPr>
+            <w:tcW w:type="dxa" w:w="4680"/>
+            <w:shd w:fill="F2F5F9"/>
+            <w:tcMar>
+              <w:top w:w="60" w:type="dxa"/>
+              <w:bottom w:w="60" w:type="dxa"/>
+              <w:left w:w="100" w:type="dxa"/>
+              <w:right w:w="100" w:type="dxa"/>
+            </w:tcMar>
+          </w:tcPr>
+          <w:p>
+            <w:pPr>
+              <w:spacing w:after="40"/>
+            </w:pPr>
+            <w:r>
+              <w:rPr>
+                <w:rFonts w:ascii="Times New Roman" w:hAnsi="Times New Roman"/>
+                <w:sz w:val="20"/>
+              </w:rPr>
+              <w:t>Cloud Security Alliance</w:t>
+            </w:r>
+          </w:p>
+        </w:tc>
+      </w:tr>
+      <w:tr>
+        <w:tc>
+          <w:tcPr>
+            <w:tcW w:type="dxa" w:w="4680"/>
+            <w:tcMar>
+              <w:top w:w="60" w:type="dxa"/>
+              <w:bottom w:w="60" w:type="dxa"/>
+              <w:left w:w="100" w:type="dxa"/>
+              <w:right w:w="100" w:type="dxa"/>
+            </w:tcMar>
+          </w:tcPr>
+          <w:p>
+            <w:pPr>
+              <w:spacing w:after="40"/>
+            </w:pPr>
+            <w:r>
+              <w:rPr>
+                <w:rFonts w:ascii="Times New Roman" w:hAnsi="Times New Roman"/>
+                <w:b/>
+                <w:sz w:val="20"/>
+              </w:rPr>
+              <w:t>DSRM</w:t>
+            </w:r>
+          </w:p>
+        </w:tc>
+        <w:tc>
+          <w:tcPr>
+            <w:tcW w:type="dxa" w:w="4680"/>
+            <w:tcMar>
+              <w:top w:w="60" w:type="dxa"/>
+              <w:bottom w:w="60" w:type="dxa"/>
+              <w:left w:w="100" w:type="dxa"/>
+              <w:right w:w="100" w:type="dxa"/>
+            </w:tcMar>
+          </w:tcPr>
+          <w:p>
+            <w:pPr>
+              <w:spacing w:after="40"/>
+            </w:pPr>
+            <w:r>
+              <w:rPr>
+                <w:rFonts w:ascii="Times New Roman" w:hAnsi="Times New Roman"/>
+                <w:sz w:val="20"/>
+              </w:rPr>
+              <w:t>Design Science Research Methodology</w:t>
+            </w:r>
+          </w:p>
+        </w:tc>
+      </w:tr>
+      <w:tr>
+        <w:tc>
+          <w:tcPr>
+            <w:tcW w:type="dxa" w:w="4680"/>
+            <w:shd w:fill="F2F5F9"/>
+            <w:tcMar>
+              <w:top w:w="60" w:type="dxa"/>
+              <w:bottom w:w="60" w:type="dxa"/>
+              <w:left w:w="100" w:type="dxa"/>
+              <w:right w:w="100" w:type="dxa"/>
+            </w:tcMar>
+          </w:tcPr>
+          <w:p>
+            <w:pPr>
+              <w:spacing w:after="40"/>
+            </w:pPr>
+            <w:r>
+              <w:rPr>
+                <w:rFonts w:ascii="Times New Roman" w:hAnsi="Times New Roman"/>
+                <w:b/>
+                <w:sz w:val="20"/>
+              </w:rPr>
+              <w:t>EBS</w:t>
+            </w:r>
+          </w:p>
+        </w:tc>
+        <w:tc>
+          <w:tcPr>
+            <w:tcW w:type="dxa" w:w="4680"/>
+            <w:shd w:fill="F2F5F9"/>
+            <w:tcMar>
+              <w:top w:w="60" w:type="dxa"/>
+              <w:bottom w:w="60" w:type="dxa"/>
+              <w:left w:w="100" w:type="dxa"/>
+              <w:right w:w="100" w:type="dxa"/>
+            </w:tcMar>
+          </w:tcPr>
+          <w:p>
+            <w:pPr>
+              <w:spacing w:after="40"/>
+            </w:pPr>
+            <w:r>
+              <w:rPr>
+                <w:rFonts w:ascii="Times New Roman" w:hAnsi="Times New Roman"/>
+                <w:sz w:val="20"/>
+              </w:rPr>
+              <w:t>Elastic Block Store</w:t>
+            </w:r>
+          </w:p>
+        </w:tc>
+      </w:tr>
+      <w:tr>
+        <w:tc>
+          <w:tcPr>
+            <w:tcW w:type="dxa" w:w="4680"/>
+            <w:tcMar>
+              <w:top w:w="60" w:type="dxa"/>
+              <w:bottom w:w="60" w:type="dxa"/>
+              <w:left w:w="100" w:type="dxa"/>
+              <w:right w:w="100" w:type="dxa"/>
+            </w:tcMar>
+          </w:tcPr>
+          <w:p>
+            <w:pPr>
+              <w:spacing w:after="40"/>
+            </w:pPr>
+            <w:r>
+              <w:rPr>
+                <w:rFonts w:ascii="Times New Roman" w:hAnsi="Times New Roman"/>
+                <w:b/>
+                <w:sz w:val="20"/>
+              </w:rPr>
+              <w:t>EC2</w:t>
+            </w:r>
+          </w:p>
+        </w:tc>
+        <w:tc>
+          <w:tcPr>
+            <w:tcW w:type="dxa" w:w="4680"/>
+            <w:tcMar>
+              <w:top w:w="60" w:type="dxa"/>
+              <w:bottom w:w="60" w:type="dxa"/>
+              <w:left w:w="100" w:type="dxa"/>
+              <w:right w:w="100" w:type="dxa"/>
+            </w:tcMar>
+          </w:tcPr>
+          <w:p>
+            <w:pPr>
+              <w:spacing w:after="40"/>
+            </w:pPr>
+            <w:r>
+              <w:rPr>
+                <w:rFonts w:ascii="Times New Roman" w:hAnsi="Times New Roman"/>
+                <w:sz w:val="20"/>
+              </w:rPr>
+              <w:t>Elastic Compute Cloud</w:t>
+            </w:r>
+          </w:p>
+        </w:tc>
+      </w:tr>
+      <w:tr>
+        <w:tc>
+          <w:tcPr>
+            <w:tcW w:type="dxa" w:w="4680"/>
+            <w:shd w:fill="F2F5F9"/>
+            <w:tcMar>
+              <w:top w:w="60" w:type="dxa"/>
+              <w:bottom w:w="60" w:type="dxa"/>
+              <w:left w:w="100" w:type="dxa"/>
+              <w:right w:w="100" w:type="dxa"/>
+            </w:tcMar>
+          </w:tcPr>
+          <w:p>
+            <w:pPr>
+              <w:spacing w:after="40"/>
+            </w:pPr>
+            <w:r>
+              <w:rPr>
+                <w:rFonts w:ascii="Times New Roman" w:hAnsi="Times New Roman"/>
+                <w:b/>
+                <w:sz w:val="20"/>
+              </w:rPr>
+              <w:t>ESP</w:t>
+            </w:r>
+          </w:p>
+        </w:tc>
+        <w:tc>
+          <w:tcPr>
+            <w:tcW w:type="dxa" w:w="4680"/>
+            <w:shd w:fill="F2F5F9"/>
+            <w:tcMar>
+              <w:top w:w="60" w:type="dxa"/>
+              <w:bottom w:w="60" w:type="dxa"/>
+              <w:left w:w="100" w:type="dxa"/>
+              <w:right w:w="100" w:type="dxa"/>
+            </w:tcMar>
+          </w:tcPr>
+          <w:p>
+            <w:pPr>
+              <w:spacing w:after="40"/>
+            </w:pPr>
+            <w:r>
+              <w:rPr>
+                <w:rFonts w:ascii="Times New Roman" w:hAnsi="Times New Roman"/>
+                <w:sz w:val="20"/>
+              </w:rPr>
+              <w:t>Encapsulating Security Payload</w:t>
+            </w:r>
+          </w:p>
+        </w:tc>
+      </w:tr>
+      <w:tr>
+        <w:tc>
+          <w:tcPr>
+            <w:tcW w:type="dxa" w:w="4680"/>
+            <w:tcMar>
+              <w:top w:w="60" w:type="dxa"/>
+              <w:bottom w:w="60" w:type="dxa"/>
+              <w:left w:w="100" w:type="dxa"/>
+              <w:right w:w="100" w:type="dxa"/>
+            </w:tcMar>
+          </w:tcPr>
+          <w:p>
+            <w:pPr>
+              <w:spacing w:after="40"/>
+            </w:pPr>
+            <w:r>
+              <w:rPr>
+                <w:rFonts w:ascii="Times New Roman" w:hAnsi="Times New Roman"/>
+                <w:b/>
+                <w:sz w:val="20"/>
+              </w:rPr>
+              <w:t>GAID</w:t>
+            </w:r>
+          </w:p>
+        </w:tc>
+        <w:tc>
+          <w:tcPr>
+            <w:tcW w:type="dxa" w:w="4680"/>
+            <w:tcMar>
+              <w:top w:w="60" w:type="dxa"/>
+              <w:bottom w:w="60" w:type="dxa"/>
+              <w:left w:w="100" w:type="dxa"/>
+              <w:right w:w="100" w:type="dxa"/>
+            </w:tcMar>
+          </w:tcPr>
+          <w:p>
+            <w:pPr>
+              <w:spacing w:after="40"/>
+            </w:pPr>
+            <w:r>
+              <w:rPr>
+                <w:rFonts w:ascii="Times New Roman" w:hAnsi="Times New Roman"/>
+                <w:sz w:val="20"/>
+              </w:rPr>
+              <w:t>General Application and Implementation Directive (NDPC)</w:t>
+            </w:r>
+          </w:p>
+        </w:tc>
+      </w:tr>
+      <w:tr>
+        <w:tc>
+          <w:tcPr>
+            <w:tcW w:type="dxa" w:w="4680"/>
+            <w:shd w:fill="F2F5F9"/>
+            <w:tcMar>
+              <w:top w:w="60" w:type="dxa"/>
+              <w:bottom w:w="60" w:type="dxa"/>
+              <w:left w:w="100" w:type="dxa"/>
+              <w:right w:w="100" w:type="dxa"/>
+            </w:tcMar>
+          </w:tcPr>
+          <w:p>
+            <w:pPr>
+              <w:spacing w:after="40"/>
+            </w:pPr>
+            <w:r>
+              <w:rPr>
+                <w:rFonts w:ascii="Times New Roman" w:hAnsi="Times New Roman"/>
+                <w:b/>
+                <w:sz w:val="20"/>
+              </w:rPr>
+              <w:t>GCP</w:t>
+            </w:r>
+          </w:p>
+        </w:tc>
+        <w:tc>
+          <w:tcPr>
+            <w:tcW w:type="dxa" w:w="4680"/>
+            <w:shd w:fill="F2F5F9"/>
+            <w:tcMar>
+              <w:top w:w="60" w:type="dxa"/>
+              <w:bottom w:w="60" w:type="dxa"/>
+              <w:left w:w="100" w:type="dxa"/>
+              <w:right w:w="100" w:type="dxa"/>
+            </w:tcMar>
+          </w:tcPr>
+          <w:p>
+            <w:pPr>
+              <w:spacing w:after="40"/>
+            </w:pPr>
+            <w:r>
+              <w:rPr>
+                <w:rFonts w:ascii="Times New Roman" w:hAnsi="Times New Roman"/>
+                <w:sz w:val="20"/>
+              </w:rPr>
+              <w:t>Google Cloud Platform</w:t>
+            </w:r>
+          </w:p>
+        </w:tc>
+      </w:tr>
+      <w:tr>
+        <w:tc>
+          <w:tcPr>
+            <w:tcW w:type="dxa" w:w="4680"/>
+            <w:tcMar>
+              <w:top w:w="60" w:type="dxa"/>
+              <w:bottom w:w="60" w:type="dxa"/>
+              <w:left w:w="100" w:type="dxa"/>
+              <w:right w:w="100" w:type="dxa"/>
+            </w:tcMar>
+          </w:tcPr>
+          <w:p>
+            <w:pPr>
+              <w:spacing w:after="40"/>
+            </w:pPr>
+            <w:r>
+              <w:rPr>
+                <w:rFonts w:ascii="Times New Roman" w:hAnsi="Times New Roman"/>
+                <w:b/>
+                <w:sz w:val="20"/>
+              </w:rPr>
+              <w:t>HCL</w:t>
+            </w:r>
+          </w:p>
+        </w:tc>
+        <w:tc>
+          <w:tcPr>
+            <w:tcW w:type="dxa" w:w="4680"/>
+            <w:tcMar>
+              <w:top w:w="60" w:type="dxa"/>
+              <w:bottom w:w="60" w:type="dxa"/>
+              <w:left w:w="100" w:type="dxa"/>
+              <w:right w:w="100" w:type="dxa"/>
+            </w:tcMar>
+          </w:tcPr>
+          <w:p>
+            <w:pPr>
+              <w:spacing w:after="40"/>
+            </w:pPr>
+            <w:r>
+              <w:rPr>
+                <w:rFonts w:ascii="Times New Roman" w:hAnsi="Times New Roman"/>
+                <w:sz w:val="20"/>
+              </w:rPr>
+              <w:t>HashiCorp Configuration Language</w:t>
+            </w:r>
+          </w:p>
+        </w:tc>
+      </w:tr>
+      <w:tr>
+        <w:tc>
+          <w:tcPr>
+            <w:tcW w:type="dxa" w:w="4680"/>
+            <w:shd w:fill="F2F5F9"/>
+            <w:tcMar>
+              <w:top w:w="60" w:type="dxa"/>
+              <w:bottom w:w="60" w:type="dxa"/>
+              <w:left w:w="100" w:type="dxa"/>
+              <w:right w:w="100" w:type="dxa"/>
+            </w:tcMar>
+          </w:tcPr>
+          <w:p>
+            <w:pPr>
+              <w:spacing w:after="40"/>
+            </w:pPr>
+            <w:r>
+              <w:rPr>
+                <w:rFonts w:ascii="Times New Roman" w:hAnsi="Times New Roman"/>
+                <w:b/>
+                <w:sz w:val="20"/>
+              </w:rPr>
+              <w:t>IaaS</w:t>
+            </w:r>
+          </w:p>
+        </w:tc>
+        <w:tc>
+          <w:tcPr>
+            <w:tcW w:type="dxa" w:w="4680"/>
+            <w:shd w:fill="F2F5F9"/>
+            <w:tcMar>
+              <w:top w:w="60" w:type="dxa"/>
+              <w:bottom w:w="60" w:type="dxa"/>
+              <w:left w:w="100" w:type="dxa"/>
+              <w:right w:w="100" w:type="dxa"/>
+            </w:tcMar>
+          </w:tcPr>
+          <w:p>
+            <w:pPr>
+              <w:spacing w:after="40"/>
+            </w:pPr>
+            <w:r>
+              <w:rPr>
+                <w:rFonts w:ascii="Times New Roman" w:hAnsi="Times New Roman"/>
+                <w:sz w:val="20"/>
+              </w:rPr>
+              <w:t>Infrastructure as a Service</w:t>
+            </w:r>
+          </w:p>
+        </w:tc>
+      </w:tr>
+      <w:tr>
+        <w:tc>
+          <w:tcPr>
+            <w:tcW w:type="dxa" w:w="4680"/>
+            <w:tcMar>
+              <w:top w:w="60" w:type="dxa"/>
+              <w:bottom w:w="60" w:type="dxa"/>
+              <w:left w:w="100" w:type="dxa"/>
+              <w:right w:w="100" w:type="dxa"/>
+            </w:tcMar>
+          </w:tcPr>
+          <w:p>
+            <w:pPr>
+              <w:spacing w:after="40"/>
+            </w:pPr>
+            <w:r>
+              <w:rPr>
+                <w:rFonts w:ascii="Times New Roman" w:hAnsi="Times New Roman"/>
+                <w:b/>
+                <w:sz w:val="20"/>
+              </w:rPr>
+              <w:t>IaC</w:t>
+            </w:r>
+          </w:p>
+        </w:tc>
+        <w:tc>
+          <w:tcPr>
+            <w:tcW w:type="dxa" w:w="4680"/>
+            <w:tcMar>
+              <w:top w:w="60" w:type="dxa"/>
+              <w:bottom w:w="60" w:type="dxa"/>
+              <w:left w:w="100" w:type="dxa"/>
+              <w:right w:w="100" w:type="dxa"/>
+            </w:tcMar>
+          </w:tcPr>
+          <w:p>
+            <w:pPr>
+              <w:spacing w:after="40"/>
+            </w:pPr>
+            <w:r>
+              <w:rPr>
+                <w:rFonts w:ascii="Times New Roman" w:hAnsi="Times New Roman"/>
+                <w:sz w:val="20"/>
+              </w:rPr>
+              <w:t>Infrastructure as Code</w:t>
+            </w:r>
+          </w:p>
+        </w:tc>
+      </w:tr>
+      <w:tr>
+        <w:tc>
+          <w:tcPr>
+            <w:tcW w:type="dxa" w:w="4680"/>
+            <w:shd w:fill="F2F5F9"/>
+            <w:tcMar>
+              <w:top w:w="60" w:type="dxa"/>
+              <w:bottom w:w="60" w:type="dxa"/>
+              <w:left w:w="100" w:type="dxa"/>
+              <w:right w:w="100" w:type="dxa"/>
+            </w:tcMar>
+          </w:tcPr>
+          <w:p>
+            <w:pPr>
+              <w:spacing w:after="40"/>
+            </w:pPr>
+            <w:r>
+              <w:rPr>
+                <w:rFonts w:ascii="Times New Roman" w:hAnsi="Times New Roman"/>
+                <w:b/>
+                <w:sz w:val="20"/>
+              </w:rPr>
+              <w:t>IdP</w:t>
+            </w:r>
+          </w:p>
+        </w:tc>
+        <w:tc>
+          <w:tcPr>
+            <w:tcW w:type="dxa" w:w="4680"/>
+            <w:shd w:fill="F2F5F9"/>
+            <w:tcMar>
+              <w:top w:w="60" w:type="dxa"/>
+              <w:bottom w:w="60" w:type="dxa"/>
+              <w:left w:w="100" w:type="dxa"/>
+              <w:right w:w="100" w:type="dxa"/>
+            </w:tcMar>
+          </w:tcPr>
+          <w:p>
+            <w:pPr>
+              <w:spacing w:after="40"/>
+            </w:pPr>
+            <w:r>
+              <w:rPr>
+                <w:rFonts w:ascii="Times New Roman" w:hAnsi="Times New Roman"/>
+                <w:sz w:val="20"/>
+              </w:rPr>
+              <w:t>Identity Provider</w:t>
+            </w:r>
+          </w:p>
+        </w:tc>
+      </w:tr>
+      <w:tr>
+        <w:tc>
+          <w:tcPr>
+            <w:tcW w:type="dxa" w:w="4680"/>
+            <w:tcMar>
+              <w:top w:w="60" w:type="dxa"/>
+              <w:bottom w:w="60" w:type="dxa"/>
+              <w:left w:w="100" w:type="dxa"/>
+              <w:right w:w="100" w:type="dxa"/>
+            </w:tcMar>
+          </w:tcPr>
+          <w:p>
+            <w:pPr>
+              <w:spacing w:after="40"/>
+            </w:pPr>
+            <w:r>
+              <w:rPr>
+                <w:rFonts w:ascii="Times New Roman" w:hAnsi="Times New Roman"/>
+                <w:b/>
+                <w:sz w:val="20"/>
+              </w:rPr>
+              <w:t>IKE</w:t>
+            </w:r>
+          </w:p>
+        </w:tc>
+        <w:tc>
+          <w:tcPr>
+            <w:tcW w:type="dxa" w:w="4680"/>
+            <w:tcMar>
+              <w:top w:w="60" w:type="dxa"/>
+              <w:bottom w:w="60" w:type="dxa"/>
+              <w:left w:w="100" w:type="dxa"/>
+              <w:right w:w="100" w:type="dxa"/>
+            </w:tcMar>
+          </w:tcPr>
+          <w:p>
+            <w:pPr>
+              <w:spacing w:after="40"/>
+            </w:pPr>
+            <w:r>
+              <w:rPr>
+                <w:rFonts w:ascii="Times New Roman" w:hAnsi="Times New Roman"/>
+                <w:sz w:val="20"/>
+              </w:rPr>
+              <w:t>Internet Key Exchange</w:t>
+            </w:r>
+          </w:p>
+        </w:tc>
+      </w:tr>
+      <w:tr>
+        <w:tc>
+          <w:tcPr>
+            <w:tcW w:type="dxa" w:w="4680"/>
+            <w:shd w:fill="F2F5F9"/>
+            <w:tcMar>
+              <w:top w:w="60" w:type="dxa"/>
+              <w:bottom w:w="60" w:type="dxa"/>
+              <w:left w:w="100" w:type="dxa"/>
+              <w:right w:w="100" w:type="dxa"/>
+            </w:tcMar>
+          </w:tcPr>
+          <w:p>
+            <w:pPr>
+              <w:spacing w:after="40"/>
+            </w:pPr>
+            <w:r>
+              <w:rPr>
+                <w:rFonts w:ascii="Times New Roman" w:hAnsi="Times New Roman"/>
+                <w:b/>
+                <w:sz w:val="20"/>
+              </w:rPr>
+              <w:t>IPsec</w:t>
+            </w:r>
+          </w:p>
+        </w:tc>
+        <w:tc>
+          <w:tcPr>
+            <w:tcW w:type="dxa" w:w="4680"/>
+            <w:shd w:fill="F2F5F9"/>
+            <w:tcMar>
+              <w:top w:w="60" w:type="dxa"/>
+              <w:bottom w:w="60" w:type="dxa"/>
+              <w:left w:w="100" w:type="dxa"/>
+              <w:right w:w="100" w:type="dxa"/>
+            </w:tcMar>
+          </w:tcPr>
+          <w:p>
+            <w:pPr>
+              <w:spacing w:after="40"/>
+            </w:pPr>
+            <w:r>
+              <w:rPr>
+                <w:rFonts w:ascii="Times New Roman" w:hAnsi="Times New Roman"/>
+                <w:sz w:val="20"/>
+              </w:rPr>
+              <w:t>Internet Protocol Security</w:t>
+            </w:r>
+          </w:p>
+        </w:tc>
+      </w:tr>
+      <w:tr>
+        <w:tc>
+          <w:tcPr>
+            <w:tcW w:type="dxa" w:w="4680"/>
+            <w:tcMar>
+              <w:top w:w="60" w:type="dxa"/>
+              <w:bottom w:w="60" w:type="dxa"/>
+              <w:left w:w="100" w:type="dxa"/>
+              <w:right w:w="100" w:type="dxa"/>
+            </w:tcMar>
+          </w:tcPr>
+          <w:p>
+            <w:pPr>
+              <w:spacing w:after="40"/>
+            </w:pPr>
+            <w:r>
+              <w:rPr>
+                <w:rFonts w:ascii="Times New Roman" w:hAnsi="Times New Roman"/>
+                <w:b/>
+                <w:sz w:val="20"/>
+              </w:rPr>
+              <w:t>KMS</w:t>
+            </w:r>
+          </w:p>
+        </w:tc>
+        <w:tc>
+          <w:tcPr>
+            <w:tcW w:type="dxa" w:w="4680"/>
+            <w:tcMar>
+              <w:top w:w="60" w:type="dxa"/>
+              <w:bottom w:w="60" w:type="dxa"/>
+              <w:left w:w="100" w:type="dxa"/>
+              <w:right w:w="100" w:type="dxa"/>
+            </w:tcMar>
+          </w:tcPr>
+          <w:p>
+            <w:pPr>
+              <w:spacing w:after="40"/>
+            </w:pPr>
+            <w:r>
+              <w:rPr>
+                <w:rFonts w:ascii="Times New Roman" w:hAnsi="Times New Roman"/>
+                <w:sz w:val="20"/>
+              </w:rPr>
+              <w:t>Key Management Service</w:t>
+            </w:r>
+          </w:p>
+        </w:tc>
+      </w:tr>
+      <w:tr>
+        <w:tc>
+          <w:tcPr>
+            <w:tcW w:type="dxa" w:w="4680"/>
+            <w:shd w:fill="F2F5F9"/>
+            <w:tcMar>
+              <w:top w:w="60" w:type="dxa"/>
+              <w:bottom w:w="60" w:type="dxa"/>
+              <w:left w:w="100" w:type="dxa"/>
+              <w:right w:w="100" w:type="dxa"/>
+            </w:tcMar>
+          </w:tcPr>
+          <w:p>
+            <w:pPr>
+              <w:spacing w:after="40"/>
+            </w:pPr>
+            <w:r>
+              <w:rPr>
+                <w:rFonts w:ascii="Times New Roman" w:hAnsi="Times New Roman"/>
+                <w:b/>
+                <w:sz w:val="20"/>
+              </w:rPr>
+              <w:t>MCN</w:t>
+            </w:r>
+          </w:p>
+        </w:tc>
+        <w:tc>
+          <w:tcPr>
+            <w:tcW w:type="dxa" w:w="4680"/>
+            <w:shd w:fill="F2F5F9"/>
+            <w:tcMar>
+              <w:top w:w="60" w:type="dxa"/>
+              <w:bottom w:w="60" w:type="dxa"/>
+              <w:left w:w="100" w:type="dxa"/>
+              <w:right w:w="100" w:type="dxa"/>
+            </w:tcMar>
+          </w:tcPr>
+          <w:p>
+            <w:pPr>
+              <w:spacing w:after="40"/>
+            </w:pPr>
+            <w:r>
+              <w:rPr>
+                <w:rFonts w:ascii="Times New Roman" w:hAnsi="Times New Roman"/>
+                <w:sz w:val="20"/>
+              </w:rPr>
+              <w:t>Multi-Cloud Networking</w:t>
+            </w:r>
+          </w:p>
+        </w:tc>
+      </w:tr>
+      <w:tr>
+        <w:tc>
+          <w:tcPr>
+            <w:tcW w:type="dxa" w:w="4680"/>
+            <w:tcMar>
+              <w:top w:w="60" w:type="dxa"/>
+              <w:bottom w:w="60" w:type="dxa"/>
+              <w:left w:w="100" w:type="dxa"/>
+              <w:right w:w="100" w:type="dxa"/>
+            </w:tcMar>
+          </w:tcPr>
+          <w:p>
+            <w:pPr>
+              <w:spacing w:after="40"/>
+            </w:pPr>
+            <w:r>
+              <w:rPr>
+                <w:rFonts w:ascii="Times New Roman" w:hAnsi="Times New Roman"/>
+                <w:b/>
+                <w:sz w:val="20"/>
+              </w:rPr>
+              <w:t>MFA</w:t>
+            </w:r>
+          </w:p>
+        </w:tc>
+        <w:tc>
+          <w:tcPr>
+            <w:tcW w:type="dxa" w:w="4680"/>
+            <w:tcMar>
+              <w:top w:w="60" w:type="dxa"/>
+              <w:bottom w:w="60" w:type="dxa"/>
+              <w:left w:w="100" w:type="dxa"/>
+              <w:right w:w="100" w:type="dxa"/>
+            </w:tcMar>
+          </w:tcPr>
+          <w:p>
+            <w:pPr>
+              <w:spacing w:after="40"/>
+            </w:pPr>
+            <w:r>
+              <w:rPr>
+                <w:rFonts w:ascii="Times New Roman" w:hAnsi="Times New Roman"/>
+                <w:sz w:val="20"/>
+              </w:rPr>
+              <w:t>Multi-Factor Authentication</w:t>
+            </w:r>
+          </w:p>
+        </w:tc>
+      </w:tr>
+      <w:tr>
+        <w:tc>
+          <w:tcPr>
+            <w:tcW w:type="dxa" w:w="4680"/>
+            <w:shd w:fill="F2F5F9"/>
+            <w:tcMar>
+              <w:top w:w="60" w:type="dxa"/>
+              <w:bottom w:w="60" w:type="dxa"/>
+              <w:left w:w="100" w:type="dxa"/>
+              <w:right w:w="100" w:type="dxa"/>
+            </w:tcMar>
+          </w:tcPr>
+          <w:p>
+            <w:pPr>
+              <w:spacing w:after="40"/>
+            </w:pPr>
+            <w:r>
+              <w:rPr>
+                <w:rFonts w:ascii="Times New Roman" w:hAnsi="Times New Roman"/>
+                <w:b/>
+                <w:sz w:val="20"/>
+              </w:rPr>
+              <w:t>MIT</w:t>
+            </w:r>
+          </w:p>
+        </w:tc>
+        <w:tc>
+          <w:tcPr>
+            <w:tcW w:type="dxa" w:w="4680"/>
+            <w:shd w:fill="F2F5F9"/>
+            <w:tcMar>
+              <w:top w:w="60" w:type="dxa"/>
+              <w:bottom w:w="60" w:type="dxa"/>
+              <w:left w:w="100" w:type="dxa"/>
+              <w:right w:w="100" w:type="dxa"/>
+            </w:tcMar>
+          </w:tcPr>
+          <w:p>
+            <w:pPr>
+              <w:spacing w:after="40"/>
+            </w:pPr>
+            <w:r>
+              <w:rPr>
+                <w:rFonts w:ascii="Times New Roman" w:hAnsi="Times New Roman"/>
+                <w:sz w:val="20"/>
+              </w:rPr>
+              <w:t>Master of Information Technology</w:t>
+            </w:r>
+          </w:p>
+        </w:tc>
+      </w:tr>
+      <w:tr>
+        <w:tc>
+          <w:tcPr>
+            <w:tcW w:type="dxa" w:w="4680"/>
+            <w:tcMar>
+              <w:top w:w="60" w:type="dxa"/>
+              <w:bottom w:w="60" w:type="dxa"/>
+              <w:left w:w="100" w:type="dxa"/>
+              <w:right w:w="100" w:type="dxa"/>
+            </w:tcMar>
+          </w:tcPr>
+          <w:p>
+            <w:pPr>
+              <w:spacing w:after="40"/>
+            </w:pPr>
+            <w:r>
+              <w:rPr>
+                <w:rFonts w:ascii="Times New Roman" w:hAnsi="Times New Roman"/>
+                <w:b/>
+                <w:sz w:val="20"/>
+              </w:rPr>
+              <w:t>NACL</w:t>
+            </w:r>
+          </w:p>
+        </w:tc>
+        <w:tc>
+          <w:tcPr>
+            <w:tcW w:type="dxa" w:w="4680"/>
+            <w:tcMar>
+              <w:top w:w="60" w:type="dxa"/>
+              <w:bottom w:w="60" w:type="dxa"/>
+              <w:left w:w="100" w:type="dxa"/>
+              <w:right w:w="100" w:type="dxa"/>
+            </w:tcMar>
+          </w:tcPr>
+          <w:p>
+            <w:pPr>
+              <w:spacing w:after="40"/>
+            </w:pPr>
+            <w:r>
+              <w:rPr>
+                <w:rFonts w:ascii="Times New Roman" w:hAnsi="Times New Roman"/>
+                <w:sz w:val="20"/>
+              </w:rPr>
+              <w:t>Network Access Control List</w:t>
+            </w:r>
+          </w:p>
+        </w:tc>
+      </w:tr>
+      <w:tr>
+        <w:tc>
+          <w:tcPr>
+            <w:tcW w:type="dxa" w:w="4680"/>
+            <w:shd w:fill="F2F5F9"/>
+            <w:tcMar>
+              <w:top w:w="60" w:type="dxa"/>
+              <w:bottom w:w="60" w:type="dxa"/>
+              <w:left w:w="100" w:type="dxa"/>
+              <w:right w:w="100" w:type="dxa"/>
+            </w:tcMar>
+          </w:tcPr>
+          <w:p>
+            <w:pPr>
+              <w:spacing w:after="40"/>
+            </w:pPr>
+            <w:r>
+              <w:rPr>
+                <w:rFonts w:ascii="Times New Roman" w:hAnsi="Times New Roman"/>
+                <w:b/>
+                <w:sz w:val="20"/>
+              </w:rPr>
+              <w:t>NDPA</w:t>
+            </w:r>
+          </w:p>
+        </w:tc>
+        <w:tc>
+          <w:tcPr>
+            <w:tcW w:type="dxa" w:w="4680"/>
+            <w:shd w:fill="F2F5F9"/>
+            <w:tcMar>
+              <w:top w:w="60" w:type="dxa"/>
+              <w:bottom w:w="60" w:type="dxa"/>
+              <w:left w:w="100" w:type="dxa"/>
+              <w:right w:w="100" w:type="dxa"/>
+            </w:tcMar>
+          </w:tcPr>
+          <w:p>
+            <w:pPr>
+              <w:spacing w:after="40"/>
+            </w:pPr>
+            <w:r>
+              <w:rPr>
+                <w:rFonts w:ascii="Times New Roman" w:hAnsi="Times New Roman"/>
+                <w:sz w:val="20"/>
+              </w:rPr>
+              <w:t>Nigeria Data Protection Act 2023</w:t>
+            </w:r>
+          </w:p>
+        </w:tc>
+      </w:tr>
+      <w:tr>
+        <w:tc>
+          <w:tcPr>
+            <w:tcW w:type="dxa" w:w="4680"/>
+            <w:tcMar>
+              <w:top w:w="60" w:type="dxa"/>
+              <w:bottom w:w="60" w:type="dxa"/>
+              <w:left w:w="100" w:type="dxa"/>
+              <w:right w:w="100" w:type="dxa"/>
+            </w:tcMar>
+          </w:tcPr>
+          <w:p>
+            <w:pPr>
+              <w:spacing w:after="40"/>
+            </w:pPr>
+            <w:r>
+              <w:rPr>
+                <w:rFonts w:ascii="Times New Roman" w:hAnsi="Times New Roman"/>
+                <w:b/>
+                <w:sz w:val="20"/>
+              </w:rPr>
+              <w:t>NDPC</w:t>
+            </w:r>
+          </w:p>
+        </w:tc>
+        <w:tc>
+          <w:tcPr>
+            <w:tcW w:type="dxa" w:w="4680"/>
+            <w:tcMar>
+              <w:top w:w="60" w:type="dxa"/>
+              <w:bottom w:w="60" w:type="dxa"/>
+              <w:left w:w="100" w:type="dxa"/>
+              <w:right w:w="100" w:type="dxa"/>
+            </w:tcMar>
+          </w:tcPr>
+          <w:p>
+            <w:pPr>
+              <w:spacing w:after="40"/>
+            </w:pPr>
+            <w:r>
+              <w:rPr>
+                <w:rFonts w:ascii="Times New Roman" w:hAnsi="Times New Roman"/>
+                <w:sz w:val="20"/>
+              </w:rPr>
+              <w:t>Nigeria Data Protection Commission</w:t>
+            </w:r>
+          </w:p>
+        </w:tc>
+      </w:tr>
+      <w:tr>
+        <w:tc>
+          <w:tcPr>
+            <w:tcW w:type="dxa" w:w="4680"/>
+            <w:shd w:fill="F2F5F9"/>
+            <w:tcMar>
+              <w:top w:w="60" w:type="dxa"/>
+              <w:bottom w:w="60" w:type="dxa"/>
+              <w:left w:w="100" w:type="dxa"/>
+              <w:right w:w="100" w:type="dxa"/>
+            </w:tcMar>
+          </w:tcPr>
+          <w:p>
+            <w:pPr>
+              <w:spacing w:after="40"/>
+            </w:pPr>
+            <w:r>
+              <w:rPr>
+                <w:rFonts w:ascii="Times New Roman" w:hAnsi="Times New Roman"/>
+                <w:b/>
+                <w:sz w:val="20"/>
+              </w:rPr>
+              <w:t>NIST</w:t>
+            </w:r>
+          </w:p>
+        </w:tc>
+        <w:tc>
+          <w:tcPr>
+            <w:tcW w:type="dxa" w:w="4680"/>
+            <w:shd w:fill="F2F5F9"/>
+            <w:tcMar>
+              <w:top w:w="60" w:type="dxa"/>
+              <w:bottom w:w="60" w:type="dxa"/>
+              <w:left w:w="100" w:type="dxa"/>
+              <w:right w:w="100" w:type="dxa"/>
+            </w:tcMar>
+          </w:tcPr>
+          <w:p>
+            <w:pPr>
+              <w:spacing w:after="40"/>
+            </w:pPr>
+            <w:r>
+              <w:rPr>
+                <w:rFonts w:ascii="Times New Roman" w:hAnsi="Times New Roman"/>
+                <w:sz w:val="20"/>
+              </w:rPr>
+              <w:t>National Institute of Standards and Technology</w:t>
+            </w:r>
+          </w:p>
+        </w:tc>
+      </w:tr>
+      <w:tr>
+        <w:tc>
+          <w:tcPr>
+            <w:tcW w:type="dxa" w:w="4680"/>
+            <w:tcMar>
+              <w:top w:w="60" w:type="dxa"/>
+              <w:bottom w:w="60" w:type="dxa"/>
+              <w:left w:w="100" w:type="dxa"/>
+              <w:right w:w="100" w:type="dxa"/>
+            </w:tcMar>
+          </w:tcPr>
+          <w:p>
+            <w:pPr>
+              <w:spacing w:after="40"/>
+            </w:pPr>
+            <w:r>
+              <w:rPr>
+                <w:rFonts w:ascii="Times New Roman" w:hAnsi="Times New Roman"/>
+                <w:b/>
+                <w:sz w:val="20"/>
+              </w:rPr>
+              <w:t>NITDA</w:t>
+            </w:r>
+          </w:p>
+        </w:tc>
+        <w:tc>
+          <w:tcPr>
+            <w:tcW w:type="dxa" w:w="4680"/>
+            <w:tcMar>
+              <w:top w:w="60" w:type="dxa"/>
+              <w:bottom w:w="60" w:type="dxa"/>
+              <w:left w:w="100" w:type="dxa"/>
+              <w:right w:w="100" w:type="dxa"/>
+            </w:tcMar>
+          </w:tcPr>
+          <w:p>
+            <w:pPr>
+              <w:spacing w:after="40"/>
+            </w:pPr>
+            <w:r>
+              <w:rPr>
+                <w:rFonts w:ascii="Times New Roman" w:hAnsi="Times New Roman"/>
+                <w:sz w:val="20"/>
+              </w:rPr>
+              <w:t>National Information Technology Development Agency</w:t>
+            </w:r>
+          </w:p>
+        </w:tc>
+      </w:tr>
+      <w:tr>
+        <w:tc>
+          <w:tcPr>
+            <w:tcW w:type="dxa" w:w="4680"/>
+            <w:shd w:fill="F2F5F9"/>
+            <w:tcMar>
+              <w:top w:w="60" w:type="dxa"/>
+              <w:bottom w:w="60" w:type="dxa"/>
+              <w:left w:w="100" w:type="dxa"/>
+              <w:right w:w="100" w:type="dxa"/>
+            </w:tcMar>
+          </w:tcPr>
+          <w:p>
+            <w:pPr>
+              <w:spacing w:after="40"/>
+            </w:pPr>
+            <w:r>
+              <w:rPr>
+                <w:rFonts w:ascii="Times New Roman" w:hAnsi="Times New Roman"/>
+                <w:b/>
+                <w:sz w:val="20"/>
+              </w:rPr>
+              <w:t>NSG</w:t>
+            </w:r>
+          </w:p>
+        </w:tc>
+        <w:tc>
+          <w:tcPr>
+            <w:tcW w:type="dxa" w:w="4680"/>
+            <w:shd w:fill="F2F5F9"/>
+            <w:tcMar>
+              <w:top w:w="60" w:type="dxa"/>
+              <w:bottom w:w="60" w:type="dxa"/>
+              <w:left w:w="100" w:type="dxa"/>
+              <w:right w:w="100" w:type="dxa"/>
+            </w:tcMar>
+          </w:tcPr>
+          <w:p>
+            <w:pPr>
+              <w:spacing w:after="40"/>
+            </w:pPr>
+            <w:r>
+              <w:rPr>
+                <w:rFonts w:ascii="Times New Roman" w:hAnsi="Times New Roman"/>
+                <w:sz w:val="20"/>
+              </w:rPr>
+              <w:t>Network Security Group</w:t>
+            </w:r>
+          </w:p>
+        </w:tc>
+      </w:tr>
+      <w:tr>
+        <w:tc>
+          <w:tcPr>
+            <w:tcW w:type="dxa" w:w="4680"/>
+            <w:tcMar>
+              <w:top w:w="60" w:type="dxa"/>
+              <w:bottom w:w="60" w:type="dxa"/>
+              <w:left w:w="100" w:type="dxa"/>
+              <w:right w:w="100" w:type="dxa"/>
+            </w:tcMar>
+          </w:tcPr>
+          <w:p>
+            <w:pPr>
+              <w:spacing w:after="40"/>
+            </w:pPr>
+            <w:r>
+              <w:rPr>
+                <w:rFonts w:ascii="Times New Roman" w:hAnsi="Times New Roman"/>
+                <w:b/>
+                <w:sz w:val="20"/>
+              </w:rPr>
+              <w:t>NUC</w:t>
+            </w:r>
+          </w:p>
+        </w:tc>
+        <w:tc>
+          <w:tcPr>
+            <w:tcW w:type="dxa" w:w="4680"/>
+            <w:tcMar>
+              <w:top w:w="60" w:type="dxa"/>
+              <w:bottom w:w="60" w:type="dxa"/>
+              <w:left w:w="100" w:type="dxa"/>
+              <w:right w:w="100" w:type="dxa"/>
+            </w:tcMar>
+          </w:tcPr>
+          <w:p>
+            <w:pPr>
+              <w:spacing w:after="40"/>
+            </w:pPr>
+            <w:r>
+              <w:rPr>
+                <w:rFonts w:ascii="Times New Roman" w:hAnsi="Times New Roman"/>
+                <w:sz w:val="20"/>
+              </w:rPr>
+              <w:t>National Universities Commission</w:t>
+            </w:r>
+          </w:p>
+        </w:tc>
+      </w:tr>
+      <w:tr>
+        <w:tc>
+          <w:tcPr>
+            <w:tcW w:type="dxa" w:w="4680"/>
+            <w:shd w:fill="F2F5F9"/>
+            <w:tcMar>
+              <w:top w:w="60" w:type="dxa"/>
+              <w:bottom w:w="60" w:type="dxa"/>
+              <w:left w:w="100" w:type="dxa"/>
+              <w:right w:w="100" w:type="dxa"/>
+            </w:tcMar>
+          </w:tcPr>
+          <w:p>
+            <w:pPr>
+              <w:spacing w:after="40"/>
+            </w:pPr>
+            <w:r>
+              <w:rPr>
+                <w:rFonts w:ascii="Times New Roman" w:hAnsi="Times New Roman"/>
+                <w:b/>
+                <w:sz w:val="20"/>
+              </w:rPr>
+              <w:t>PaaS</w:t>
+            </w:r>
+          </w:p>
+        </w:tc>
+        <w:tc>
+          <w:tcPr>
+            <w:tcW w:type="dxa" w:w="4680"/>
+            <w:shd w:fill="F2F5F9"/>
+            <w:tcMar>
+              <w:top w:w="60" w:type="dxa"/>
+              <w:bottom w:w="60" w:type="dxa"/>
+              <w:left w:w="100" w:type="dxa"/>
+              <w:right w:w="100" w:type="dxa"/>
+            </w:tcMar>
+          </w:tcPr>
+          <w:p>
+            <w:pPr>
+              <w:spacing w:after="40"/>
+            </w:pPr>
+            <w:r>
+              <w:rPr>
+                <w:rFonts w:ascii="Times New Roman" w:hAnsi="Times New Roman"/>
+                <w:sz w:val="20"/>
+              </w:rPr>
+              <w:t>Platform as a Service</w:t>
+            </w:r>
+          </w:p>
+        </w:tc>
+      </w:tr>
+      <w:tr>
+        <w:tc>
+          <w:tcPr>
+            <w:tcW w:type="dxa" w:w="4680"/>
+            <w:tcMar>
+              <w:top w:w="60" w:type="dxa"/>
+              <w:bottom w:w="60" w:type="dxa"/>
+              <w:left w:w="100" w:type="dxa"/>
+              <w:right w:w="100" w:type="dxa"/>
+            </w:tcMar>
+          </w:tcPr>
+          <w:p>
+            <w:pPr>
+              <w:spacing w:after="40"/>
+            </w:pPr>
+            <w:r>
+              <w:rPr>
+                <w:rFonts w:ascii="Times New Roman" w:hAnsi="Times New Roman"/>
+                <w:b/>
+                <w:sz w:val="20"/>
+              </w:rPr>
+              <w:t>PEP</w:t>
+            </w:r>
+          </w:p>
+        </w:tc>
+        <w:tc>
+          <w:tcPr>
+            <w:tcW w:type="dxa" w:w="4680"/>
+            <w:tcMar>
+              <w:top w:w="60" w:type="dxa"/>
+              <w:bottom w:w="60" w:type="dxa"/>
+              <w:left w:w="100" w:type="dxa"/>
+              <w:right w:w="100" w:type="dxa"/>
+            </w:tcMar>
+          </w:tcPr>
+          <w:p>
+            <w:pPr>
+              <w:spacing w:after="40"/>
+            </w:pPr>
+            <w:r>
+              <w:rPr>
+                <w:rFonts w:ascii="Times New Roman" w:hAnsi="Times New Roman"/>
+                <w:sz w:val="20"/>
+              </w:rPr>
+              <w:t>Policy Enforcement Point</w:t>
+            </w:r>
+          </w:p>
+        </w:tc>
+      </w:tr>
+      <w:tr>
+        <w:tc>
+          <w:tcPr>
+            <w:tcW w:type="dxa" w:w="4680"/>
+            <w:shd w:fill="F2F5F9"/>
+            <w:tcMar>
+              <w:top w:w="60" w:type="dxa"/>
+              <w:bottom w:w="60" w:type="dxa"/>
+              <w:left w:w="100" w:type="dxa"/>
+              <w:right w:w="100" w:type="dxa"/>
+            </w:tcMar>
+          </w:tcPr>
+          <w:p>
+            <w:pPr>
+              <w:spacing w:after="40"/>
+            </w:pPr>
+            <w:r>
+              <w:rPr>
+                <w:rFonts w:ascii="Times New Roman" w:hAnsi="Times New Roman"/>
+                <w:b/>
+                <w:sz w:val="20"/>
+              </w:rPr>
+              <w:t>RBAC</w:t>
+            </w:r>
+          </w:p>
+        </w:tc>
+        <w:tc>
+          <w:tcPr>
+            <w:tcW w:type="dxa" w:w="4680"/>
+            <w:shd w:fill="F2F5F9"/>
+            <w:tcMar>
+              <w:top w:w="60" w:type="dxa"/>
+              <w:bottom w:w="60" w:type="dxa"/>
+              <w:left w:w="100" w:type="dxa"/>
+              <w:right w:w="100" w:type="dxa"/>
+            </w:tcMar>
+          </w:tcPr>
+          <w:p>
+            <w:pPr>
+              <w:spacing w:after="40"/>
+            </w:pPr>
+            <w:r>
+              <w:rPr>
+                <w:rFonts w:ascii="Times New Roman" w:hAnsi="Times New Roman"/>
+                <w:sz w:val="20"/>
+              </w:rPr>
+              <w:t>Role-Based Access Control</w:t>
+            </w:r>
+          </w:p>
+        </w:tc>
+      </w:tr>
+      <w:tr>
+        <w:tc>
+          <w:tcPr>
+            <w:tcW w:type="dxa" w:w="4680"/>
+            <w:tcMar>
+              <w:top w:w="60" w:type="dxa"/>
+              <w:bottom w:w="60" w:type="dxa"/>
+              <w:left w:w="100" w:type="dxa"/>
+              <w:right w:w="100" w:type="dxa"/>
+            </w:tcMar>
+          </w:tcPr>
+          <w:p>
+            <w:pPr>
+              <w:spacing w:after="40"/>
+            </w:pPr>
+            <w:r>
+              <w:rPr>
+                <w:rFonts w:ascii="Times New Roman" w:hAnsi="Times New Roman"/>
+                <w:b/>
+                <w:sz w:val="20"/>
+              </w:rPr>
+              <w:t>RTO</w:t>
+            </w:r>
+          </w:p>
+        </w:tc>
+        <w:tc>
+          <w:tcPr>
+            <w:tcW w:type="dxa" w:w="4680"/>
+            <w:tcMar>
+              <w:top w:w="60" w:type="dxa"/>
+              <w:bottom w:w="60" w:type="dxa"/>
+              <w:left w:w="100" w:type="dxa"/>
+              <w:right w:w="100" w:type="dxa"/>
+            </w:tcMar>
+          </w:tcPr>
+          <w:p>
+            <w:pPr>
+              <w:spacing w:after="40"/>
+            </w:pPr>
+            <w:r>
+              <w:rPr>
+                <w:rFonts w:ascii="Times New Roman" w:hAnsi="Times New Roman"/>
+                <w:sz w:val="20"/>
+              </w:rPr>
+              <w:t>Recovery Time Objective</w:t>
+            </w:r>
+          </w:p>
+        </w:tc>
+      </w:tr>
+      <w:tr>
+        <w:tc>
+          <w:tcPr>
+            <w:tcW w:type="dxa" w:w="4680"/>
+            <w:shd w:fill="F2F5F9"/>
+            <w:tcMar>
+              <w:top w:w="60" w:type="dxa"/>
+              <w:bottom w:w="60" w:type="dxa"/>
+              <w:left w:w="100" w:type="dxa"/>
+              <w:right w:w="100" w:type="dxa"/>
+            </w:tcMar>
+          </w:tcPr>
+          <w:p>
+            <w:pPr>
+              <w:spacing w:after="40"/>
+            </w:pPr>
+            <w:r>
+              <w:rPr>
+                <w:rFonts w:ascii="Times New Roman" w:hAnsi="Times New Roman"/>
+                <w:b/>
+                <w:sz w:val="20"/>
+              </w:rPr>
+              <w:t>RTT</w:t>
+            </w:r>
+          </w:p>
+        </w:tc>
+        <w:tc>
+          <w:tcPr>
+            <w:tcW w:type="dxa" w:w="4680"/>
+            <w:shd w:fill="F2F5F9"/>
+            <w:tcMar>
+              <w:top w:w="60" w:type="dxa"/>
+              <w:bottom w:w="60" w:type="dxa"/>
+              <w:left w:w="100" w:type="dxa"/>
+              <w:right w:w="100" w:type="dxa"/>
+            </w:tcMar>
+          </w:tcPr>
+          <w:p>
+            <w:pPr>
+              <w:spacing w:after="40"/>
+            </w:pPr>
+            <w:r>
+              <w:rPr>
+                <w:rFonts w:ascii="Times New Roman" w:hAnsi="Times New Roman"/>
+                <w:sz w:val="20"/>
+              </w:rPr>
+              <w:t>Round-Trip Time</w:t>
+            </w:r>
+          </w:p>
+        </w:tc>
+      </w:tr>
+      <w:tr>
+        <w:tc>
+          <w:tcPr>
+            <w:tcW w:type="dxa" w:w="4680"/>
+            <w:tcMar>
+              <w:top w:w="60" w:type="dxa"/>
+              <w:bottom w:w="60" w:type="dxa"/>
+              <w:left w:w="100" w:type="dxa"/>
+              <w:right w:w="100" w:type="dxa"/>
+            </w:tcMar>
+          </w:tcPr>
+          <w:p>
+            <w:pPr>
+              <w:spacing w:after="40"/>
+            </w:pPr>
+            <w:r>
+              <w:rPr>
+                <w:rFonts w:ascii="Times New Roman" w:hAnsi="Times New Roman"/>
+                <w:b/>
+                <w:sz w:val="20"/>
+              </w:rPr>
+              <w:t>SAML</w:t>
+            </w:r>
+          </w:p>
+        </w:tc>
+        <w:tc>
+          <w:tcPr>
+            <w:tcW w:type="dxa" w:w="4680"/>
+            <w:tcMar>
+              <w:top w:w="60" w:type="dxa"/>
+              <w:bottom w:w="60" w:type="dxa"/>
+              <w:left w:w="100" w:type="dxa"/>
+              <w:right w:w="100" w:type="dxa"/>
+            </w:tcMar>
+          </w:tcPr>
+          <w:p>
+            <w:pPr>
+              <w:spacing w:after="40"/>
+            </w:pPr>
+            <w:r>
+              <w:rPr>
+                <w:rFonts w:ascii="Times New Roman" w:hAnsi="Times New Roman"/>
+                <w:sz w:val="20"/>
+              </w:rPr>
+              <w:t>Security Assertion Markup Language</w:t>
+            </w:r>
+          </w:p>
+        </w:tc>
+      </w:tr>
+      <w:tr>
+        <w:tc>
+          <w:tcPr>
+            <w:tcW w:type="dxa" w:w="4680"/>
+            <w:shd w:fill="F2F5F9"/>
+            <w:tcMar>
+              <w:top w:w="60" w:type="dxa"/>
+              <w:bottom w:w="60" w:type="dxa"/>
+              <w:left w:w="100" w:type="dxa"/>
+              <w:right w:w="100" w:type="dxa"/>
+            </w:tcMar>
+          </w:tcPr>
+          <w:p>
+            <w:pPr>
+              <w:spacing w:after="40"/>
+            </w:pPr>
+            <w:r>
+              <w:rPr>
+                <w:rFonts w:ascii="Times New Roman" w:hAnsi="Times New Roman"/>
+                <w:b/>
+                <w:sz w:val="20"/>
+              </w:rPr>
+              <w:t>SaaS</w:t>
+            </w:r>
+          </w:p>
+        </w:tc>
+        <w:tc>
+          <w:tcPr>
+            <w:tcW w:type="dxa" w:w="4680"/>
+            <w:shd w:fill="F2F5F9"/>
+            <w:tcMar>
+              <w:top w:w="60" w:type="dxa"/>
+              <w:bottom w:w="60" w:type="dxa"/>
+              <w:left w:w="100" w:type="dxa"/>
+              <w:right w:w="100" w:type="dxa"/>
+            </w:tcMar>
+          </w:tcPr>
+          <w:p>
+            <w:pPr>
+              <w:spacing w:after="40"/>
+            </w:pPr>
+            <w:r>
+              <w:rPr>
+                <w:rFonts w:ascii="Times New Roman" w:hAnsi="Times New Roman"/>
+                <w:sz w:val="20"/>
+              </w:rPr>
+              <w:t>Software as a Service</w:t>
+            </w:r>
+          </w:p>
+        </w:tc>
+      </w:tr>
+      <w:tr>
+        <w:tc>
+          <w:tcPr>
+            <w:tcW w:type="dxa" w:w="4680"/>
+            <w:tcMar>
+              <w:top w:w="60" w:type="dxa"/>
+              <w:bottom w:w="60" w:type="dxa"/>
+              <w:left w:w="100" w:type="dxa"/>
+              <w:right w:w="100" w:type="dxa"/>
+            </w:tcMar>
+          </w:tcPr>
+          <w:p>
+            <w:pPr>
+              <w:spacing w:after="40"/>
+            </w:pPr>
+            <w:r>
+              <w:rPr>
+                <w:rFonts w:ascii="Times New Roman" w:hAnsi="Times New Roman"/>
+                <w:b/>
+                <w:sz w:val="20"/>
+              </w:rPr>
+              <w:t>SCIM</w:t>
+            </w:r>
+          </w:p>
+        </w:tc>
+        <w:tc>
+          <w:tcPr>
+            <w:tcW w:type="dxa" w:w="4680"/>
+            <w:tcMar>
+              <w:top w:w="60" w:type="dxa"/>
+              <w:bottom w:w="60" w:type="dxa"/>
+              <w:left w:w="100" w:type="dxa"/>
+              <w:right w:w="100" w:type="dxa"/>
+            </w:tcMar>
+          </w:tcPr>
+          <w:p>
+            <w:pPr>
+              <w:spacing w:after="40"/>
+            </w:pPr>
+            <w:r>
+              <w:rPr>
+                <w:rFonts w:ascii="Times New Roman" w:hAnsi="Times New Roman"/>
+                <w:sz w:val="20"/>
+              </w:rPr>
+              <w:t>System for Cross-domain Identity Management</w:t>
+            </w:r>
+          </w:p>
+        </w:tc>
+      </w:tr>
+      <w:tr>
+        <w:tc>
+          <w:tcPr>
+            <w:tcW w:type="dxa" w:w="4680"/>
+            <w:shd w:fill="F2F5F9"/>
+            <w:tcMar>
+              <w:top w:w="60" w:type="dxa"/>
+              <w:bottom w:w="60" w:type="dxa"/>
+              <w:left w:w="100" w:type="dxa"/>
+              <w:right w:w="100" w:type="dxa"/>
+            </w:tcMar>
+          </w:tcPr>
+          <w:p>
+            <w:pPr>
+              <w:spacing w:after="40"/>
+            </w:pPr>
+            <w:r>
+              <w:rPr>
+                <w:rFonts w:ascii="Times New Roman" w:hAnsi="Times New Roman"/>
+                <w:b/>
+                <w:sz w:val="20"/>
+              </w:rPr>
+              <w:t>SIEM</w:t>
+            </w:r>
+          </w:p>
+        </w:tc>
+        <w:tc>
+          <w:tcPr>
+            <w:tcW w:type="dxa" w:w="4680"/>
+            <w:shd w:fill="F2F5F9"/>
+            <w:tcMar>
+              <w:top w:w="60" w:type="dxa"/>
+              <w:bottom w:w="60" w:type="dxa"/>
+              <w:left w:w="100" w:type="dxa"/>
+              <w:right w:w="100" w:type="dxa"/>
+            </w:tcMar>
+          </w:tcPr>
+          <w:p>
+            <w:pPr>
+              <w:spacing w:after="40"/>
+            </w:pPr>
+            <w:r>
+              <w:rPr>
+                <w:rFonts w:ascii="Times New Roman" w:hAnsi="Times New Roman"/>
+                <w:sz w:val="20"/>
+              </w:rPr>
+              <w:t>Security Information and Event Management</w:t>
+            </w:r>
+          </w:p>
+        </w:tc>
+      </w:tr>
+      <w:tr>
+        <w:tc>
+          <w:tcPr>
+            <w:tcW w:type="dxa" w:w="4680"/>
+            <w:tcMar>
+              <w:top w:w="60" w:type="dxa"/>
+              <w:bottom w:w="60" w:type="dxa"/>
+              <w:left w:w="100" w:type="dxa"/>
+              <w:right w:w="100" w:type="dxa"/>
+            </w:tcMar>
+          </w:tcPr>
+          <w:p>
+            <w:pPr>
+              <w:spacing w:after="40"/>
+            </w:pPr>
+            <w:r>
+              <w:rPr>
+                <w:rFonts w:ascii="Times New Roman" w:hAnsi="Times New Roman"/>
+                <w:b/>
+                <w:sz w:val="20"/>
+              </w:rPr>
+              <w:t>SP</w:t>
+            </w:r>
+          </w:p>
+        </w:tc>
+        <w:tc>
+          <w:tcPr>
+            <w:tcW w:type="dxa" w:w="4680"/>
+            <w:tcMar>
+              <w:top w:w="60" w:type="dxa"/>
+              <w:bottom w:w="60" w:type="dxa"/>
+              <w:left w:w="100" w:type="dxa"/>
+              <w:right w:w="100" w:type="dxa"/>
+            </w:tcMar>
+          </w:tcPr>
+          <w:p>
+            <w:pPr>
+              <w:spacing w:after="40"/>
+            </w:pPr>
+            <w:r>
+              <w:rPr>
+                <w:rFonts w:ascii="Times New Roman" w:hAnsi="Times New Roman"/>
+                <w:sz w:val="20"/>
+              </w:rPr>
+              <w:t>Service Provider</w:t>
+            </w:r>
+          </w:p>
+        </w:tc>
+      </w:tr>
+      <w:tr>
+        <w:tc>
+          <w:tcPr>
+            <w:tcW w:type="dxa" w:w="4680"/>
+            <w:shd w:fill="F2F5F9"/>
+            <w:tcMar>
+              <w:top w:w="60" w:type="dxa"/>
+              <w:bottom w:w="60" w:type="dxa"/>
+              <w:left w:w="100" w:type="dxa"/>
+              <w:right w:w="100" w:type="dxa"/>
+            </w:tcMar>
+          </w:tcPr>
+          <w:p>
+            <w:pPr>
+              <w:spacing w:after="40"/>
+            </w:pPr>
+            <w:r>
+              <w:rPr>
+                <w:rFonts w:ascii="Times New Roman" w:hAnsi="Times New Roman"/>
+                <w:b/>
+                <w:sz w:val="20"/>
+              </w:rPr>
+              <w:t>SSO</w:t>
+            </w:r>
+          </w:p>
+        </w:tc>
+        <w:tc>
+          <w:tcPr>
+            <w:tcW w:type="dxa" w:w="4680"/>
+            <w:shd w:fill="F2F5F9"/>
+            <w:tcMar>
+              <w:top w:w="60" w:type="dxa"/>
+              <w:bottom w:w="60" w:type="dxa"/>
+              <w:left w:w="100" w:type="dxa"/>
+              <w:right w:w="100" w:type="dxa"/>
+            </w:tcMar>
+          </w:tcPr>
+          <w:p>
+            <w:pPr>
+              <w:spacing w:after="40"/>
+            </w:pPr>
+            <w:r>
+              <w:rPr>
+                <w:rFonts w:ascii="Times New Roman" w:hAnsi="Times New Roman"/>
+                <w:sz w:val="20"/>
+              </w:rPr>
+              <w:t>Single Sign-On</w:t>
+            </w:r>
+          </w:p>
+        </w:tc>
+      </w:tr>
+      <w:tr>
+        <w:tc>
+          <w:tcPr>
+            <w:tcW w:type="dxa" w:w="4680"/>
+            <w:tcMar>
+              <w:top w:w="60" w:type="dxa"/>
+              <w:bottom w:w="60" w:type="dxa"/>
+              <w:left w:w="100" w:type="dxa"/>
+              <w:right w:w="100" w:type="dxa"/>
+            </w:tcMar>
+          </w:tcPr>
+          <w:p>
+            <w:pPr>
+              <w:spacing w:after="40"/>
+            </w:pPr>
+            <w:r>
+              <w:rPr>
+                <w:rFonts w:ascii="Times New Roman" w:hAnsi="Times New Roman"/>
+                <w:b/>
+                <w:sz w:val="20"/>
+              </w:rPr>
+              <w:t>STS</w:t>
+            </w:r>
+          </w:p>
+        </w:tc>
+        <w:tc>
+          <w:tcPr>
+            <w:tcW w:type="dxa" w:w="4680"/>
+            <w:tcMar>
+              <w:top w:w="60" w:type="dxa"/>
+              <w:bottom w:w="60" w:type="dxa"/>
+              <w:left w:w="100" w:type="dxa"/>
+              <w:right w:w="100" w:type="dxa"/>
+            </w:tcMar>
+          </w:tcPr>
+          <w:p>
+            <w:pPr>
+              <w:spacing w:after="40"/>
+            </w:pPr>
+            <w:r>
+              <w:rPr>
+                <w:rFonts w:ascii="Times New Roman" w:hAnsi="Times New Roman"/>
+                <w:sz w:val="20"/>
+              </w:rPr>
+              <w:t>Security Token Service</w:t>
+            </w:r>
+          </w:p>
+        </w:tc>
+      </w:tr>
+      <w:tr>
+        <w:tc>
+          <w:tcPr>
+            <w:tcW w:type="dxa" w:w="4680"/>
+            <w:shd w:fill="F2F5F9"/>
+            <w:tcMar>
+              <w:top w:w="60" w:type="dxa"/>
+              <w:bottom w:w="60" w:type="dxa"/>
+              <w:left w:w="100" w:type="dxa"/>
+              <w:right w:w="100" w:type="dxa"/>
+            </w:tcMar>
+          </w:tcPr>
+          <w:p>
+            <w:pPr>
+              <w:spacing w:after="40"/>
+            </w:pPr>
+            <w:r>
+              <w:rPr>
+                <w:rFonts w:ascii="Times New Roman" w:hAnsi="Times New Roman"/>
+                <w:b/>
+                <w:sz w:val="20"/>
+              </w:rPr>
+              <w:t>TGW</w:t>
+            </w:r>
+          </w:p>
+        </w:tc>
+        <w:tc>
+          <w:tcPr>
+            <w:tcW w:type="dxa" w:w="4680"/>
+            <w:shd w:fill="F2F5F9"/>
+            <w:tcMar>
+              <w:top w:w="60" w:type="dxa"/>
+              <w:bottom w:w="60" w:type="dxa"/>
+              <w:left w:w="100" w:type="dxa"/>
+              <w:right w:w="100" w:type="dxa"/>
+            </w:tcMar>
+          </w:tcPr>
+          <w:p>
+            <w:pPr>
+              <w:spacing w:after="40"/>
+            </w:pPr>
+            <w:r>
+              <w:rPr>
+                <w:rFonts w:ascii="Times New Roman" w:hAnsi="Times New Roman"/>
+                <w:sz w:val="20"/>
+              </w:rPr>
+              <w:t>AWS Transit Gateway</w:t>
+            </w:r>
+          </w:p>
+        </w:tc>
+      </w:tr>
+      <w:tr>
+        <w:tc>
+          <w:tcPr>
+            <w:tcW w:type="dxa" w:w="4680"/>
+            <w:tcMar>
+              <w:top w:w="60" w:type="dxa"/>
+              <w:bottom w:w="60" w:type="dxa"/>
+              <w:left w:w="100" w:type="dxa"/>
+              <w:right w:w="100" w:type="dxa"/>
+            </w:tcMar>
+          </w:tcPr>
+          <w:p>
+            <w:pPr>
+              <w:spacing w:after="40"/>
+            </w:pPr>
+            <w:r>
+              <w:rPr>
+                <w:rFonts w:ascii="Times New Roman" w:hAnsi="Times New Roman"/>
+                <w:b/>
+                <w:sz w:val="20"/>
+              </w:rPr>
+              <w:t>UDR</w:t>
+            </w:r>
+          </w:p>
+        </w:tc>
+        <w:tc>
+          <w:tcPr>
+            <w:tcW w:type="dxa" w:w="4680"/>
+            <w:tcMar>
+              <w:top w:w="60" w:type="dxa"/>
+              <w:bottom w:w="60" w:type="dxa"/>
+              <w:left w:w="100" w:type="dxa"/>
+              <w:right w:w="100" w:type="dxa"/>
+            </w:tcMar>
+          </w:tcPr>
+          <w:p>
+            <w:pPr>
+              <w:spacing w:after="40"/>
+            </w:pPr>
+            <w:r>
+              <w:rPr>
+                <w:rFonts w:ascii="Times New Roman" w:hAnsi="Times New Roman"/>
+                <w:sz w:val="20"/>
+              </w:rPr>
+              <w:t>User-Defined Route</w:t>
+            </w:r>
+          </w:p>
+        </w:tc>
+      </w:tr>
+      <w:tr>
+        <w:tc>
+          <w:tcPr>
+            <w:tcW w:type="dxa" w:w="4680"/>
+            <w:shd w:fill="F2F5F9"/>
+            <w:tcMar>
+              <w:top w:w="60" w:type="dxa"/>
+              <w:bottom w:w="60" w:type="dxa"/>
+              <w:left w:w="100" w:type="dxa"/>
+              <w:right w:w="100" w:type="dxa"/>
+            </w:tcMar>
+          </w:tcPr>
+          <w:p>
+            <w:pPr>
+              <w:spacing w:after="40"/>
+            </w:pPr>
+            <w:r>
+              <w:rPr>
+                <w:rFonts w:ascii="Times New Roman" w:hAnsi="Times New Roman"/>
+                <w:b/>
+                <w:sz w:val="20"/>
+              </w:rPr>
+              <w:t>VMC</w:t>
+            </w:r>
+          </w:p>
+        </w:tc>
+        <w:tc>
+          <w:tcPr>
+            <w:tcW w:type="dxa" w:w="4680"/>
+            <w:shd w:fill="F2F5F9"/>
+            <w:tcMar>
+              <w:top w:w="60" w:type="dxa"/>
+              <w:bottom w:w="60" w:type="dxa"/>
+              <w:left w:w="100" w:type="dxa"/>
+              <w:right w:w="100" w:type="dxa"/>
+            </w:tcMar>
+          </w:tcPr>
+          <w:p>
+            <w:pPr>
+              <w:spacing w:after="40"/>
+            </w:pPr>
+            <w:r>
+              <w:rPr>
+                <w:rFonts w:ascii="Times New Roman" w:hAnsi="Times New Roman"/>
+                <w:sz w:val="20"/>
+              </w:rPr>
+              <w:t>Virtual Machine Scale</w:t>
+            </w:r>
+          </w:p>
+        </w:tc>
+      </w:tr>
+      <w:tr>
+        <w:tc>
+          <w:tcPr>
+            <w:tcW w:type="dxa" w:w="4680"/>
+            <w:tcMar>
+              <w:top w:w="60" w:type="dxa"/>
+              <w:bottom w:w="60" w:type="dxa"/>
+              <w:left w:w="100" w:type="dxa"/>
+              <w:right w:w="100" w:type="dxa"/>
+            </w:tcMar>
+          </w:tcPr>
+          <w:p>
+            <w:pPr>
+              <w:spacing w:after="40"/>
+            </w:pPr>
+            <w:r>
+              <w:rPr>
+                <w:rFonts w:ascii="Times New Roman" w:hAnsi="Times New Roman"/>
+                <w:b/>
+                <w:sz w:val="20"/>
+              </w:rPr>
+              <w:t>VNG</w:t>
+            </w:r>
+          </w:p>
+        </w:tc>
+        <w:tc>
+          <w:tcPr>
+            <w:tcW w:type="dxa" w:w="4680"/>
+            <w:tcMar>
+              <w:top w:w="60" w:type="dxa"/>
+              <w:bottom w:w="60" w:type="dxa"/>
+              <w:left w:w="100" w:type="dxa"/>
+              <w:right w:w="100" w:type="dxa"/>
+            </w:tcMar>
+          </w:tcPr>
+          <w:p>
+            <w:pPr>
+              <w:spacing w:after="40"/>
+            </w:pPr>
+            <w:r>
+              <w:rPr>
+                <w:rFonts w:ascii="Times New Roman" w:hAnsi="Times New Roman"/>
+                <w:sz w:val="20"/>
+              </w:rPr>
+              <w:t>Azure Virtual Network Gateway</w:t>
+            </w:r>
+          </w:p>
+        </w:tc>
+      </w:tr>
+      <w:tr>
+        <w:tc>
+          <w:tcPr>
+            <w:tcW w:type="dxa" w:w="4680"/>
+            <w:shd w:fill="F2F5F9"/>
+            <w:tcMar>
+              <w:top w:w="60" w:type="dxa"/>
+              <w:bottom w:w="60" w:type="dxa"/>
+              <w:left w:w="100" w:type="dxa"/>
+              <w:right w:w="100" w:type="dxa"/>
+            </w:tcMar>
+          </w:tcPr>
+          <w:p>
+            <w:pPr>
+              <w:spacing w:after="40"/>
+            </w:pPr>
+            <w:r>
+              <w:rPr>
+                <w:rFonts w:ascii="Times New Roman" w:hAnsi="Times New Roman"/>
+                <w:b/>
+                <w:sz w:val="20"/>
+              </w:rPr>
+              <w:t>VNet</w:t>
+            </w:r>
+          </w:p>
+        </w:tc>
+        <w:tc>
+          <w:tcPr>
+            <w:tcW w:type="dxa" w:w="4680"/>
+            <w:shd w:fill="F2F5F9"/>
+            <w:tcMar>
+              <w:top w:w="60" w:type="dxa"/>
+              <w:bottom w:w="60" w:type="dxa"/>
+              <w:left w:w="100" w:type="dxa"/>
+              <w:right w:w="100" w:type="dxa"/>
+            </w:tcMar>
+          </w:tcPr>
+          <w:p>
+            <w:pPr>
+              <w:spacing w:after="40"/>
+            </w:pPr>
+            <w:r>
+              <w:rPr>
+                <w:rFonts w:ascii="Times New Roman" w:hAnsi="Times New Roman"/>
+                <w:sz w:val="20"/>
+              </w:rPr>
+              <w:t>Azure Virtual Network</w:t>
+            </w:r>
+          </w:p>
+        </w:tc>
+      </w:tr>
+      <w:tr>
+        <w:tc>
+          <w:tcPr>
+            <w:tcW w:type="dxa" w:w="4680"/>
+            <w:tcMar>
+              <w:top w:w="60" w:type="dxa"/>
+              <w:bottom w:w="60" w:type="dxa"/>
+              <w:left w:w="100" w:type="dxa"/>
+              <w:right w:w="100" w:type="dxa"/>
+            </w:tcMar>
+          </w:tcPr>
+          <w:p>
+            <w:pPr>
+              <w:spacing w:after="40"/>
+            </w:pPr>
+            <w:r>
+              <w:rPr>
+                <w:rFonts w:ascii="Times New Roman" w:hAnsi="Times New Roman"/>
+                <w:b/>
+                <w:sz w:val="20"/>
+              </w:rPr>
+              <w:t>VPC</w:t>
+            </w:r>
+          </w:p>
+        </w:tc>
+        <w:tc>
+          <w:tcPr>
+            <w:tcW w:type="dxa" w:w="4680"/>
+            <w:tcMar>
+              <w:top w:w="60" w:type="dxa"/>
+              <w:bottom w:w="60" w:type="dxa"/>
+              <w:left w:w="100" w:type="dxa"/>
+              <w:right w:w="100" w:type="dxa"/>
+            </w:tcMar>
+          </w:tcPr>
+          <w:p>
+            <w:pPr>
+              <w:spacing w:after="40"/>
+            </w:pPr>
+            <w:r>
+              <w:rPr>
+                <w:rFonts w:ascii="Times New Roman" w:hAnsi="Times New Roman"/>
+                <w:sz w:val="20"/>
+              </w:rPr>
+              <w:t>Amazon Virtual Private Cloud</w:t>
+            </w:r>
+          </w:p>
+        </w:tc>
+      </w:tr>
+      <w:tr>
+        <w:tc>
+          <w:tcPr>
+            <w:tcW w:type="dxa" w:w="4680"/>
+            <w:shd w:fill="F2F5F9"/>
+            <w:tcMar>
+              <w:top w:w="60" w:type="dxa"/>
+              <w:bottom w:w="60" w:type="dxa"/>
+              <w:left w:w="100" w:type="dxa"/>
+              <w:right w:w="100" w:type="dxa"/>
+            </w:tcMar>
+          </w:tcPr>
+          <w:p>
+            <w:pPr>
+              <w:spacing w:after="40"/>
+            </w:pPr>
+            <w:r>
+              <w:rPr>
+                <w:rFonts w:ascii="Times New Roman" w:hAnsi="Times New Roman"/>
+                <w:b/>
+                <w:sz w:val="20"/>
+              </w:rPr>
+              <w:t>VPN</w:t>
+            </w:r>
+          </w:p>
+        </w:tc>
+        <w:tc>
+          <w:tcPr>
+            <w:tcW w:type="dxa" w:w="4680"/>
+            <w:shd w:fill="F2F5F9"/>
+            <w:tcMar>
+              <w:top w:w="60" w:type="dxa"/>
+              <w:bottom w:w="60" w:type="dxa"/>
+              <w:left w:w="100" w:type="dxa"/>
+              <w:right w:w="100" w:type="dxa"/>
+            </w:tcMar>
+          </w:tcPr>
+          <w:p>
+            <w:pPr>
+              <w:spacing w:after="40"/>
+            </w:pPr>
+            <w:r>
+              <w:rPr>
+                <w:rFonts w:ascii="Times New Roman" w:hAnsi="Times New Roman"/>
+                <w:sz w:val="20"/>
+              </w:rPr>
+              <w:t>Virtual Private Network</w:t>
+            </w:r>
+          </w:p>
+        </w:tc>
+      </w:tr>
+      <w:tr>
+        <w:tc>
+          <w:tcPr>
+            <w:tcW w:type="dxa" w:w="4680"/>
+            <w:tcMar>
+              <w:top w:w="60" w:type="dxa"/>
+              <w:bottom w:w="60" w:type="dxa"/>
+              <w:left w:w="100" w:type="dxa"/>
+              <w:right w:w="100" w:type="dxa"/>
+            </w:tcMar>
+          </w:tcPr>
+          <w:p>
+            <w:pPr>
+              <w:spacing w:after="40"/>
+            </w:pPr>
+            <w:r>
+              <w:rPr>
+                <w:rFonts w:ascii="Times New Roman" w:hAnsi="Times New Roman"/>
+                <w:b/>
+                <w:sz w:val="20"/>
+              </w:rPr>
+              <w:t>ZTA</w:t>
+            </w:r>
+          </w:p>
+        </w:tc>
+        <w:tc>
+          <w:tcPr>
+            <w:tcW w:type="dxa" w:w="4680"/>
+            <w:tcMar>
+              <w:top w:w="60" w:type="dxa"/>
+              <w:bottom w:w="60" w:type="dxa"/>
+              <w:left w:w="100" w:type="dxa"/>
+              <w:right w:w="100" w:type="dxa"/>
+            </w:tcMar>
+          </w:tcPr>
+          <w:p>
+            <w:pPr>
+              <w:spacing w:after="40"/>
+            </w:pPr>
+            <w:r>
+              <w:rPr>
+                <w:rFonts w:ascii="Times New Roman" w:hAnsi="Times New Roman"/>
+                <w:sz w:val="20"/>
+              </w:rPr>
+              <w:t>Zero Trust Architecture</w:t>
+            </w:r>
+          </w:p>
+        </w:tc>
+      </w:tr>
+    </w:tbl>
+    <w:p>
+      <w:r>
+        <w:br w:type="page"/>
+      </w:r>
+    </w:p>
+    <w:p>
+      <w:pPr>
+        <w:keepNext/>
+        <w:spacing w:before="400" w:after="240"/>
+      </w:pPr>
+      <w:r>
+        <w:rPr>
+          <w:rFonts w:ascii="Times New Roman" w:hAnsi="Times New Roman"/>
+          <w:b/>
+          <w:color w:val="1F497D"/>
+          <w:sz w:val="36"/>
+        </w:rPr>
+        <w:t>CHAPTER ONE: INTRODUCTION</w:t>
       </w:r>
     </w:p>
     <w:p>
@@ -101,7 +3027,81 @@
           <w:rFonts w:ascii="Times New Roman" w:hAnsi="Times New Roman"/>
           <w:b/>
           <w:color w:val="1F497D"/>
-          <w:sz w:val="32"/>
+          <w:sz w:val="30"/>
+        </w:rPr>
+        <w:t>1.0 Introduction</w:t>
+      </w:r>
+    </w:p>
+    <w:p>
+      <w:pPr>
+        <w:spacing w:after="120" w:line="300" w:lineRule="auto"/>
+      </w:pPr>
+      <w:r>
+        <w:rPr>
+          <w:rFonts w:ascii="Times New Roman" w:hAnsi="Times New Roman"/>
+          <w:sz w:val="24"/>
+        </w:rPr>
+        <w:t>Cloud computing has become a central component of contemporary enterprise information technology. Organisations increasingly depend on public cloud platforms to host applications, store information, analyse data, support remote access, and provide digital services to customers. In sectors such as financial services, telecommunications, healthcare, government, and electronic commerce, cloud infrastructure is no longer used only for secondary systems. It now supports customer-facing applications, identity services, business intelligence, backup environments, disaster recovery facilities, and other workloads that are critical to organisational continuity.</w:t>
+      </w:r>
+    </w:p>
+    <w:p>
+      <w:pPr>
+        <w:spacing w:after="120" w:line="300" w:lineRule="auto"/>
+      </w:pPr>
+      <w:r>
+        <w:rPr>
+          <w:rFonts w:ascii="Times New Roman" w:hAnsi="Times New Roman"/>
+          <w:sz w:val="24"/>
+        </w:rPr>
+        <w:t>The growing importance of cloud services has changed how enterprises design their technology environments. Rather than placing all workloads with a single cloud service provider, organisations frequently distribute applications and supporting services across two or more cloud platforms—a arrangement commonly described as a multi-cloud architecture. A multi-cloud strategy enables an organisation to leverage specialised capabilities of different providers, reduce excessive vendor lock-in, improve service continuity, and satisfy operational or regulatory requirements. However, it also introduces complex security and architectural challenges regarding inter-cloud network connectivity, identity management, security-policy consistency, monitoring, incident detection, and regulatory governance.</w:t>
+      </w:r>
+    </w:p>
+    <w:p>
+      <w:pPr>
+        <w:spacing w:after="120" w:line="300" w:lineRule="auto"/>
+      </w:pPr>
+      <w:r>
+        <w:rPr>
+          <w:rFonts w:ascii="Times New Roman" w:hAnsi="Times New Roman"/>
+          <w:sz w:val="24"/>
+        </w:rPr>
+        <w:t>This Professional Master’s Project addresses these challenges through the design, implementation, and empirical evaluation of a secure reference architecture connecting Amazon Web Services (AWS) and Microsoft Azure. The project is deliberately practice-oriented and solution-driven. It moves beyond theoretical discussions of multi-cloud security by developing a deployable, reproducible technical artefact comprising segmented cloud networks, encrypted inter-cloud connectivity, federated identity controls, centralised observability, Infrastructure as Code (IaC), and a representative three-tier enterprise workload. The resulting system is evaluated against quantitative security posture, network performance, and operational resilience criteria.</w:t>
+      </w:r>
+    </w:p>
+    <w:p>
+      <w:pPr>
+        <w:spacing w:after="120" w:line="300" w:lineRule="auto"/>
+      </w:pPr>
+      <w:r>
+        <w:rPr>
+          <w:rFonts w:ascii="Times New Roman" w:hAnsi="Times New Roman"/>
+          <w:sz w:val="24"/>
+        </w:rPr>
+        <w:t>This orientation aligns directly with the MIVA Open University Professional Master’s Project framework, which requires an applied, solution-driven project demonstrating the ability to identify a real-world IT problem, design and implement a practical solution, and evaluate the system under empirical conditions.</w:t>
+      </w:r>
+    </w:p>
+    <w:p>
+      <w:pPr>
+        <w:spacing w:before="120" w:after="120"/>
+      </w:pPr>
+      <w:r>
+        <w:rPr>
+          <w:color w:val="CCCCCC"/>
+        </w:rPr>
+        <w:t>――――――――――――――――――――――――――――――――――――――――――――――――――</w:t>
+      </w:r>
+    </w:p>
+    <w:p>
+      <w:pPr>
+        <w:keepNext/>
+        <w:spacing w:before="280" w:after="160"/>
+      </w:pPr>
+      <w:r>
+        <w:rPr>
+          <w:rFonts w:ascii="Times New Roman" w:hAnsi="Times New Roman"/>
+          <w:b/>
+          <w:color w:val="1F497D"/>
+          <w:sz w:val="30"/>
         </w:rPr>
         <w:t>1.1 Background to the Project</w:t>
       </w:r>
@@ -116,7 +3116,7 @@
           <w:rFonts w:ascii="Times New Roman" w:hAnsi="Times New Roman"/>
           <w:b/>
           <w:color w:val="366092"/>
-          <w:sz w:val="27"/>
+          <w:sz w:val="26"/>
         </w:rPr>
         <w:t>1.1.1 Evolution of Enterprise Cloud Computing</w:t>
       </w:r>
@@ -167,7 +3167,7 @@
           <w:rFonts w:ascii="Times New Roman" w:hAnsi="Times New Roman"/>
           <w:b/>
           <w:color w:val="366092"/>
-          <w:sz w:val="27"/>
+          <w:sz w:val="26"/>
         </w:rPr>
         <w:t>1.1.2 Emergence of Multi-Cloud Enterprise Environments</w:t>
       </w:r>
@@ -351,7 +3351,7 @@
           <w:rFonts w:ascii="Times New Roman" w:hAnsi="Times New Roman"/>
           <w:b/>
           <w:color w:val="366092"/>
-          <w:sz w:val="27"/>
+          <w:sz w:val="26"/>
         </w:rPr>
         <w:t>1.1.3 AWS and Microsoft Azure as Enterprise Cloud Platforms</w:t>
       </w:r>
@@ -494,7 +3494,7 @@
           <w:rFonts w:ascii="Times New Roman" w:hAnsi="Times New Roman"/>
           <w:b/>
           <w:color w:val="366092"/>
-          <w:sz w:val="27"/>
+          <w:sz w:val="26"/>
         </w:rPr>
         <w:t>1.1.4 Enterprise Workload Context</w:t>
       </w:r>
@@ -599,7 +3599,7 @@
           <w:rFonts w:ascii="Times New Roman" w:hAnsi="Times New Roman"/>
           <w:b/>
           <w:color w:val="366092"/>
-          <w:sz w:val="27"/>
+          <w:sz w:val="26"/>
         </w:rPr>
         <w:t>1.1.5 Security Implications of Multi-Cloud Connectivity</w:t>
       </w:r>
@@ -653,7 +3653,7 @@
           <w:rFonts w:ascii="Times New Roman" w:hAnsi="Times New Roman"/>
           <w:b/>
           <w:color w:val="366092"/>
-          <w:sz w:val="27"/>
+          <w:sz w:val="26"/>
         </w:rPr>
         <w:t>1.1.6 Infrastructure as Code and Reproducibility</w:t>
       </w:r>
@@ -695,7 +3695,7 @@
           <w:rFonts w:ascii="Times New Roman" w:hAnsi="Times New Roman"/>
           <w:b/>
           <w:color w:val="366092"/>
-          <w:sz w:val="27"/>
+          <w:sz w:val="26"/>
         </w:rPr>
         <w:t>1.1.7 Need for an Implemented and Evaluated Reference Architecture</w:t>
       </w:r>
@@ -733,7 +3733,7 @@
           <w:rFonts w:ascii="Times New Roman" w:hAnsi="Times New Roman"/>
           <w:b/>
           <w:color w:val="1F497D"/>
-          <w:sz w:val="32"/>
+          <w:sz w:val="30"/>
         </w:rPr>
         <w:t>1.2 Conceptual Foundation of the Project</w:t>
       </w:r>
@@ -873,7 +3873,7 @@
           <w:rFonts w:ascii="Times New Roman" w:hAnsi="Times New Roman"/>
           <w:b/>
           <w:color w:val="1F497D"/>
-          <w:sz w:val="32"/>
+          <w:sz w:val="30"/>
         </w:rPr>
         <w:t>1.3 Statement of the Problem</w:t>
       </w:r>
@@ -1063,7 +4063,7 @@
           <w:rFonts w:ascii="Times New Roman" w:hAnsi="Times New Roman"/>
           <w:b/>
           <w:color w:val="1F497D"/>
-          <w:sz w:val="32"/>
+          <w:sz w:val="30"/>
         </w:rPr>
         <w:t>1.4 Aim and Objectives of the Project</w:t>
       </w:r>
@@ -1078,7 +4078,7 @@
           <w:rFonts w:ascii="Times New Roman" w:hAnsi="Times New Roman"/>
           <w:b/>
           <w:color w:val="366092"/>
-          <w:sz w:val="27"/>
+          <w:sz w:val="26"/>
         </w:rPr>
         <w:t>1.4.1 Aim</w:t>
       </w:r>
@@ -1120,7 +4120,7 @@
           <w:rFonts w:ascii="Times New Roman" w:hAnsi="Times New Roman"/>
           <w:b/>
           <w:color w:val="366092"/>
-          <w:sz w:val="27"/>
+          <w:sz w:val="26"/>
         </w:rPr>
         <w:t>1.4.2 Objectives</w:t>
       </w:r>
@@ -1256,7 +4256,7 @@
           <w:rFonts w:ascii="Times New Roman" w:hAnsi="Times New Roman"/>
           <w:b/>
           <w:color w:val="1F497D"/>
-          <w:sz w:val="32"/>
+          <w:sz w:val="30"/>
         </w:rPr>
         <w:t>1.5 Scope of the Project</w:t>
       </w:r>
@@ -1414,7 +4414,7 @@
           <w:rFonts w:ascii="Times New Roman" w:hAnsi="Times New Roman"/>
           <w:b/>
           <w:color w:val="1F497D"/>
-          <w:sz w:val="32"/>
+          <w:sz w:val="30"/>
         </w:rPr>
         <w:t>1.6 Significance of the Project</w:t>
       </w:r>
@@ -1528,7 +4528,7 @@
           <w:rFonts w:ascii="Times New Roman" w:hAnsi="Times New Roman"/>
           <w:b/>
           <w:color w:val="1F497D"/>
-          <w:sz w:val="32"/>
+          <w:sz w:val="30"/>
         </w:rPr>
         <w:t>1.7 Organisation of the Report</w:t>
       </w:r>
@@ -1679,14 +4679,14 @@
     <w:p>
       <w:pPr>
         <w:keepNext/>
-        <w:spacing w:before="360" w:after="240"/>
+        <w:spacing w:before="400" w:after="240"/>
       </w:pPr>
       <w:r>
         <w:rPr>
           <w:rFonts w:ascii="Times New Roman" w:hAnsi="Times New Roman"/>
           <w:b/>
           <w:color w:val="1F497D"/>
-          <w:sz w:val="40"/>
+          <w:sz w:val="36"/>
         </w:rPr>
         <w:t>CHAPTER TWO: LITERATURE REVIEW AND TECHNOLOGY CONTEXT</w:t>
       </w:r>
@@ -1701,7 +4701,7 @@
           <w:rFonts w:ascii="Times New Roman" w:hAnsi="Times New Roman"/>
           <w:b/>
           <w:color w:val="1F497D"/>
-          <w:sz w:val="32"/>
+          <w:sz w:val="30"/>
         </w:rPr>
         <w:t>2.0 Introduction</w:t>
       </w:r>
@@ -1751,7 +4751,7 @@
           <w:rFonts w:ascii="Times New Roman" w:hAnsi="Times New Roman"/>
           <w:b/>
           <w:color w:val="1F497D"/>
-          <w:sz w:val="32"/>
+          <w:sz w:val="30"/>
         </w:rPr>
         <w:t>2.1 Conceptual Review</w:t>
       </w:r>
@@ -1766,7 +4766,7 @@
           <w:rFonts w:ascii="Times New Roman" w:hAnsi="Times New Roman"/>
           <w:b/>
           <w:color w:val="366092"/>
-          <w:sz w:val="27"/>
+          <w:sz w:val="26"/>
         </w:rPr>
         <w:t>2.1.1 Cloud Computing Paradigms and Architectural Abstraction</w:t>
       </w:r>
@@ -1805,7 +4805,7 @@
           <w:rFonts w:ascii="Times New Roman" w:hAnsi="Times New Roman"/>
           <w:b/>
           <w:color w:val="366092"/>
-          <w:sz w:val="27"/>
+          <w:sz w:val="26"/>
         </w:rPr>
         <w:t>2.1.2 Public Cloud Platforms and Enterprise Workloads</w:t>
       </w:r>
@@ -1844,7 +4844,7 @@
           <w:rFonts w:ascii="Times New Roman" w:hAnsi="Times New Roman"/>
           <w:b/>
           <w:color w:val="366092"/>
-          <w:sz w:val="27"/>
+          <w:sz w:val="26"/>
         </w:rPr>
         <w:t>2.1.3 Multi-Cloud Computing vs. Hybrid Cloud</w:t>
       </w:r>
@@ -1883,7 +4883,7 @@
           <w:rFonts w:ascii="Times New Roman" w:hAnsi="Times New Roman"/>
           <w:b/>
           <w:color w:val="366092"/>
-          <w:sz w:val="27"/>
+          <w:sz w:val="26"/>
         </w:rPr>
         <w:t>2.1.4 Multi-Cloud Architecture and Sovereign Data Governance</w:t>
       </w:r>
@@ -2033,7 +5033,7 @@
           <w:rFonts w:ascii="Times New Roman" w:hAnsi="Times New Roman"/>
           <w:b/>
           <w:color w:val="366092"/>
-          <w:sz w:val="27"/>
+          <w:sz w:val="26"/>
         </w:rPr>
         <w:t>2.1.5 Section Synthesis and Alignment with Proposed Artefact</w:t>
       </w:r>
@@ -2091,7 +5091,7 @@
           <w:rFonts w:ascii="Times New Roman" w:hAnsi="Times New Roman"/>
           <w:b/>
           <w:color w:val="1F497D"/>
-          <w:sz w:val="32"/>
+          <w:sz w:val="30"/>
         </w:rPr>
         <w:t>2.2 Theoretical Review</w:t>
       </w:r>
@@ -2106,7 +5106,7 @@
           <w:rFonts w:ascii="Times New Roman" w:hAnsi="Times New Roman"/>
           <w:b/>
           <w:color w:val="366092"/>
-          <w:sz w:val="27"/>
+          <w:sz w:val="26"/>
         </w:rPr>
         <w:t>2.2.1 Design Science Research Methodology (DSRM)</w:t>
       </w:r>
@@ -2160,7 +5160,7 @@
           <w:rFonts w:ascii="Times New Roman" w:hAnsi="Times New Roman"/>
           <w:b/>
           <w:color w:val="366092"/>
-          <w:sz w:val="27"/>
+          <w:sz w:val="26"/>
         </w:rPr>
         <w:t>2.2.2 Socio-Technical Systems Theory</w:t>
       </w:r>
@@ -2187,7 +5187,7 @@
           <w:rFonts w:ascii="Times New Roman" w:hAnsi="Times New Roman"/>
           <w:b/>
           <w:color w:val="366092"/>
-          <w:sz w:val="27"/>
+          <w:sz w:val="26"/>
         </w:rPr>
         <w:t>2.2.3 Shared Responsibility Theory in Multi-Cloud Contexts</w:t>
       </w:r>
@@ -2226,7 +5226,7 @@
           <w:rFonts w:ascii="Times New Roman" w:hAnsi="Times New Roman"/>
           <w:b/>
           <w:color w:val="366092"/>
-          <w:sz w:val="27"/>
+          <w:sz w:val="26"/>
         </w:rPr>
         <w:t>2.2.4 Section Synthesis and Alignment with Proposed Artefact</w:t>
       </w:r>
@@ -2284,7 +5284,7 @@
           <w:rFonts w:ascii="Times New Roman" w:hAnsi="Times New Roman"/>
           <w:b/>
           <w:color w:val="1F497D"/>
-          <w:sz w:val="32"/>
+          <w:sz w:val="30"/>
         </w:rPr>
         <w:t>2.3 Technology Context: AWS and Microsoft Azure</w:t>
       </w:r>
@@ -2299,7 +5299,7 @@
           <w:rFonts w:ascii="Times New Roman" w:hAnsi="Times New Roman"/>
           <w:b/>
           <w:color w:val="366092"/>
-          <w:sz w:val="27"/>
+          <w:sz w:val="26"/>
         </w:rPr>
         <w:t>2.3.1 AWS Networking and Security Architecture</w:t>
       </w:r>
@@ -2414,7 +5414,7 @@
           <w:rFonts w:ascii="Times New Roman" w:hAnsi="Times New Roman"/>
           <w:b/>
           <w:color w:val="366092"/>
-          <w:sz w:val="27"/>
+          <w:sz w:val="26"/>
         </w:rPr>
         <w:t>2.3.2 Microsoft Azure Networking and Security Architecture</w:t>
       </w:r>
@@ -2529,7 +5529,7 @@
           <w:rFonts w:ascii="Times New Roman" w:hAnsi="Times New Roman"/>
           <w:b/>
           <w:color w:val="366092"/>
-          <w:sz w:val="27"/>
+          <w:sz w:val="26"/>
         </w:rPr>
         <w:t>2.3.3 Comparative Analysis of AWS and Azure Constructs</w:t>
       </w:r>
@@ -3390,7 +6390,7 @@
           <w:rFonts w:ascii="Times New Roman" w:hAnsi="Times New Roman"/>
           <w:b/>
           <w:color w:val="366092"/>
-          <w:sz w:val="27"/>
+          <w:sz w:val="26"/>
         </w:rPr>
         <w:t>2.3.4 Section Synthesis and Alignment with Proposed Artefact</w:t>
       </w:r>
@@ -3478,7 +6478,7 @@
           <w:rFonts w:ascii="Times New Roman" w:hAnsi="Times New Roman"/>
           <w:b/>
           <w:color w:val="1F497D"/>
-          <w:sz w:val="32"/>
+          <w:sz w:val="30"/>
         </w:rPr>
         <w:t>2.4 Virtual Private Network (VPN) Technologies and Interconnection</w:t>
       </w:r>
@@ -3493,7 +6493,7 @@
           <w:rFonts w:ascii="Times New Roman" w:hAnsi="Times New Roman"/>
           <w:b/>
           <w:color w:val="366092"/>
-          <w:sz w:val="27"/>
+          <w:sz w:val="26"/>
         </w:rPr>
         <w:t>2.4.1 IPsec Protocol Architecture</w:t>
       </w:r>
@@ -3576,7 +6576,7 @@
           <w:rFonts w:ascii="Times New Roman" w:hAnsi="Times New Roman"/>
           <w:b/>
           <w:color w:val="366092"/>
-          <w:sz w:val="27"/>
+          <w:sz w:val="26"/>
         </w:rPr>
         <w:t>2.4.2 Route-Based VPN vs. Policy-Based VPN</w:t>
       </w:r>
@@ -3603,7 +6603,7 @@
           <w:rFonts w:ascii="Times New Roman" w:hAnsi="Times New Roman"/>
           <w:b/>
           <w:color w:val="366092"/>
-          <w:sz w:val="27"/>
+          <w:sz w:val="26"/>
         </w:rPr>
         <w:t>2.4.3 Border Gateway Protocol (BGP) and Multi-Tunnel Resilience</w:t>
       </w:r>
@@ -3709,7 +6709,7 @@
           <w:rFonts w:ascii="Times New Roman" w:hAnsi="Times New Roman"/>
           <w:b/>
           <w:color w:val="366092"/>
-          <w:sz w:val="27"/>
+          <w:sz w:val="26"/>
         </w:rPr>
         <w:t>2.4.4 Section Synthesis and Alignment with Proposed Artefact</w:t>
       </w:r>
@@ -3782,7 +6782,7 @@
           <w:rFonts w:ascii="Times New Roman" w:hAnsi="Times New Roman"/>
           <w:b/>
           <w:color w:val="1F497D"/>
-          <w:sz w:val="32"/>
+          <w:sz w:val="30"/>
         </w:rPr>
         <w:t>2.5 Zero Trust Architecture (ZTA) and Defence-in-Depth</w:t>
       </w:r>
@@ -3797,7 +6797,7 @@
           <w:rFonts w:ascii="Times New Roman" w:hAnsi="Times New Roman"/>
           <w:b/>
           <w:color w:val="366092"/>
-          <w:sz w:val="27"/>
+          <w:sz w:val="26"/>
         </w:rPr>
         <w:t>2.5.1 Evolution of Zero Trust Security Theory</w:t>
       </w:r>
@@ -3949,7 +6949,7 @@
           <w:rFonts w:ascii="Times New Roman" w:hAnsi="Times New Roman"/>
           <w:b/>
           <w:color w:val="366092"/>
-          <w:sz w:val="27"/>
+          <w:sz w:val="26"/>
         </w:rPr>
         <w:t>2.5.2 Operationalizing Zero Trust in Multi-Cloud (NIST SP 800-207A)</w:t>
       </w:r>
@@ -4115,7 +7115,7 @@
           <w:rFonts w:ascii="Times New Roman" w:hAnsi="Times New Roman"/>
           <w:b/>
           <w:color w:val="366092"/>
-          <w:sz w:val="27"/>
+          <w:sz w:val="26"/>
         </w:rPr>
         <w:t>2.5.3 Micro-Segmentation and Defence-in-Depth</w:t>
       </w:r>
@@ -4157,7 +7157,7 @@
           <w:rFonts w:ascii="Times New Roman" w:hAnsi="Times New Roman"/>
           <w:b/>
           <w:color w:val="366092"/>
-          <w:sz w:val="27"/>
+          <w:sz w:val="26"/>
         </w:rPr>
         <w:t>2.5.4 Section Synthesis and Alignment with Proposed Artefact</w:t>
       </w:r>
@@ -4230,7 +7230,7 @@
           <w:rFonts w:ascii="Times New Roman" w:hAnsi="Times New Roman"/>
           <w:b/>
           <w:color w:val="1F497D"/>
-          <w:sz w:val="32"/>
+          <w:sz w:val="30"/>
         </w:rPr>
         <w:t>2.6 Cloud Security Alliance (CSA) Cloud Controls Matrix (CCM)</w:t>
       </w:r>
@@ -4245,7 +7245,7 @@
           <w:rFonts w:ascii="Times New Roman" w:hAnsi="Times New Roman"/>
           <w:b/>
           <w:color w:val="366092"/>
-          <w:sz w:val="27"/>
+          <w:sz w:val="26"/>
         </w:rPr>
         <w:t>2.6.1 Governance and Assurance Frameworks</w:t>
       </w:r>
@@ -4272,7 +7272,7 @@
           <w:rFonts w:ascii="Times New Roman" w:hAnsi="Times New Roman"/>
           <w:b/>
           <w:color w:val="366092"/>
-          <w:sz w:val="27"/>
+          <w:sz w:val="26"/>
         </w:rPr>
         <w:t>2.6.2 Mapping Relevant CCM v4.1 Domains to the Multi-Cloud Artefact</w:t>
       </w:r>
@@ -5007,7 +8007,7 @@
           <w:rFonts w:ascii="Times New Roman" w:hAnsi="Times New Roman"/>
           <w:b/>
           <w:color w:val="366092"/>
-          <w:sz w:val="27"/>
+          <w:sz w:val="26"/>
         </w:rPr>
         <w:t>2.6.3 Section Synthesis and Alignment with Proposed Artefact</w:t>
       </w:r>
@@ -5065,7 +8065,7 @@
           <w:rFonts w:ascii="Times New Roman" w:hAnsi="Times New Roman"/>
           <w:b/>
           <w:color w:val="1F497D"/>
-          <w:sz w:val="32"/>
+          <w:sz w:val="30"/>
         </w:rPr>
         <w:t>2.7 Infrastructure as Code (IaC) and Terraform Governance</w:t>
       </w:r>
@@ -5080,7 +8080,7 @@
           <w:rFonts w:ascii="Times New Roman" w:hAnsi="Times New Roman"/>
           <w:b/>
           <w:color w:val="366092"/>
-          <w:sz w:val="27"/>
+          <w:sz w:val="26"/>
         </w:rPr>
         <w:t>2.7.1 Declarative Infrastructure Management</w:t>
       </w:r>
@@ -5122,7 +8122,7 @@
           <w:rFonts w:ascii="Times New Roman" w:hAnsi="Times New Roman"/>
           <w:b/>
           <w:color w:val="366092"/>
-          <w:sz w:val="27"/>
+          <w:sz w:val="26"/>
         </w:rPr>
         <w:t>2.7.2 IaC Defect Analysis and Security Vulnerabilities</w:t>
       </w:r>
@@ -5272,7 +8272,7 @@
           <w:rFonts w:ascii="Times New Roman" w:hAnsi="Times New Roman"/>
           <w:b/>
           <w:color w:val="366092"/>
-          <w:sz w:val="27"/>
+          <w:sz w:val="26"/>
         </w:rPr>
         <w:t>2.7.3 Cross-Provider Dependency Management</w:t>
       </w:r>
@@ -5299,7 +8299,7 @@
           <w:rFonts w:ascii="Times New Roman" w:hAnsi="Times New Roman"/>
           <w:b/>
           <w:color w:val="366092"/>
-          <w:sz w:val="27"/>
+          <w:sz w:val="26"/>
         </w:rPr>
         <w:t>2.7.4 Section Synthesis and Alignment with Proposed Artefact</w:t>
       </w:r>
@@ -5462,7 +8462,7 @@
           <w:rFonts w:ascii="Times New Roman" w:hAnsi="Times New Roman"/>
           <w:b/>
           <w:color w:val="1F497D"/>
-          <w:sz w:val="32"/>
+          <w:sz w:val="30"/>
         </w:rPr>
         <w:t>2.8 Identity Federation and Multi-Cloud Access Governance</w:t>
       </w:r>
@@ -5477,7 +8477,7 @@
           <w:rFonts w:ascii="Times New Roman" w:hAnsi="Times New Roman"/>
           <w:b/>
           <w:color w:val="366092"/>
-          <w:sz w:val="27"/>
+          <w:sz w:val="26"/>
         </w:rPr>
         <w:t>2.8.1 Identity as the Primary Multi-Cloud Perimeter</w:t>
       </w:r>
@@ -5504,7 +8504,7 @@
           <w:rFonts w:ascii="Times New Roman" w:hAnsi="Times New Roman"/>
           <w:b/>
           <w:color w:val="366092"/>
-          <w:sz w:val="27"/>
+          <w:sz w:val="26"/>
         </w:rPr>
         <w:t>2.8.2 SAML 2.0 and SCIM Protocol Standards</w:t>
       </w:r>
@@ -5633,7 +8633,7 @@
           <w:rFonts w:ascii="Times New Roman" w:hAnsi="Times New Roman"/>
           <w:b/>
           <w:color w:val="366092"/>
-          <w:sz w:val="27"/>
+          <w:sz w:val="26"/>
         </w:rPr>
         <w:t>2.8.3 Alignment with Nigerian Data Protection Requirements</w:t>
       </w:r>
@@ -5675,7 +8675,7 @@
           <w:rFonts w:ascii="Times New Roman" w:hAnsi="Times New Roman"/>
           <w:b/>
           <w:color w:val="366092"/>
-          <w:sz w:val="27"/>
+          <w:sz w:val="26"/>
         </w:rPr>
         <w:t>2.8.4 Section Synthesis and Alignment with Proposed Artefact</w:t>
       </w:r>
@@ -5808,7 +8808,7 @@
           <w:rFonts w:ascii="Times New Roman" w:hAnsi="Times New Roman"/>
           <w:b/>
           <w:color w:val="1F497D"/>
-          <w:sz w:val="32"/>
+          <w:sz w:val="30"/>
         </w:rPr>
         <w:t>2.9 Observability, Telemetry, and Cloud Security Assessment</w:t>
       </w:r>
@@ -5823,7 +8823,7 @@
           <w:rFonts w:ascii="Times New Roman" w:hAnsi="Times New Roman"/>
           <w:b/>
           <w:color w:val="366092"/>
-          <w:sz w:val="27"/>
+          <w:sz w:val="26"/>
         </w:rPr>
         <w:t>2.9.1 Multi-Cloud Telemetry and Log Correlation</w:t>
       </w:r>
@@ -5906,7 +8906,7 @@
           <w:rFonts w:ascii="Times New Roman" w:hAnsi="Times New Roman"/>
           <w:b/>
           <w:color w:val="366092"/>
-          <w:sz w:val="27"/>
+          <w:sz w:val="26"/>
         </w:rPr>
         <w:t>2.9.2 Automated Posture Assessment: Prowler and ScoutSuite</w:t>
       </w:r>
@@ -5989,7 +8989,7 @@
           <w:rFonts w:ascii="Times New Roman" w:hAnsi="Times New Roman"/>
           <w:b/>
           <w:color w:val="366092"/>
-          <w:sz w:val="27"/>
+          <w:sz w:val="26"/>
         </w:rPr>
         <w:t>2.9.3 Section Synthesis and Alignment with Proposed Artefact</w:t>
       </w:r>
@@ -6062,7 +9062,7 @@
           <w:rFonts w:ascii="Times New Roman" w:hAnsi="Times New Roman"/>
           <w:b/>
           <w:color w:val="1F497D"/>
-          <w:sz w:val="32"/>
+          <w:sz w:val="30"/>
         </w:rPr>
         <w:t>2.10 Review of Recent Empirical Research (2022–2026)</w:t>
       </w:r>
@@ -6188,7 +9188,7 @@
           <w:rFonts w:ascii="Times New Roman" w:hAnsi="Times New Roman"/>
           <w:b/>
           <w:color w:val="1F497D"/>
-          <w:sz w:val="32"/>
+          <w:sz w:val="30"/>
         </w:rPr>
         <w:t>2.11 Review of Existing Solution Approaches</w:t>
       </w:r>
@@ -6266,7 +9266,7 @@
           <w:rFonts w:ascii="Times New Roman" w:hAnsi="Times New Roman"/>
           <w:b/>
           <w:color w:val="366092"/>
-          <w:sz w:val="27"/>
+          <w:sz w:val="26"/>
         </w:rPr>
         <w:t>2.11.1 Approach 1: Ad-Hoc Point-to-Point IPsec VPN</w:t>
       </w:r>
@@ -6363,7 +9363,7 @@
           <w:rFonts w:ascii="Times New Roman" w:hAnsi="Times New Roman"/>
           <w:b/>
           <w:color w:val="366092"/>
-          <w:sz w:val="27"/>
+          <w:sz w:val="26"/>
         </w:rPr>
         <w:t>2.11.2 Approach 2: Native Provider Hub-and-Spoke (AWS TGW + Azure VNG) [Selected]</w:t>
       </w:r>
@@ -6474,7 +9474,7 @@
           <w:rFonts w:ascii="Times New Roman" w:hAnsi="Times New Roman"/>
           <w:b/>
           <w:color w:val="366092"/>
-          <w:sz w:val="27"/>
+          <w:sz w:val="26"/>
         </w:rPr>
         <w:t>2.11.3 Approach 3: Dedicated Private Interconnect (AWS Direct Connect + Azure ExpressRoute)</w:t>
       </w:r>
@@ -6555,7 +9555,7 @@
           <w:rFonts w:ascii="Times New Roman" w:hAnsi="Times New Roman"/>
           <w:b/>
           <w:color w:val="366092"/>
-          <w:sz w:val="27"/>
+          <w:sz w:val="26"/>
         </w:rPr>
         <w:t>2.11.4 Approach 4: Third-Party Multi-Cloud Overlay (e.g., Aviatrix, Megaport)</w:t>
       </w:r>
@@ -6636,7 +9636,7 @@
           <w:rFonts w:ascii="Times New Roman" w:hAnsi="Times New Roman"/>
           <w:b/>
           <w:color w:val="366092"/>
-          <w:sz w:val="27"/>
+          <w:sz w:val="26"/>
         </w:rPr>
         <w:t>2.11.5 Approach 5: Service-Mesh Inter-Cloud (e.g., Istio / Linkerd Multi-Cluster)</w:t>
       </w:r>
@@ -6728,7 +9728,7 @@
           <w:rFonts w:ascii="Times New Roman" w:hAnsi="Times New Roman"/>
           <w:b/>
           <w:color w:val="1F497D"/>
-          <w:sz w:val="32"/>
+          <w:sz w:val="30"/>
         </w:rPr>
         <w:t>2.12 Critical Analysis of the Literature</w:t>
       </w:r>
@@ -6864,7 +9864,7 @@
           <w:rFonts w:ascii="Times New Roman" w:hAnsi="Times New Roman"/>
           <w:b/>
           <w:color w:val="1F497D"/>
-          <w:sz w:val="32"/>
+          <w:sz w:val="30"/>
         </w:rPr>
         <w:t>2.13 Gap Analysis</w:t>
       </w:r>
@@ -6879,7 +9879,7 @@
           <w:rFonts w:ascii="Times New Roman" w:hAnsi="Times New Roman"/>
           <w:b/>
           <w:color w:val="366092"/>
-          <w:sz w:val="27"/>
+          <w:sz w:val="26"/>
         </w:rPr>
         <w:t>2.13.1 Identification of Literature and Practical Gaps</w:t>
       </w:r>
@@ -7068,7 +10068,7 @@
           <w:rFonts w:ascii="Times New Roman" w:hAnsi="Times New Roman"/>
           <w:b/>
           <w:color w:val="366092"/>
-          <w:sz w:val="27"/>
+          <w:sz w:val="26"/>
         </w:rPr>
         <w:t>2.13.2 Consolidated Gap Matrix</w:t>
       </w:r>
@@ -7825,7 +10825,7 @@
           <w:rFonts w:ascii="Times New Roman" w:hAnsi="Times New Roman"/>
           <w:b/>
           <w:color w:val="366092"/>
-          <w:sz w:val="27"/>
+          <w:sz w:val="26"/>
         </w:rPr>
         <w:t>2.13.3 Research Gap Statement</w:t>
       </w:r>
@@ -7857,14 +10857,14 @@
     <w:p>
       <w:pPr>
         <w:keepNext/>
-        <w:spacing w:before="360" w:after="240"/>
+        <w:spacing w:before="400" w:after="240"/>
       </w:pPr>
       <w:r>
         <w:rPr>
           <w:rFonts w:ascii="Times New Roman" w:hAnsi="Times New Roman"/>
           <w:b/>
           <w:color w:val="1F497D"/>
-          <w:sz w:val="40"/>
+          <w:sz w:val="36"/>
         </w:rPr>
         <w:t>CHAPTER THREE: METHODOLOGY AND SYSTEM DESIGN</w:t>
       </w:r>
@@ -7879,7 +10879,7 @@
           <w:rFonts w:ascii="Times New Roman" w:hAnsi="Times New Roman"/>
           <w:b/>
           <w:color w:val="1F497D"/>
-          <w:sz w:val="32"/>
+          <w:sz w:val="30"/>
         </w:rPr>
         <w:t>3.0 Introduction</w:t>
       </w:r>
@@ -7944,7 +10944,7 @@
           <w:rFonts w:ascii="Times New Roman" w:hAnsi="Times New Roman"/>
           <w:b/>
           <w:color w:val="1F497D"/>
-          <w:sz w:val="32"/>
+          <w:sz w:val="30"/>
         </w:rPr>
         <w:t>3.1 Project Methodology</w:t>
       </w:r>
@@ -7959,7 +10959,7 @@
           <w:rFonts w:ascii="Times New Roman" w:hAnsi="Times New Roman"/>
           <w:b/>
           <w:color w:val="366092"/>
-          <w:sz w:val="27"/>
+          <w:sz w:val="26"/>
         </w:rPr>
         <w:t>3.1.1 Application of Design Science Research Methodology</w:t>
       </w:r>
@@ -8168,7 +11168,7 @@
           <w:rFonts w:ascii="Times New Roman" w:hAnsi="Times New Roman"/>
           <w:b/>
           <w:color w:val="1F497D"/>
-          <w:sz w:val="32"/>
+          <w:sz w:val="30"/>
         </w:rPr>
         <w:t>3.2 System Architecture and Design Planes</w:t>
       </w:r>
@@ -8398,7 +11398,7 @@
           <w:rFonts w:ascii="Times New Roman" w:hAnsi="Times New Roman"/>
           <w:b/>
           <w:color w:val="1F497D"/>
-          <w:sz w:val="32"/>
+          <w:sz w:val="30"/>
         </w:rPr>
         <w:t>3.3 Network Address Plan and Routing Design</w:t>
       </w:r>
@@ -9779,7 +12779,7 @@
           <w:rFonts w:ascii="Times New Roman" w:hAnsi="Times New Roman"/>
           <w:b/>
           <w:color w:val="366092"/>
-          <w:sz w:val="27"/>
+          <w:sz w:val="26"/>
         </w:rPr>
         <w:t>Inter-Cloud BGP Routing Strategy</w:t>
       </w:r>
@@ -9967,7 +12967,7 @@
           <w:rFonts w:ascii="Times New Roman" w:hAnsi="Times New Roman"/>
           <w:b/>
           <w:color w:val="1F497D"/>
-          <w:sz w:val="32"/>
+          <w:sz w:val="30"/>
         </w:rPr>
         <w:t>3.4 Micro-Segmentation and Traffic-Flow Matrix</w:t>
       </w:r>
@@ -11725,7 +14725,7 @@
           <w:rFonts w:ascii="Times New Roman" w:hAnsi="Times New Roman"/>
           <w:b/>
           <w:color w:val="1F497D"/>
-          <w:sz w:val="32"/>
+          <w:sz w:val="30"/>
         </w:rPr>
         <w:t>3.5 Test Harness and Performance/Resilience Design</w:t>
       </w:r>
@@ -11740,7 +14740,7 @@
           <w:rFonts w:ascii="Times New Roman" w:hAnsi="Times New Roman"/>
           <w:b/>
           <w:color w:val="366092"/>
-          <w:sz w:val="27"/>
+          <w:sz w:val="26"/>
         </w:rPr>
         <w:t>3.5.1 Latency &amp; Throughput Benchmark Harness</w:t>
       </w:r>
@@ -11814,7 +14814,7 @@
           <w:rFonts w:ascii="Times New Roman" w:hAnsi="Times New Roman"/>
           <w:b/>
           <w:color w:val="366092"/>
-          <w:sz w:val="27"/>
+          <w:sz w:val="26"/>
         </w:rPr>
         <w:t>3.5.2 Recovery Time Objective (RTO) Failover Formulation</w:t>
       </w:r>
@@ -11869,14 +14869,14 @@
     <w:p>
       <w:pPr>
         <w:keepNext/>
-        <w:spacing w:before="360" w:after="240"/>
+        <w:spacing w:before="400" w:after="240"/>
       </w:pPr>
       <w:r>
         <w:rPr>
           <w:rFonts w:ascii="Times New Roman" w:hAnsi="Times New Roman"/>
           <w:b/>
           <w:color w:val="1F497D"/>
-          <w:sz w:val="40"/>
+          <w:sz w:val="36"/>
         </w:rPr>
         <w:t>CHAPTER FOUR: SYSTEM IMPLEMENTATION</w:t>
       </w:r>
@@ -11891,7 +14891,7 @@
           <w:rFonts w:ascii="Times New Roman" w:hAnsi="Times New Roman"/>
           <w:b/>
           <w:color w:val="1F497D"/>
-          <w:sz w:val="32"/>
+          <w:sz w:val="30"/>
         </w:rPr>
         <w:t>4.0 Introduction</w:t>
       </w:r>
@@ -11944,7 +14944,7 @@
           <w:rFonts w:ascii="Times New Roman" w:hAnsi="Times New Roman"/>
           <w:b/>
           <w:color w:val="1F497D"/>
-          <w:sz w:val="32"/>
+          <w:sz w:val="30"/>
         </w:rPr>
         <w:t>4.1 Modular Terraform Codebase Architecture</w:t>
       </w:r>
@@ -12042,7 +15042,7 @@
           <w:rFonts w:ascii="Times New Roman" w:hAnsi="Times New Roman"/>
           <w:b/>
           <w:color w:val="1F497D"/>
-          <w:sz w:val="32"/>
+          <w:sz w:val="30"/>
         </w:rPr>
         <w:t>4.2 Key Terraform Module Implementation Code</w:t>
       </w:r>
@@ -12057,7 +15057,7 @@
           <w:rFonts w:ascii="Times New Roman" w:hAnsi="Times New Roman"/>
           <w:b/>
           <w:color w:val="366092"/>
-          <w:sz w:val="27"/>
+          <w:sz w:val="26"/>
         </w:rPr>
         <w:t>4.2.1 Remote State Bootstrap (`bootstrap/main.tf`)</w:t>
       </w:r>
@@ -12155,7 +15155,7 @@
           <w:rFonts w:ascii="Times New Roman" w:hAnsi="Times New Roman"/>
           <w:b/>
           <w:color w:val="366092"/>
-          <w:sz w:val="27"/>
+          <w:sz w:val="26"/>
         </w:rPr>
         <w:t>4.2.2 Inter-Cloud VPN Module (`infrastructure/modules/aws-vpn/main.tf`)</w:t>
       </w:r>
@@ -12271,7 +15271,7 @@
           <w:rFonts w:ascii="Times New Roman" w:hAnsi="Times New Roman"/>
           <w:b/>
           <w:color w:val="1F497D"/>
-          <w:sz w:val="32"/>
+          <w:sz w:val="30"/>
         </w:rPr>
         <w:t>4.3 Staged Deployment Procedure</w:t>
       </w:r>
@@ -12416,14 +15416,14 @@
     <w:p>
       <w:pPr>
         <w:keepNext/>
-        <w:spacing w:before="360" w:after="240"/>
+        <w:spacing w:before="400" w:after="240"/>
       </w:pPr>
       <w:r>
         <w:rPr>
           <w:rFonts w:ascii="Times New Roman" w:hAnsi="Times New Roman"/>
           <w:b/>
           <w:color w:val="1F497D"/>
-          <w:sz w:val="40"/>
+          <w:sz w:val="36"/>
         </w:rPr>
         <w:t>CHAPTER FIVE: TESTING, RESULTS AND EVALUATION</w:t>
       </w:r>
@@ -12438,7 +15438,7 @@
           <w:rFonts w:ascii="Times New Roman" w:hAnsi="Times New Roman"/>
           <w:b/>
           <w:color w:val="1F497D"/>
-          <w:sz w:val="32"/>
+          <w:sz w:val="30"/>
         </w:rPr>
         <w:t>5.0 Introduction</w:t>
       </w:r>
@@ -12476,7 +15476,7 @@
           <w:rFonts w:ascii="Times New Roman" w:hAnsi="Times New Roman"/>
           <w:b/>
           <w:color w:val="1F497D"/>
-          <w:sz w:val="32"/>
+          <w:sz w:val="30"/>
         </w:rPr>
         <w:t>5.1 Functional Testing Results</w:t>
       </w:r>
@@ -13667,7 +16667,7 @@
           <w:rFonts w:ascii="Times New Roman" w:hAnsi="Times New Roman"/>
           <w:b/>
           <w:color w:val="1F497D"/>
-          <w:sz w:val="32"/>
+          <w:sz w:val="30"/>
         </w:rPr>
         <w:t>5.2 Security Posture Assessment &amp; Segmentation Validation</w:t>
       </w:r>
@@ -13682,7 +16682,7 @@
           <w:rFonts w:ascii="Times New Roman" w:hAnsi="Times New Roman"/>
           <w:b/>
           <w:color w:val="366092"/>
-          <w:sz w:val="27"/>
+          <w:sz w:val="26"/>
         </w:rPr>
         <w:t>5.2.1 Traffic-Flow Matrix Negative Test Results</w:t>
       </w:r>
@@ -13866,7 +16866,7 @@
           <w:rFonts w:ascii="Times New Roman" w:hAnsi="Times New Roman"/>
           <w:b/>
           <w:color w:val="366092"/>
-          <w:sz w:val="27"/>
+          <w:sz w:val="26"/>
         </w:rPr>
         <w:t>5.2.2 Automated Posture Assessment: Prowler &amp; ScoutSuite Results</w:t>
       </w:r>
@@ -14022,7 +17022,7 @@
           <w:rFonts w:ascii="Times New Roman" w:hAnsi="Times New Roman"/>
           <w:b/>
           <w:color w:val="1F497D"/>
-          <w:sz w:val="32"/>
+          <w:sz w:val="30"/>
         </w:rPr>
         <w:t>5.3 Network Performance Evaluation</w:t>
       </w:r>
@@ -14037,7 +17037,7 @@
           <w:rFonts w:ascii="Times New Roman" w:hAnsi="Times New Roman"/>
           <w:b/>
           <w:color w:val="366092"/>
-          <w:sz w:val="27"/>
+          <w:sz w:val="26"/>
         </w:rPr>
         <w:t>5.3.1 Ping Round-Trip Latency Analysis</w:t>
       </w:r>
@@ -14167,7 +17167,7 @@
           <w:rFonts w:ascii="Times New Roman" w:hAnsi="Times New Roman"/>
           <w:b/>
           <w:color w:val="366092"/>
-          <w:sz w:val="27"/>
+          <w:sz w:val="26"/>
         </w:rPr>
         <w:t>5.3.2 iPerf3 TCP Throughput Benchmarking</w:t>
       </w:r>
@@ -15165,7 +18165,7 @@
           <w:rFonts w:ascii="Times New Roman" w:hAnsi="Times New Roman"/>
           <w:b/>
           <w:color w:val="1F497D"/>
-          <w:sz w:val="32"/>
+          <w:sz w:val="30"/>
         </w:rPr>
         <w:t>5.4 Failover and Resilience Evaluation</w:t>
       </w:r>
@@ -15357,7 +18357,7 @@
           <w:rFonts w:ascii="Times New Roman" w:hAnsi="Times New Roman"/>
           <w:b/>
           <w:color w:val="1F497D"/>
-          <w:sz w:val="32"/>
+          <w:sz w:val="30"/>
         </w:rPr>
         <w:t>5.5 Overall Evaluation against Project Objectives</w:t>
       </w:r>
@@ -16055,14 +19055,14 @@
     <w:p>
       <w:pPr>
         <w:keepNext/>
-        <w:spacing w:before="360" w:after="240"/>
+        <w:spacing w:before="400" w:after="240"/>
       </w:pPr>
       <w:r>
         <w:rPr>
           <w:rFonts w:ascii="Times New Roman" w:hAnsi="Times New Roman"/>
           <w:b/>
           <w:color w:val="1F497D"/>
-          <w:sz w:val="40"/>
+          <w:sz w:val="36"/>
         </w:rPr>
         <w:t>CHAPTER SIX: SUMMARY, CONCLUSION AND RECOMMENDATIONS</w:t>
       </w:r>
@@ -16077,7 +19077,7 @@
           <w:rFonts w:ascii="Times New Roman" w:hAnsi="Times New Roman"/>
           <w:b/>
           <w:color w:val="1F497D"/>
-          <w:sz w:val="32"/>
+          <w:sz w:val="30"/>
         </w:rPr>
         <w:t>6.0 Introduction</w:t>
       </w:r>
@@ -16115,7 +19115,7 @@
           <w:rFonts w:ascii="Times New Roman" w:hAnsi="Times New Roman"/>
           <w:b/>
           <w:color w:val="1F497D"/>
-          <w:sz w:val="32"/>
+          <w:sz w:val="30"/>
         </w:rPr>
         <w:t>6.1 Summary of the Completed Project</w:t>
       </w:r>
@@ -16368,7 +19368,7 @@
           <w:rFonts w:ascii="Times New Roman" w:hAnsi="Times New Roman"/>
           <w:b/>
           <w:color w:val="1F497D"/>
-          <w:sz w:val="32"/>
+          <w:sz w:val="30"/>
         </w:rPr>
         <w:t>6.2 Professional Contributions of the Project</w:t>
       </w:r>
@@ -16504,7 +19504,7 @@
           <w:rFonts w:ascii="Times New Roman" w:hAnsi="Times New Roman"/>
           <w:b/>
           <w:color w:val="1F497D"/>
-          <w:sz w:val="32"/>
+          <w:sz w:val="30"/>
         </w:rPr>
         <w:t>6.3 Practical Recommendations for Nigerian Enterprises</w:t>
       </w:r>
@@ -16519,7 +19519,7 @@
           <w:rFonts w:ascii="Times New Roman" w:hAnsi="Times New Roman"/>
           <w:b/>
           <w:color w:val="366092"/>
-          <w:sz w:val="27"/>
+          <w:sz w:val="26"/>
         </w:rPr>
         <w:t>6.3.1 Implementation Roadmap for Multi-Cloud Adoption</w:t>
       </w:r>
@@ -16736,7 +19736,7 @@
           <w:rFonts w:ascii="Times New Roman" w:hAnsi="Times New Roman"/>
           <w:b/>
           <w:color w:val="1F497D"/>
-          <w:sz w:val="32"/>
+          <w:sz w:val="30"/>
         </w:rPr>
         <w:t>6.4 Recommendations for Future Enhancements</w:t>
       </w:r>
@@ -16850,7 +19850,7 @@
           <w:rFonts w:ascii="Times New Roman" w:hAnsi="Times New Roman"/>
           <w:b/>
           <w:color w:val="1F497D"/>
-          <w:sz w:val="32"/>
+          <w:sz w:val="30"/>
         </w:rPr>
         <w:t>6.5 Final Conclusion</w:t>
       </w:r>

</xml_diff>

<commit_message>
Embed 14 high-resolution diagram PNG images into final_year.docx and repository
</commit_message>
<xml_diff>
--- a/final_year.docx
+++ b/final_year.docx
@@ -3752,84 +3752,49 @@
     </w:p>
     <w:p>
       <w:pPr>
-        <w:spacing w:before="120" w:after="120"/>
-        <w:ind w:left="576" w:right="576"/>
-      </w:pPr>
-      <w:r>
-        <w:rPr>
-          <w:rFonts w:ascii="Consolas" w:hAnsi="Consolas"/>
-          <w:color w:val="1F2937"/>
-          <w:sz w:val="19"/>
-        </w:rPr>
-        <w:t>flowchart TD</w:t>
-        <w:br/>
-        <w:t xml:space="preserve">    subgraph Drivers ["1. Drivers &amp; Context"]</w:t>
-        <w:br/>
-        <w:t xml:space="preserve">        A1[Multi-Cloud Challenges: Network, Identity, Governance]</w:t>
-        <w:br/>
-        <w:t xml:space="preserve">        A2[Nigerian Policy: National Cloud Policy 2025, NDPA 2023]</w:t>
-        <w:br/>
-        <w:t xml:space="preserve">        A3[Security Frameworks: NIST SP 800-207, CSA CCM v4.1]</w:t>
-        <w:br/>
-        <w:t xml:space="preserve">    end</w:t>
-        <w:br/>
-        <w:br/>
-        <w:t xml:space="preserve">    subgraph Architecture ["2. Secure AWS-Azure Architecture"]</w:t>
-        <w:br/>
-        <w:t xml:space="preserve">        B1[AWS Hub: VPC + Transit Gateway]</w:t>
-        <w:br/>
-        <w:t xml:space="preserve">        B2[Azure Hub: Hub VNet + VPN Gateway]</w:t>
-        <w:br/>
-        <w:t xml:space="preserve">        B3[Inter-Cloud Path: Encrypted Route-Based IPsec VPN + BGP]</w:t>
-        <w:br/>
-        <w:t xml:space="preserve">        B4[Zero Trust Controls: Micro-segmentation &amp; Entra Federation]</w:t>
-        <w:br/>
-        <w:t xml:space="preserve">    end</w:t>
-        <w:br/>
-        <w:br/>
-        <w:t xml:space="preserve">    subgraph Automation ["3. Automated Implementation"]</w:t>
-        <w:br/>
-        <w:t xml:space="preserve">        C1[Modular Terraform Codebase]</w:t>
-        <w:br/>
-        <w:t xml:space="preserve">        C2[Staged Provisioning &amp; State Management]</w:t>
-        <w:br/>
-        <w:t xml:space="preserve">        C3[3-Tier Workload &amp; Observability Stack]</w:t>
-        <w:br/>
-        <w:t xml:space="preserve">    end</w:t>
-        <w:br/>
-        <w:br/>
-        <w:t xml:space="preserve">    subgraph Evaluation ["4. Empirical Evaluation"]</w:t>
-        <w:br/>
-        <w:t xml:space="preserve">        D1[Security Scans: Prowler &amp; ScoutSuite]</w:t>
-        <w:br/>
-        <w:t xml:space="preserve">        D2[Network Tests: Latency, Throughput &amp; Flow Matrix Validation]</w:t>
-        <w:br/>
-        <w:t xml:space="preserve">        D3[Resilience Tests: Simulated Tunnel Failover &amp; RTO Measurement]</w:t>
-        <w:br/>
-        <w:t xml:space="preserve">    end</w:t>
-        <w:br/>
-        <w:br/>
-        <w:t xml:space="preserve">    subgraph Output ["5. Validated Reference Artefact"]</w:t>
-        <w:br/>
-        <w:t xml:space="preserve">        E1[Implementation-Ready AWS-Azure Architecture]</w:t>
-        <w:br/>
-        <w:t xml:space="preserve">    end</w:t>
-        <w:br/>
-        <w:br/>
-        <w:t xml:space="preserve">    Drivers --&gt; Architecture</w:t>
-        <w:br/>
-        <w:t xml:space="preserve">    Architecture --&gt; Automation</w:t>
-        <w:br/>
-        <w:t xml:space="preserve">    Automation --&gt; Evaluation</w:t>
-        <w:br/>
-        <w:t xml:space="preserve">    Evaluation -- "Feedback Loop &amp; Corrective Actions" --&gt; Architecture</w:t>
-        <w:br/>
-        <w:t xml:space="preserve">    Evaluation --&gt; Output</w:t>
+        <w:keepNext/>
+        <w:spacing w:before="240" w:after="80"/>
+        <w:jc w:val="center"/>
+      </w:pPr>
+      <w:r>
+        <w:drawing>
+          <wp:inline xmlns:a="http://schemas.openxmlformats.org/drawingml/2006/main" xmlns:pic="http://schemas.openxmlformats.org/drawingml/2006/picture">
+            <wp:extent cx="5486400" cy="3269673"/>
+            <wp:docPr id="1" name="Picture 1"/>
+            <wp:cNvGraphicFramePr>
+              <a:graphicFrameLocks noChangeAspect="1"/>
+            </wp:cNvGraphicFramePr>
+            <a:graphic>
+              <a:graphicData uri="http://schemas.openxmlformats.org/drawingml/2006/picture">
+                <pic:pic>
+                  <pic:nvPicPr>
+                    <pic:cNvPr id="0" name="fig1_1_conceptual_framework.png"/>
+                    <pic:cNvPicPr/>
+                  </pic:nvPicPr>
+                  <pic:blipFill>
+                    <a:blip r:embed="rId9"/>
+                    <a:stretch>
+                      <a:fillRect/>
+                    </a:stretch>
+                  </pic:blipFill>
+                  <pic:spPr>
+                    <a:xfrm>
+                      <a:off x="0" y="0"/>
+                      <a:ext cx="5486400" cy="3269673"/>
+                    </a:xfrm>
+                    <a:prstGeom prst="rect"/>
+                  </pic:spPr>
+                </pic:pic>
+              </a:graphicData>
+            </a:graphic>
+          </wp:inline>
+        </w:drawing>
       </w:r>
     </w:p>
     <w:p>
       <w:pPr>
         <w:spacing w:after="120" w:line="300" w:lineRule="auto"/>
+        <w:jc w:val="center"/>
       </w:pPr>
       <w:r>
         <w:rPr>
@@ -4959,60 +4924,49 @@
     </w:p>
     <w:p>
       <w:pPr>
-        <w:spacing w:before="120" w:after="120"/>
-        <w:ind w:left="576" w:right="576"/>
-      </w:pPr>
-      <w:r>
-        <w:rPr>
-          <w:rFonts w:ascii="Consolas" w:hAnsi="Consolas"/>
-          <w:color w:val="1F2937"/>
-          <w:sz w:val="19"/>
-        </w:rPr>
-        <w:t>flowchart LR</w:t>
-        <w:br/>
-        <w:t xml:space="preserve">    subgraph Regulatory ["Nigerian Regulatory Drivers"]</w:t>
-        <w:br/>
-        <w:t xml:space="preserve">        R1[NDPA 2023 &amp; NDPC GAID 2025]</w:t>
-        <w:br/>
-        <w:t xml:space="preserve">        R2[National Cloud Policy 2025]</w:t>
-        <w:br/>
-        <w:t xml:space="preserve">    end</w:t>
-        <w:br/>
-        <w:br/>
-        <w:t xml:space="preserve">    subgraph ArchitectureControls ["Multi-Cloud Architectural Controls"]</w:t>
-        <w:br/>
-        <w:t xml:space="preserve">        C1[Data Residency &amp; Regional Placement]</w:t>
-        <w:br/>
-        <w:t xml:space="preserve">        C2[Cross-Border Inter-Cloud IPsec Encryption]</w:t>
-        <w:br/>
-        <w:t xml:space="preserve">        C3[Least-Privilege Identity &amp; Audit Trail]</w:t>
-        <w:br/>
-        <w:t xml:space="preserve">    end</w:t>
-        <w:br/>
-        <w:br/>
-        <w:t xml:space="preserve">    subgraph CloudProviders ["Heterogeneous Cloud Platforms"]</w:t>
-        <w:br/>
-        <w:t xml:space="preserve">        P1[AWS Environment: VPC / TGW / KMS]</w:t>
-        <w:br/>
-        <w:t xml:space="preserve">        P2[Azure Environment: VNet / VNG / Key Vault]</w:t>
-        <w:br/>
-        <w:t xml:space="preserve">    end</w:t>
-        <w:br/>
-        <w:br/>
-        <w:t xml:space="preserve">    R1 --&gt; C2 &amp; C3</w:t>
-        <w:br/>
-        <w:t xml:space="preserve">    R2 --&gt; C1 &amp; C3</w:t>
-        <w:br/>
-        <w:t xml:space="preserve">    C1 --&gt; P1 &amp; P2</w:t>
-        <w:br/>
-        <w:t xml:space="preserve">    C2 --&gt; P1 &amp; P2</w:t>
-        <w:br/>
-        <w:t xml:space="preserve">    C3 --&gt; P1 &amp; P2</w:t>
+        <w:keepNext/>
+        <w:spacing w:before="240" w:after="80"/>
+        <w:jc w:val="center"/>
+      </w:pPr>
+      <w:r>
+        <w:drawing>
+          <wp:inline xmlns:a="http://schemas.openxmlformats.org/drawingml/2006/main" xmlns:pic="http://schemas.openxmlformats.org/drawingml/2006/picture">
+            <wp:extent cx="5486400" cy="3093619"/>
+            <wp:docPr id="2" name="Picture 2"/>
+            <wp:cNvGraphicFramePr>
+              <a:graphicFrameLocks noChangeAspect="1"/>
+            </wp:cNvGraphicFramePr>
+            <a:graphic>
+              <a:graphicData uri="http://schemas.openxmlformats.org/drawingml/2006/picture">
+                <pic:pic>
+                  <pic:nvPicPr>
+                    <pic:cNvPr id="0" name="fig2_1_regulatory_framework.png"/>
+                    <pic:cNvPicPr/>
+                  </pic:nvPicPr>
+                  <pic:blipFill>
+                    <a:blip r:embed="rId10"/>
+                    <a:stretch>
+                      <a:fillRect/>
+                    </a:stretch>
+                  </pic:blipFill>
+                  <pic:spPr>
+                    <a:xfrm>
+                      <a:off x="0" y="0"/>
+                      <a:ext cx="5486400" cy="3093619"/>
+                    </a:xfrm>
+                    <a:prstGeom prst="rect"/>
+                  </pic:spPr>
+                </pic:pic>
+              </a:graphicData>
+            </a:graphic>
+          </wp:inline>
+        </w:drawing>
       </w:r>
     </w:p>
     <w:p>
       <w:pPr>
         <w:spacing w:after="120" w:line="300" w:lineRule="auto"/>
+        <w:jc w:val="center"/>
       </w:pPr>
       <w:r>
         <w:rPr>
@@ -6634,61 +6588,49 @@
     </w:p>
     <w:p>
       <w:pPr>
-        <w:spacing w:before="120" w:after="120"/>
-        <w:ind w:left="576" w:right="576"/>
-      </w:pPr>
-      <w:r>
-        <w:rPr>
-          <w:rFonts w:ascii="Consolas" w:hAnsi="Consolas"/>
-          <w:color w:val="1F2937"/>
-          <w:sz w:val="19"/>
-        </w:rPr>
-        <w:t>flowchart LR</w:t>
-        <w:br/>
-        <w:t xml:space="preserve">    subgraph AWS_Cloud ["AWS Environment (ASN 64512)"]</w:t>
-        <w:br/>
-        <w:t xml:space="preserve">        TGW[AWS Transit Gateway]</w:t>
-        <w:br/>
-        <w:t xml:space="preserve">        VPC[AWS Workload VPC]</w:t>
-        <w:br/>
-        <w:t xml:space="preserve">        TGW --- VPC</w:t>
-        <w:br/>
-        <w:t xml:space="preserve">    end</w:t>
-        <w:br/>
-        <w:br/>
-        <w:t xml:space="preserve">    subgraph Azure_Cloud ["Azure Environment (ASN 65515)"]</w:t>
-        <w:br/>
-        <w:t xml:space="preserve">        VNG[Azure Active-Active VPN Gateway]</w:t>
-        <w:br/>
-        <w:t xml:space="preserve">        VNet[Azure Hub VNet]</w:t>
-        <w:br/>
-        <w:t xml:space="preserve">        VNG --- VNet</w:t>
-        <w:br/>
-        <w:t xml:space="preserve">    end</w:t>
-        <w:br/>
-        <w:br/>
-        <w:t xml:space="preserve">    subgraph IPsec_Tunnels ["Encrypted Inter-Cloud Transport"]</w:t>
-        <w:br/>
-        <w:t xml:space="preserve">        T1["IPsec Tunnel 1 (Primary BGP Route)"]</w:t>
-        <w:br/>
-        <w:t xml:space="preserve">        T2["IPsec Tunnel 2 (Secondary/Redundant BGP Route)"]</w:t>
-        <w:br/>
-        <w:t xml:space="preserve">    end</w:t>
-        <w:br/>
-        <w:br/>
-        <w:t xml:space="preserve">    TGW &lt;==&gt; T1 &lt;==&gt; VNG</w:t>
-        <w:br/>
-        <w:t xml:space="preserve">    TGW &lt;==&gt; T2 &lt;==&gt; VNG</w:t>
-        <w:br/>
-        <w:br/>
-        <w:t xml:space="preserve">    style T1 stroke:#2b8a3e,stroke-width:2px;</w:t>
-        <w:br/>
-        <w:t xml:space="preserve">    style T2 stroke:#2b8a3e,stroke-width:2px;</w:t>
+        <w:keepNext/>
+        <w:spacing w:before="240" w:after="80"/>
+        <w:jc w:val="center"/>
+      </w:pPr>
+      <w:r>
+        <w:drawing>
+          <wp:inline xmlns:a="http://schemas.openxmlformats.org/drawingml/2006/main" xmlns:pic="http://schemas.openxmlformats.org/drawingml/2006/picture">
+            <wp:extent cx="5486400" cy="2992582"/>
+            <wp:docPr id="3" name="Picture 3"/>
+            <wp:cNvGraphicFramePr>
+              <a:graphicFrameLocks noChangeAspect="1"/>
+            </wp:cNvGraphicFramePr>
+            <a:graphic>
+              <a:graphicData uri="http://schemas.openxmlformats.org/drawingml/2006/picture">
+                <pic:pic>
+                  <pic:nvPicPr>
+                    <pic:cNvPr id="0" name="fig2_2_intercloud_topology.png"/>
+                    <pic:cNvPicPr/>
+                  </pic:nvPicPr>
+                  <pic:blipFill>
+                    <a:blip r:embed="rId11"/>
+                    <a:stretch>
+                      <a:fillRect/>
+                    </a:stretch>
+                  </pic:blipFill>
+                  <pic:spPr>
+                    <a:xfrm>
+                      <a:off x="0" y="0"/>
+                      <a:ext cx="5486400" cy="2992582"/>
+                    </a:xfrm>
+                    <a:prstGeom prst="rect"/>
+                  </pic:spPr>
+                </pic:pic>
+              </a:graphicData>
+            </a:graphic>
+          </wp:inline>
+        </w:drawing>
       </w:r>
     </w:p>
     <w:p>
       <w:pPr>
         <w:spacing w:after="120" w:line="300" w:lineRule="auto"/>
+        <w:jc w:val="center"/>
       </w:pPr>
       <w:r>
         <w:rPr>
@@ -7034,67 +6976,49 @@
     </w:p>
     <w:p>
       <w:pPr>
-        <w:spacing w:before="120" w:after="120"/>
-        <w:ind w:left="576" w:right="576"/>
-      </w:pPr>
-      <w:r>
-        <w:rPr>
-          <w:rFonts w:ascii="Consolas" w:hAnsi="Consolas"/>
-          <w:color w:val="1F2937"/>
-          <w:sz w:val="19"/>
-        </w:rPr>
-        <w:t>flowchart TD</w:t>
-        <w:br/>
-        <w:t xml:space="preserve">    subgraph ControlPlane ["Zero Trust Control Plane (Policy Engine &amp; Administrator)"]</w:t>
-        <w:br/>
-        <w:t xml:space="preserve">        Entra[Microsoft Entra ID / Conditional Access]</w:t>
-        <w:br/>
-        <w:t xml:space="preserve">        AWS_IdC[AWS IAM Identity Center / IAM Policies]</w:t>
-        <w:br/>
-        <w:t xml:space="preserve">    end</w:t>
-        <w:br/>
-        <w:br/>
-        <w:t xml:space="preserve">    subgraph Telemetry ["Continuous Diagnostics &amp; Context"]</w:t>
-        <w:br/>
-        <w:t xml:space="preserve">        Logs[CloudTrail, Activity Logs, VPC Flow Logs, GuardDuty, Defender]</w:t>
-        <w:br/>
-        <w:t xml:space="preserve">    end</w:t>
-        <w:br/>
-        <w:br/>
-        <w:t xml:space="preserve">    subgraph EnforcementPlane ["Policy Enforcement Points (PEPs)"]</w:t>
-        <w:br/>
-        <w:t xml:space="preserve">        PEP1[AWS Security Groups &amp; NACLs]</w:t>
-        <w:br/>
-        <w:t xml:space="preserve">        PEP2[Azure Network Security Groups]</w:t>
-        <w:br/>
-        <w:t xml:space="preserve">        PEP3[Inter-Cloud IPsec VPN Gateway]</w:t>
-        <w:br/>
-        <w:t xml:space="preserve">    end</w:t>
-        <w:br/>
-        <w:br/>
-        <w:t xml:space="preserve">    subgraph Resources ["Enterprise Workload Tiers"]</w:t>
-        <w:br/>
-        <w:t xml:space="preserve">        Web[AWS Web Tier]</w:t>
-        <w:br/>
-        <w:t xml:space="preserve">        App[AWS App Tier]</w:t>
-        <w:br/>
-        <w:t xml:space="preserve">        DB[(AWS Database Tier)]</w:t>
-        <w:br/>
-        <w:t xml:space="preserve">        AzApp[Azure Supporting Service]</w:t>
-        <w:br/>
-        <w:t xml:space="preserve">    end</w:t>
-        <w:br/>
-        <w:br/>
-        <w:t xml:space="preserve">    Entra &amp; AWS_IdC --&gt; EnforcementPlane</w:t>
-        <w:br/>
-        <w:t xml:space="preserve">    Telemetry --&gt; ControlPlane</w:t>
-        <w:br/>
-        <w:t xml:space="preserve">    EnforcementPlane --&gt; |"Filter &amp; Authorise"| Web &amp; App &amp; DB &amp; AzApp</w:t>
+        <w:keepNext/>
+        <w:spacing w:before="240" w:after="80"/>
+        <w:jc w:val="center"/>
+      </w:pPr>
+      <w:r>
+        <w:drawing>
+          <wp:inline xmlns:a="http://schemas.openxmlformats.org/drawingml/2006/main" xmlns:pic="http://schemas.openxmlformats.org/drawingml/2006/picture">
+            <wp:extent cx="5486400" cy="2992582"/>
+            <wp:docPr id="4" name="Picture 4"/>
+            <wp:cNvGraphicFramePr>
+              <a:graphicFrameLocks noChangeAspect="1"/>
+            </wp:cNvGraphicFramePr>
+            <a:graphic>
+              <a:graphicData uri="http://schemas.openxmlformats.org/drawingml/2006/picture">
+                <pic:pic>
+                  <pic:nvPicPr>
+                    <pic:cNvPr id="0" name="fig2_3_zerotrust_planes.png"/>
+                    <pic:cNvPicPr/>
+                  </pic:nvPicPr>
+                  <pic:blipFill>
+                    <a:blip r:embed="rId12"/>
+                    <a:stretch>
+                      <a:fillRect/>
+                    </a:stretch>
+                  </pic:blipFill>
+                  <pic:spPr>
+                    <a:xfrm>
+                      <a:off x="0" y="0"/>
+                      <a:ext cx="5486400" cy="2992582"/>
+                    </a:xfrm>
+                    <a:prstGeom prst="rect"/>
+                  </pic:spPr>
+                </pic:pic>
+              </a:graphicData>
+            </a:graphic>
+          </wp:inline>
+        </w:drawing>
       </w:r>
     </w:p>
     <w:p>
       <w:pPr>
         <w:spacing w:after="120" w:line="300" w:lineRule="auto"/>
+        <w:jc w:val="center"/>
       </w:pPr>
       <w:r>
         <w:rPr>
@@ -8567,52 +8491,49 @@
     </w:p>
     <w:p>
       <w:pPr>
-        <w:spacing w:before="120" w:after="120"/>
-        <w:ind w:left="576" w:right="576"/>
-      </w:pPr>
-      <w:r>
-        <w:rPr>
-          <w:rFonts w:ascii="Consolas" w:hAnsi="Consolas"/>
-          <w:color w:val="1F2937"/>
-          <w:sz w:val="19"/>
-        </w:rPr>
-        <w:t>sequenceDiagram</w:t>
-        <w:br/>
-        <w:t xml:space="preserve">    autonumber</w:t>
-        <w:br/>
-        <w:t xml:space="preserve">    actor Admin as Cloud Administrator</w:t>
-        <w:br/>
-        <w:t xml:space="preserve">    participant Entra as Microsoft Entra ID (IdP)</w:t>
-        <w:br/>
-        <w:t xml:space="preserve">    participant AWS_IdC as AWS IAM Identity Center (SP)</w:t>
-        <w:br/>
-        <w:t xml:space="preserve">    participant AWS_STS as AWS Security Token Service</w:t>
-        <w:br/>
-        <w:t xml:space="preserve">    participant AWS_Console as AWS Management Console</w:t>
-        <w:br/>
-        <w:br/>
-        <w:t xml:space="preserve">    Admin -&gt;&gt; AWS_Console: Initiate login request</w:t>
-        <w:br/>
-        <w:t xml:space="preserve">    AWS_Console -&gt;&gt; AWS_IdC: Redirect to Identity Broker</w:t>
-        <w:br/>
-        <w:t xml:space="preserve">    AWS_IdC -&gt;&gt; Entra: SAML Auth Request (Redirect)</w:t>
-        <w:br/>
-        <w:t xml:space="preserve">    Entra -&gt;&gt; Admin: Prompt Credentials + MFA</w:t>
-        <w:br/>
-        <w:t xml:space="preserve">    Admin -&gt;&gt; Entra: Submit MFA Response</w:t>
-        <w:br/>
-        <w:t xml:space="preserve">    Entra -&gt;&gt; AWS_IdC: Return Signed SAML Assertion</w:t>
-        <w:br/>
-        <w:t xml:space="preserve">    AWS_IdC -&gt;&gt; AWS_STS: Request Temporary Session Tokens</w:t>
-        <w:br/>
-        <w:t xml:space="preserve">    AWS_STS --&gt;&gt; AWS_IdC: Issue Short-Lived Credentials</w:t>
-        <w:br/>
-        <w:t xml:space="preserve">    AWS_IdC --&gt;&gt; Admin: Grant Console Access with Assumed Role</w:t>
+        <w:keepNext/>
+        <w:spacing w:before="240" w:after="80"/>
+        <w:jc w:val="center"/>
+      </w:pPr>
+      <w:r>
+        <w:drawing>
+          <wp:inline xmlns:a="http://schemas.openxmlformats.org/drawingml/2006/main" xmlns:pic="http://schemas.openxmlformats.org/drawingml/2006/picture">
+            <wp:extent cx="5486400" cy="2992582"/>
+            <wp:docPr id="5" name="Picture 5"/>
+            <wp:cNvGraphicFramePr>
+              <a:graphicFrameLocks noChangeAspect="1"/>
+            </wp:cNvGraphicFramePr>
+            <a:graphic>
+              <a:graphicData uri="http://schemas.openxmlformats.org/drawingml/2006/picture">
+                <pic:pic>
+                  <pic:nvPicPr>
+                    <pic:cNvPr id="0" name="fig2_4_saml_federation.png"/>
+                    <pic:cNvPicPr/>
+                  </pic:nvPicPr>
+                  <pic:blipFill>
+                    <a:blip r:embed="rId13"/>
+                    <a:stretch>
+                      <a:fillRect/>
+                    </a:stretch>
+                  </pic:blipFill>
+                  <pic:spPr>
+                    <a:xfrm>
+                      <a:off x="0" y="0"/>
+                      <a:ext cx="5486400" cy="2992582"/>
+                    </a:xfrm>
+                    <a:prstGeom prst="rect"/>
+                  </pic:spPr>
+                </pic:pic>
+              </a:graphicData>
+            </a:graphic>
+          </wp:inline>
+        </w:drawing>
       </w:r>
     </w:p>
     <w:p>
       <w:pPr>
         <w:spacing w:after="120" w:line="300" w:lineRule="auto"/>
+        <w:jc w:val="center"/>
       </w:pPr>
       <w:r>
         <w:rPr>
@@ -9207,45 +9128,49 @@
     </w:p>
     <w:p>
       <w:pPr>
-        <w:spacing w:before="120" w:after="120"/>
-        <w:ind w:left="576" w:right="576"/>
-      </w:pPr>
-      <w:r>
-        <w:rPr>
-          <w:rFonts w:ascii="Consolas" w:hAnsi="Consolas"/>
-          <w:color w:val="1F2937"/>
-          <w:sz w:val="19"/>
-        </w:rPr>
-        <w:t>quadrantChart</w:t>
-        <w:br/>
-        <w:t xml:space="preserve">    title Solution Approach Comparison: Security vs Implementation Feasibility</w:t>
-        <w:br/>
-        <w:t xml:space="preserve">    x-axis Low Feasibility / High Cost --&gt; High Feasibility / Lab Proportionate</w:t>
-        <w:br/>
-        <w:t xml:space="preserve">    y-axis Low Security Consistency --&gt; High Security Consistency</w:t>
-        <w:br/>
-        <w:t xml:space="preserve">    quadrant-1 Selected Native Hub-Spoke</w:t>
-        <w:br/>
-        <w:t xml:space="preserve">    quadrant-2 Production Dedicated Interconnect</w:t>
-        <w:br/>
-        <w:t xml:space="preserve">    quadrant-3 Ad-hoc Point-to-Point VPN</w:t>
-        <w:br/>
-        <w:t xml:space="preserve">    quadrant-4 Third-Party Overlay / Service Mesh</w:t>
-        <w:br/>
-        <w:t xml:space="preserve">    Ad-hoc Point-to-Point VPN: [0.8, 0.2]</w:t>
-        <w:br/>
-        <w:t xml:space="preserve">    Selected Native Hub-Spoke: [0.75, 0.82]</w:t>
-        <w:br/>
-        <w:t xml:space="preserve">    Production Dedicated Interconnect: [0.25, 0.88]</w:t>
-        <w:br/>
-        <w:t xml:space="preserve">    Third-Party Overlay MCN: [0.4, 0.75]</w:t>
-        <w:br/>
-        <w:t xml:space="preserve">    Service Mesh Inter-Cloud: [0.3, 0.65]</w:t>
+        <w:keepNext/>
+        <w:spacing w:before="240" w:after="80"/>
+        <w:jc w:val="center"/>
+      </w:pPr>
+      <w:r>
+        <w:drawing>
+          <wp:inline xmlns:a="http://schemas.openxmlformats.org/drawingml/2006/main" xmlns:pic="http://schemas.openxmlformats.org/drawingml/2006/picture">
+            <wp:extent cx="5486400" cy="4148196"/>
+            <wp:docPr id="6" name="Picture 6"/>
+            <wp:cNvGraphicFramePr>
+              <a:graphicFrameLocks noChangeAspect="1"/>
+            </wp:cNvGraphicFramePr>
+            <a:graphic>
+              <a:graphicData uri="http://schemas.openxmlformats.org/drawingml/2006/picture">
+                <pic:pic>
+                  <pic:nvPicPr>
+                    <pic:cNvPr id="0" name="fig2_5_solution_quadrant.png"/>
+                    <pic:cNvPicPr/>
+                  </pic:nvPicPr>
+                  <pic:blipFill>
+                    <a:blip r:embed="rId14"/>
+                    <a:stretch>
+                      <a:fillRect/>
+                    </a:stretch>
+                  </pic:blipFill>
+                  <pic:spPr>
+                    <a:xfrm>
+                      <a:off x="0" y="0"/>
+                      <a:ext cx="5486400" cy="4148196"/>
+                    </a:xfrm>
+                    <a:prstGeom prst="rect"/>
+                  </pic:spPr>
+                </pic:pic>
+              </a:graphicData>
+            </a:graphic>
+          </wp:inline>
+        </w:drawing>
       </w:r>
     </w:p>
     <w:p>
       <w:pPr>
         <w:spacing w:after="120" w:line="300" w:lineRule="auto"/>
+        <w:jc w:val="center"/>
       </w:pPr>
       <w:r>
         <w:rPr>
@@ -10978,33 +10903,49 @@
     </w:p>
     <w:p>
       <w:pPr>
-        <w:spacing w:before="120" w:after="120"/>
-        <w:ind w:left="576" w:right="576"/>
-      </w:pPr>
-      <w:r>
-        <w:rPr>
-          <w:rFonts w:ascii="Consolas" w:hAnsi="Consolas"/>
-          <w:color w:val="1F2937"/>
-          <w:sz w:val="19"/>
-        </w:rPr>
-        <w:t>flowchart LR</w:t>
-        <w:br/>
-        <w:t xml:space="preserve">    P1["1. Problem Identification&lt;br/&gt;(Ad-hoc Multi-Cloud Risks)"] --&gt; P2["2. Solution Objectives&lt;br/&gt;(Security, Performance, RTO)"]</w:t>
-        <w:br/>
-        <w:t xml:space="preserve">    P2 --&gt; P3["3. Design &amp; Development&lt;br/&gt;(Hub-Spoke, Zero Trust, IaC)"]</w:t>
-        <w:br/>
-        <w:t xml:space="preserve">    P3 --&gt; P4["4. Demonstration&lt;br/&gt;(Terraform Deployment)"]</w:t>
-        <w:br/>
-        <w:t xml:space="preserve">    P4 --&gt; P5["5. Evaluation&lt;br/&gt;(Prowler, iPerf3, Failover)"]</w:t>
-        <w:br/>
-        <w:t xml:space="preserve">    P5 --&gt; P6["6. Communication&lt;br/&gt;(Thesis &amp; Artifacts)"]</w:t>
-        <w:br/>
-        <w:t xml:space="preserve">    P5 -- "Iterative Feedback Loop" --&gt; P3</w:t>
+        <w:keepNext/>
+        <w:spacing w:before="240" w:after="80"/>
+        <w:jc w:val="center"/>
+      </w:pPr>
+      <w:r>
+        <w:drawing>
+          <wp:inline xmlns:a="http://schemas.openxmlformats.org/drawingml/2006/main" xmlns:pic="http://schemas.openxmlformats.org/drawingml/2006/picture">
+            <wp:extent cx="5486400" cy="2732975"/>
+            <wp:docPr id="7" name="Picture 7"/>
+            <wp:cNvGraphicFramePr>
+              <a:graphicFrameLocks noChangeAspect="1"/>
+            </wp:cNvGraphicFramePr>
+            <a:graphic>
+              <a:graphicData uri="http://schemas.openxmlformats.org/drawingml/2006/picture">
+                <pic:pic>
+                  <pic:nvPicPr>
+                    <pic:cNvPr id="0" name="fig3_1_dsrm_cycle.png"/>
+                    <pic:cNvPicPr/>
+                  </pic:nvPicPr>
+                  <pic:blipFill>
+                    <a:blip r:embed="rId15"/>
+                    <a:stretch>
+                      <a:fillRect/>
+                    </a:stretch>
+                  </pic:blipFill>
+                  <pic:spPr>
+                    <a:xfrm>
+                      <a:off x="0" y="0"/>
+                      <a:ext cx="5486400" cy="2732975"/>
+                    </a:xfrm>
+                    <a:prstGeom prst="rect"/>
+                  </pic:spPr>
+                </pic:pic>
+              </a:graphicData>
+            </a:graphic>
+          </wp:inline>
+        </w:drawing>
       </w:r>
     </w:p>
     <w:p>
       <w:pPr>
         <w:spacing w:after="120" w:line="300" w:lineRule="auto"/>
+        <w:jc w:val="center"/>
       </w:pPr>
       <w:r>
         <w:rPr>
@@ -11187,76 +11128,49 @@
     </w:p>
     <w:p>
       <w:pPr>
-        <w:spacing w:before="120" w:after="120"/>
-        <w:ind w:left="576" w:right="576"/>
-      </w:pPr>
-      <w:r>
-        <w:rPr>
-          <w:rFonts w:ascii="Consolas" w:hAnsi="Consolas"/>
-          <w:color w:val="1F2937"/>
-          <w:sz w:val="19"/>
-        </w:rPr>
-        <w:t>flowchart TD</w:t>
-        <w:br/>
-        <w:t xml:space="preserve">    subgraph AccessPlane ["1. Access Plane"]</w:t>
-        <w:br/>
-        <w:t xml:space="preserve">        U1[Enterprise Users] --&gt;|HTTPS 443| ALB[AWS Application Load Balancer]</w:t>
-        <w:br/>
-        <w:t xml:space="preserve">        A1[Administrators] --&gt;|SAML 2.0 / MFA| Entra[Microsoft Entra ID]</w:t>
-        <w:br/>
-        <w:t xml:space="preserve">    end</w:t>
-        <w:br/>
-        <w:br/>
-        <w:t xml:space="preserve">    subgraph ConnectivityPlane ["2. Connectivity Plane"]</w:t>
-        <w:br/>
-        <w:t xml:space="preserve">        TGW[AWS Transit Gateway] &lt;==&gt;|Route-Based IPsec + BGP| VNG[Azure Active-Active VPN Gateway]</w:t>
-        <w:br/>
-        <w:t xml:space="preserve">    end</w:t>
-        <w:br/>
-        <w:br/>
-        <w:t xml:space="preserve">    subgraph ApplicationPlane ["3. Application Plane"]</w:t>
-        <w:br/>
-        <w:t xml:space="preserve">        Web[AWS Web Tier - Nginx] --&gt;|TCP 8080| App[AWS App Tier - Flask]</w:t>
-        <w:br/>
-        <w:t xml:space="preserve">        App --&gt;|TCP 5432| DB[(AWS Database Tier - PostgreSQL)]</w:t>
-        <w:br/>
-        <w:t xml:space="preserve">        App &lt;==&gt;|HTTPS 443 via VPN| AzApp[Azure Supporting Service]</w:t>
-        <w:br/>
-        <w:t xml:space="preserve">    end</w:t>
-        <w:br/>
-        <w:br/>
-        <w:t xml:space="preserve">    subgraph SecurityPlane ["4. Security &amp; Governance Plane"]</w:t>
-        <w:br/>
-        <w:t xml:space="preserve">        AWS_IdC[AWS IAM Identity Center]</w:t>
-        <w:br/>
-        <w:t xml:space="preserve">        KMS[AWS KMS]</w:t>
-        <w:br/>
-        <w:t xml:space="preserve">        KV[Azure Key Vault]</w:t>
-        <w:br/>
-        <w:t xml:space="preserve">    end</w:t>
-        <w:br/>
-        <w:br/>
-        <w:t xml:space="preserve">    subgraph ObservabilityPlane ["5. Observability Plane"]</w:t>
-        <w:br/>
-        <w:t xml:space="preserve">        CT[AWS CloudTrail &amp; Flow Logs] --&gt; LogAnalytics[Azure Log Analytics Workspace]</w:t>
-        <w:br/>
-        <w:t xml:space="preserve">        AL[Azure Activity Log &amp; Diag] --&gt; LogAnalytics</w:t>
-        <w:br/>
-        <w:t xml:space="preserve">    end</w:t>
-        <w:br/>
-        <w:br/>
-        <w:t xml:space="preserve">    Entra --&gt; AWS_IdC</w:t>
-        <w:br/>
-        <w:t xml:space="preserve">    ALB --&gt; Web</w:t>
-        <w:br/>
-        <w:t xml:space="preserve">    Web &amp; App &amp; DB --- TGW</w:t>
-        <w:br/>
-        <w:t xml:space="preserve">    AzApp --- VNG</w:t>
+        <w:keepNext/>
+        <w:spacing w:before="240" w:after="80"/>
+        <w:jc w:val="center"/>
+      </w:pPr>
+      <w:r>
+        <w:drawing>
+          <wp:inline xmlns:a="http://schemas.openxmlformats.org/drawingml/2006/main" xmlns:pic="http://schemas.openxmlformats.org/drawingml/2006/picture">
+            <wp:extent cx="5486400" cy="3269673"/>
+            <wp:docPr id="8" name="Picture 8"/>
+            <wp:cNvGraphicFramePr>
+              <a:graphicFrameLocks noChangeAspect="1"/>
+            </wp:cNvGraphicFramePr>
+            <a:graphic>
+              <a:graphicData uri="http://schemas.openxmlformats.org/drawingml/2006/picture">
+                <pic:pic>
+                  <pic:nvPicPr>
+                    <pic:cNvPr id="0" name="fig3_2_five_plane_architecture.png"/>
+                    <pic:cNvPicPr/>
+                  </pic:nvPicPr>
+                  <pic:blipFill>
+                    <a:blip r:embed="rId16"/>
+                    <a:stretch>
+                      <a:fillRect/>
+                    </a:stretch>
+                  </pic:blipFill>
+                  <pic:spPr>
+                    <a:xfrm>
+                      <a:off x="0" y="0"/>
+                      <a:ext cx="5486400" cy="3269673"/>
+                    </a:xfrm>
+                    <a:prstGeom prst="rect"/>
+                  </pic:spPr>
+                </pic:pic>
+              </a:graphicData>
+            </a:graphic>
+          </wp:inline>
+        </w:drawing>
       </w:r>
     </w:p>
     <w:p>
       <w:pPr>
         <w:spacing w:after="120" w:line="300" w:lineRule="auto"/>
+        <w:jc w:val="center"/>
       </w:pPr>
       <w:r>
         <w:rPr>
@@ -16689,44 +16603,49 @@
     </w:p>
     <w:p>
       <w:pPr>
-        <w:spacing w:before="120" w:after="120"/>
-        <w:ind w:left="576" w:right="576"/>
-      </w:pPr>
-      <w:r>
-        <w:rPr>
-          <w:rFonts w:ascii="Consolas" w:hAnsi="Consolas"/>
-          <w:color w:val="1F2937"/>
-          <w:sz w:val="19"/>
-        </w:rPr>
-        <w:t>flowchart LR</w:t>
-        <w:br/>
-        <w:t xml:space="preserve">    subgraph AllowedFlows ["Authorised Traffic Paths (PASS)"]</w:t>
-        <w:br/>
-        <w:t xml:space="preserve">        ALB[ALB] --&gt;|TCP 80| Web[Web Proxy]</w:t>
-        <w:br/>
-        <w:t xml:space="preserve">        Web --&gt;|TCP 8080| App[App Tier]</w:t>
-        <w:br/>
-        <w:t xml:space="preserve">        App --&gt;|TCP 5432| DB[(PostgreSQL DB)]</w:t>
-        <w:br/>
-        <w:t xml:space="preserve">        App --&gt;|HTTPS 443 via VPN| AzService[Azure Service VM]</w:t>
-        <w:br/>
-        <w:t xml:space="preserve">    end</w:t>
-        <w:br/>
-        <w:br/>
-        <w:t xml:space="preserve">    subgraph BlockedFlows ["Prohibited Traffic Paths (BLOCKED)"]</w:t>
-        <w:br/>
-        <w:t xml:space="preserve">        Internet[Public Internet] --x|Blocked| DB</w:t>
-        <w:br/>
-        <w:t xml:space="preserve">        Web --x|Blocked| DB</w:t>
-        <w:br/>
-        <w:t xml:space="preserve">        AzService --x|Blocked| DB</w:t>
-        <w:br/>
-        <w:t xml:space="preserve">    end</w:t>
+        <w:keepNext/>
+        <w:spacing w:before="240" w:after="80"/>
+        <w:jc w:val="center"/>
+      </w:pPr>
+      <w:r>
+        <w:drawing>
+          <wp:inline xmlns:a="http://schemas.openxmlformats.org/drawingml/2006/main" xmlns:pic="http://schemas.openxmlformats.org/drawingml/2006/picture">
+            <wp:extent cx="5486400" cy="2715491"/>
+            <wp:docPr id="9" name="Picture 9"/>
+            <wp:cNvGraphicFramePr>
+              <a:graphicFrameLocks noChangeAspect="1"/>
+            </wp:cNvGraphicFramePr>
+            <a:graphic>
+              <a:graphicData uri="http://schemas.openxmlformats.org/drawingml/2006/picture">
+                <pic:pic>
+                  <pic:nvPicPr>
+                    <pic:cNvPr id="0" name="fig5_1_traffic_segmentation.png"/>
+                    <pic:cNvPicPr/>
+                  </pic:nvPicPr>
+                  <pic:blipFill>
+                    <a:blip r:embed="rId17"/>
+                    <a:stretch>
+                      <a:fillRect/>
+                    </a:stretch>
+                  </pic:blipFill>
+                  <pic:spPr>
+                    <a:xfrm>
+                      <a:off x="0" y="0"/>
+                      <a:ext cx="5486400" cy="2715491"/>
+                    </a:xfrm>
+                    <a:prstGeom prst="rect"/>
+                  </pic:spPr>
+                </pic:pic>
+              </a:graphicData>
+            </a:graphic>
+          </wp:inline>
+        </w:drawing>
       </w:r>
     </w:p>
     <w:p>
       <w:pPr>
         <w:spacing w:after="120" w:line="300" w:lineRule="auto"/>
+        <w:jc w:val="center"/>
       </w:pPr>
       <w:r>
         <w:rPr>
@@ -16873,43 +16792,49 @@
     </w:p>
     <w:p>
       <w:pPr>
-        <w:spacing w:before="120" w:after="120"/>
-        <w:ind w:left="576" w:right="576"/>
-      </w:pPr>
-      <w:r>
-        <w:rPr>
-          <w:rFonts w:ascii="Consolas" w:hAnsi="Consolas"/>
-          <w:color w:val="1F2937"/>
-          <w:sz w:val="19"/>
-        </w:rPr>
-        <w:t>gantt</w:t>
-        <w:br/>
-        <w:t xml:space="preserve">    title Prowler Vulnerability Remediation Progress</w:t>
-        <w:br/>
-        <w:t xml:space="preserve">    dateFormat X</w:t>
-        <w:br/>
-        <w:t xml:space="preserve">    axisFormat %s</w:t>
-        <w:br/>
-        <w:t xml:space="preserve">    section AWS Findings</w:t>
-        <w:br/>
-        <w:t xml:space="preserve">    Critical (Initial: 2 -&gt; Final: 0) :active, 0, 2</w:t>
-        <w:br/>
-        <w:t xml:space="preserve">    High (Initial: 7 -&gt; Final: 0)     :active, 0, 7</w:t>
-        <w:br/>
-        <w:t xml:space="preserve">    Medium (Initial: 12 -&gt; Final: 2)   :active, 0, 10</w:t>
-        <w:br/>
-        <w:t xml:space="preserve">    section Azure Findings</w:t>
-        <w:br/>
-        <w:t xml:space="preserve">    Critical (Initial: 1 -&gt; Final: 0) :active, 0, 1</w:t>
-        <w:br/>
-        <w:t xml:space="preserve">    High (Initial: 5 -&gt; Final: 0)     :active, 0, 5</w:t>
-        <w:br/>
-        <w:t xml:space="preserve">    Medium (Initial: 9 -&gt; Final: 1)   :active, 0, 8</w:t>
+        <w:keepNext/>
+        <w:spacing w:before="240" w:after="80"/>
+        <w:jc w:val="center"/>
+      </w:pPr>
+      <w:r>
+        <w:drawing>
+          <wp:inline xmlns:a="http://schemas.openxmlformats.org/drawingml/2006/main" xmlns:pic="http://schemas.openxmlformats.org/drawingml/2006/picture">
+            <wp:extent cx="5486400" cy="3055716"/>
+            <wp:docPr id="10" name="Picture 10"/>
+            <wp:cNvGraphicFramePr>
+              <a:graphicFrameLocks noChangeAspect="1"/>
+            </wp:cNvGraphicFramePr>
+            <a:graphic>
+              <a:graphicData uri="http://schemas.openxmlformats.org/drawingml/2006/picture">
+                <pic:pic>
+                  <pic:nvPicPr>
+                    <pic:cNvPr id="0" name="fig5_2_prowler_findings.png"/>
+                    <pic:cNvPicPr/>
+                  </pic:nvPicPr>
+                  <pic:blipFill>
+                    <a:blip r:embed="rId18"/>
+                    <a:stretch>
+                      <a:fillRect/>
+                    </a:stretch>
+                  </pic:blipFill>
+                  <pic:spPr>
+                    <a:xfrm>
+                      <a:off x="0" y="0"/>
+                      <a:ext cx="5486400" cy="3055716"/>
+                    </a:xfrm>
+                    <a:prstGeom prst="rect"/>
+                  </pic:spPr>
+                </pic:pic>
+              </a:graphicData>
+            </a:graphic>
+          </wp:inline>
+        </w:drawing>
       </w:r>
     </w:p>
     <w:p>
       <w:pPr>
         <w:spacing w:after="120" w:line="300" w:lineRule="auto"/>
+        <w:jc w:val="center"/>
       </w:pPr>
       <w:r>
         <w:rPr>
@@ -17052,28 +16977,6 @@
           <w:sz w:val="24"/>
         </w:rPr>
         <w:t>Latency was measured across 100 ICMP echo probes per run over 5 repeated trial sets:</w:t>
-      </w:r>
-    </w:p>
-    <w:p>
-      <w:pPr>
-        <w:spacing w:before="120" w:after="120"/>
-        <w:ind w:left="576" w:right="576"/>
-      </w:pPr>
-      <w:r>
-        <w:rPr>
-          <w:rFonts w:ascii="Consolas" w:hAnsi="Consolas"/>
-          <w:color w:val="1F2937"/>
-          <w:sz w:val="19"/>
-        </w:rPr>
-        <w:t>plot</w:t>
-        <w:br/>
-        <w:t xml:space="preserve">    title AWS to Azure Inter-Cloud RTT Latency Across Test Runs</w:t>
-        <w:br/>
-        <w:t xml:space="preserve">    x-axis "Run Index" 1 2 3 4 5</w:t>
-        <w:br/>
-        <w:t xml:space="preserve">    y-axis "Latency (ms)" 20 40 60 80 100</w:t>
-        <w:br/>
-        <w:t xml:space="preserve">    line [1, 34.2], [2, 35.1], [3, 33.8], [4, 36.5], [5, 34.9]</w:t>
       </w:r>
     </w:p>
     <w:p>
@@ -18184,48 +18087,49 @@
     </w:p>
     <w:p>
       <w:pPr>
-        <w:spacing w:before="120" w:after="120"/>
-        <w:ind w:left="576" w:right="576"/>
-      </w:pPr>
-      <w:r>
-        <w:rPr>
-          <w:rFonts w:ascii="Consolas" w:hAnsi="Consolas"/>
-          <w:color w:val="1F2937"/>
-          <w:sz w:val="19"/>
-        </w:rPr>
-        <w:t>sequenceDiagram</w:t>
-        <w:br/>
-        <w:t xml:space="preserve">    autonumber</w:t>
-        <w:br/>
-        <w:t xml:space="preserve">    participant Probe as Continuous Health Probe (1s)</w:t>
-        <w:br/>
-        <w:t xml:space="preserve">    participant T1 as IPsec Tunnel 1 (Primary)</w:t>
-        <w:br/>
-        <w:t xml:space="preserve">    participant T2 as IPsec Tunnel 2 (Secondary)</w:t>
-        <w:br/>
-        <w:t xml:space="preserve">    participant BGP as BGP Routing Engine</w:t>
-        <w:br/>
-        <w:br/>
-        <w:t xml:space="preserve">    Probe -&gt;&gt; T1: Probe #1-45: HTTP 200 OK (Latency ~35ms)</w:t>
-        <w:br/>
-        <w:t xml:space="preserve">    Note over T1: Fault Injected: Tunnel 1 Disabled</w:t>
-        <w:br/>
-        <w:t xml:space="preserve">    Probe -&gt;&gt; T1: Probe #46: Request Timeout (First Failure: T = 0s)</w:t>
-        <w:br/>
-        <w:t xml:space="preserve">    Probe -&gt;&gt; T1: Probe #47-49: Request Timeout</w:t>
-        <w:br/>
-        <w:t xml:space="preserve">    BGP -&gt;&gt; BGP: Keepalive Expired -&gt; Withdraw Tunnel 1 Route (T = 3.2s)</w:t>
-        <w:br/>
-        <w:t xml:space="preserve">    BGP -&gt;&gt; T2: Activate Tunnel 2 BGP Learned Route (T = 3.8s)</w:t>
-        <w:br/>
-        <w:t xml:space="preserve">    Probe -&gt;&gt; T2: Probe #50: HTTP 200 OK (Restoration: T = 4.1s)</w:t>
-        <w:br/>
-        <w:t xml:space="preserve">    Note over Probe: Stable Response Confirmed</w:t>
+        <w:keepNext/>
+        <w:spacing w:before="240" w:after="80"/>
+        <w:jc w:val="center"/>
+      </w:pPr>
+      <w:r>
+        <w:drawing>
+          <wp:inline xmlns:a="http://schemas.openxmlformats.org/drawingml/2006/main" xmlns:pic="http://schemas.openxmlformats.org/drawingml/2006/picture">
+            <wp:extent cx="5486400" cy="3055716"/>
+            <wp:docPr id="11" name="Picture 11"/>
+            <wp:cNvGraphicFramePr>
+              <a:graphicFrameLocks noChangeAspect="1"/>
+            </wp:cNvGraphicFramePr>
+            <a:graphic>
+              <a:graphicData uri="http://schemas.openxmlformats.org/drawingml/2006/picture">
+                <pic:pic>
+                  <pic:nvPicPr>
+                    <pic:cNvPr id="0" name="fig5_3_latency_chart.png"/>
+                    <pic:cNvPicPr/>
+                  </pic:nvPicPr>
+                  <pic:blipFill>
+                    <a:blip r:embed="rId19"/>
+                    <a:stretch>
+                      <a:fillRect/>
+                    </a:stretch>
+                  </pic:blipFill>
+                  <pic:spPr>
+                    <a:xfrm>
+                      <a:off x="0" y="0"/>
+                      <a:ext cx="5486400" cy="3055716"/>
+                    </a:xfrm>
+                    <a:prstGeom prst="rect"/>
+                  </pic:spPr>
+                </pic:pic>
+              </a:graphicData>
+            </a:graphic>
+          </wp:inline>
+        </w:drawing>
       </w:r>
     </w:p>
     <w:p>
       <w:pPr>
         <w:spacing w:after="120" w:line="300" w:lineRule="auto"/>
+        <w:jc w:val="center"/>
       </w:pPr>
       <w:r>
         <w:rPr>
@@ -19526,31 +19430,49 @@
     </w:p>
     <w:p>
       <w:pPr>
-        <w:spacing w:before="120" w:after="120"/>
-        <w:ind w:left="576" w:right="576"/>
-      </w:pPr>
-      <w:r>
-        <w:rPr>
-          <w:rFonts w:ascii="Consolas" w:hAnsi="Consolas"/>
-          <w:color w:val="1F2937"/>
-          <w:sz w:val="19"/>
-        </w:rPr>
-        <w:t>flowchart TD</w:t>
-        <w:br/>
-        <w:t xml:space="preserve">    Phase1["Phase 1: Business &amp; Regulatory Justification&lt;br/&gt;(Classify data under NDPA 2023)"] --&gt; Phase2["Phase 2: Governance &amp; Landing Zones&lt;br/&gt;(Deploy Entra ID &amp; Account Structures)"]</w:t>
-        <w:br/>
-        <w:t xml:space="preserve">    Phase2 --&gt; Phase3["Phase 3: Network Foundation&lt;br/&gt;(Establish AWS TGW, Azure Hub &amp; BGP IPsec)"]</w:t>
-        <w:br/>
-        <w:t xml:space="preserve">    Phase3 --&gt; Phase4["Phase 4: Identity &amp; Security Integration&lt;br/&gt;(SAML SSO, SCIM &amp; Micro-segmentation)"]</w:t>
-        <w:br/>
-        <w:t xml:space="preserve">    Phase4 --&gt; Phase5["Phase 5: Automated IaC Delivery&lt;br/&gt;(Enforce Terraform &amp; Policy-as-Code)"]</w:t>
-        <w:br/>
-        <w:t xml:space="preserve">    Phase5 --&gt; Phase6["Phase 6: Empirical Validation&lt;br/&gt;(Execute Latency, Throughput &amp; Failover Tests)"]</w:t>
+        <w:keepNext/>
+        <w:spacing w:before="240" w:after="80"/>
+        <w:jc w:val="center"/>
+      </w:pPr>
+      <w:r>
+        <w:drawing>
+          <wp:inline xmlns:a="http://schemas.openxmlformats.org/drawingml/2006/main" xmlns:pic="http://schemas.openxmlformats.org/drawingml/2006/picture">
+            <wp:extent cx="5486400" cy="2992582"/>
+            <wp:docPr id="12" name="Picture 12"/>
+            <wp:cNvGraphicFramePr>
+              <a:graphicFrameLocks noChangeAspect="1"/>
+            </wp:cNvGraphicFramePr>
+            <a:graphic>
+              <a:graphicData uri="http://schemas.openxmlformats.org/drawingml/2006/picture">
+                <pic:pic>
+                  <pic:nvPicPr>
+                    <pic:cNvPr id="0" name="fig6_1_adoption_roadmap.png"/>
+                    <pic:cNvPicPr/>
+                  </pic:nvPicPr>
+                  <pic:blipFill>
+                    <a:blip r:embed="rId20"/>
+                    <a:stretch>
+                      <a:fillRect/>
+                    </a:stretch>
+                  </pic:blipFill>
+                  <pic:spPr>
+                    <a:xfrm>
+                      <a:off x="0" y="0"/>
+                      <a:ext cx="5486400" cy="2992582"/>
+                    </a:xfrm>
+                    <a:prstGeom prst="rect"/>
+                  </pic:spPr>
+                </pic:pic>
+              </a:graphicData>
+            </a:graphic>
+          </wp:inline>
+        </w:drawing>
       </w:r>
     </w:p>
     <w:p>
       <w:pPr>
         <w:spacing w:after="120" w:line="300" w:lineRule="auto"/>
+        <w:jc w:val="center"/>
       </w:pPr>
       <w:r>
         <w:rPr>

</xml_diff>